<commit_message>
Draft_017 full pass: align codebook WT wording, soften booster counts, PDF
- Codebook Extensions now matches decision rules (B11 example, aim or rationale)
- Soften remaining specific booster token counts pending recount
- Full consistency scan: no residual Draft_015 numbers; B11 isolated among WT cases
- Generate Draft_017.pdf
</commit_message>
<xml_diff>
--- a/thesis/003_ThesisProposal_Draft_017.docx
+++ b/thesis/003_ThesisProposal_Draft_017.docx
@@ -6158,7 +6158,7 @@
           <w:szCs w:val="22"/>
           <w:rtl w:val="0"/>
         </w:rPr>
-        <w:t>Booster analysis of the 25 zero-hedge abstracts revealed a high density of assertive markers (on the order of three boosters per abstract on average). The most frequent boosters were showed (18 instances), revealed (13), observed (12), and highest (12). This density of assertive markers confirms that zero-hedge abstracts do not represent neutral reporting but rather an absence of overt hedging, where findings are stated with emphatic rather than tentative language.</w:t>
+        <w:t>Booster analysis of the 25 zero-hedge abstracts revealed a high density of assertive markers (on the order of three boosters per abstract on average). The most frequent boosters included showed, revealed, observed, and highest. This density of assertive markers confirms that zero-hedge abstracts do not represent neutral reporting but rather an absence of overt hedging, where findings are stated with emphatic rather than tentative language.</w:t>
       </w:r>
       <w:r>
         <w:rPr>
@@ -14150,7 +14150,7 @@
           <w:szCs w:val="22"/>
           <w:rtl w:val="0"/>
         </w:rPr>
-        <w:t>Extensions: “imply/implies/implying” functions as suggest. “Can be concluded / derived / stated / attributed to / seen as” is an inferential hedge, distinct from capability “can” (see Decision Rules). “Potentially” is an adverbial hedge. “Potential” naming the research object itself (e.g., “assessed the potential of X”) is not markable, it names a topic rather than qualifying a claim. Rule for “potential + noun” constructions: structural position is primary. If the phrase sits in an aim, methods, or pure topic-naming frame (naming the research object, e.g., “assessed the potential of X”), treat as topic-naming (FP-Gen). If it sits in a results or conclusion sentence qualifying a finding-claim, treat as a Lexical hedge (EC). The Working Test is applied as a secondary check: when removing the token clearly changes commitment to a proposition (e.g., “posed potential health risks” → “posed health risks”), code as Lexical EC even in a rationale sentence.</w:t>
+        <w:t>Extensions: “imply/implies/implying” functions as suggest. “Can be concluded / derived / stated / attributed to / seen as” is an inferential hedge, distinct from capability “can” (see Decision Rules). “Potentially” is an adverbial hedge. “Potential” naming the research object itself (e.g., “assessed the potential of X”) is not markable, it names a topic rather than qualifying a claim. Rule for “potential + noun” constructions: structural position is primary. If the phrase sits in an aim, methods, or pure topic-naming frame (naming the research object, e.g., “assessed the potential of X”), treat as topic-naming (FP-Gen). If it sits in a results or conclusion sentence qualifying a finding-claim, treat as a Lexical hedge (EC). The Working Test is applied as a secondary check: when removing the token clearly changes commitment to a proposition (e.g., "presence of potential mycobacterial infections" → "presence of mycobacterial infections"), the token is coded Lexical EC even in an aim or rationale sentence.</w:t>
       </w:r>
       <w:r>
         <w:rPr>

</xml_diff>

<commit_message>
Draft_017: add Lopez, fix Khunasathitchai DOI/pages, booster recount
- Lopez et al. (2025) added to References
- Khunasathitchai pages 951–973, DOI 10.61508/refl.v32i2.282512
- Booster recount on current 25 zero-hedge abstracts: 79 tokens, ~3.2 avg
- Hyland zero-hedge claim left as-is (pending)
</commit_message>
<xml_diff>
--- a/thesis/003_ThesisProposal_Draft_017.docx
+++ b/thesis/003_ThesisProposal_Draft_017.docx
@@ -6158,7 +6158,7 @@
           <w:szCs w:val="22"/>
           <w:rtl w:val="0"/>
         </w:rPr>
-        <w:t>Booster analysis of the 25 zero-hedge abstracts revealed a high density of assertive markers (on the order of three boosters per abstract on average). The most frequent boosters included showed, revealed, observed, and highest. This density of assertive markers confirms that zero-hedge abstracts do not represent neutral reporting but rather an absence of overt hedging, where findings are stated with emphatic rather than tentative language.</w:t>
+        <w:t>Booster analysis of the 25 zero-hedge abstracts revealed 79 booster tokens, averaging approximately 3.2 boosters per abstract. The most frequent boosters were showed (19 instances), highest (13), revealed (12), and observed (12). This density of assertive markers confirms that zero-hedge abstracts do not represent neutral reporting but rather an absence of overt hedging, where findings are stated with emphatic rather than tentative language.</w:t>
       </w:r>
       <w:r>
         <w:rPr>
@@ -9506,20 +9506,20 @@
           <w:szCs w:val="22"/>
           <w:rtl w:val="0"/>
         </w:rPr>
-        <w:t xml:space="preserve">rEFLections, 32</w:t>
-      </w:r>
-      <w:r>
-        <w:rPr>
-          <w:rFonts w:ascii="Georgia" w:cs="Georgia" w:eastAsia="Georgia" w:hAnsi="Georgia"/>
-          <w:b w:val="0"/>
-          <w:bCs w:val="0"/>
-          <w:i w:val="0"/>
-          <w:iCs w:val="0"/>
-          <w:sz w:val="22"/>
-          <w:szCs w:val="22"/>
-          <w:rtl w:val="0"/>
-        </w:rPr>
-        <w:t xml:space="preserve">(2), 951–970.</w:t>
+        <w:t>rEFLections, 32(2), 951–973.</w:t>
+      </w:r>
+      <w:r>
+        <w:rPr>
+          <w:rFonts w:ascii="Georgia" w:cs="Georgia" w:eastAsia="Georgia" w:hAnsi="Georgia"/>
+          <w:b w:val="0"/>
+          <w:bCs w:val="0"/>
+          <w:i w:val="0"/>
+          <w:iCs w:val="0"/>
+          <w:sz w:val="22"/>
+          <w:szCs w:val="22"/>
+          <w:rtl w:val="0"/>
+        </w:rPr>
+        <w:t/>
       </w:r>
       <w:r>
         <w:rPr>
@@ -9545,7 +9545,7 @@
           <w:szCs w:val="22"/>
           <w:rtl w:val="0"/>
         </w:rPr>
-        <w:t xml:space="preserve">https://doi.org/10.47772/IJRISS.2025.91100485</w:t>
+        <w:t>https://doi.org/10.61508/refl.v32i2.282512</w:t>
       </w:r>
       <w:r>
         <w:rPr>
@@ -9577,6 +9577,27 @@
         <w:rPr>
           <w:rtl w:val="0"/>
         </w:rPr>
+      </w:r>
+    </w:p>
+    <w:p>
+      <w:pPr>
+        <w:spacing w:before="0" w:after="0" w:line="480" w:lineRule="auto"/>
+        <w:ind w:left="720" w:hanging="720"/>
+        <w:jc w:val="left"/>
+        <w:rPr/>
+      </w:pPr>
+      <w:r>
+        <w:rPr>
+          <w:rFonts w:ascii="Georgia" w:cs="Georgia" w:eastAsia="Georgia" w:hAnsi="Georgia"/>
+          <w:b w:val="0"/>
+          <w:bCs w:val="0"/>
+          <w:i w:val="0"/>
+          <w:iCs w:val="0"/>
+          <w:sz w:val="22"/>
+          <w:szCs w:val="22"/>
+          <w:rtl w:val="0"/>
+        </w:rPr>
+        <w:t xml:space="preserve">Lopez, R. M. C., Pedida, J. A., Alzate, L. J. A., &amp; Eustaquio, M. T. L. (2025). Language of caution and certainty: Writing proficiency in hedges and boosters in student essays. International Journal of Research and Innovation in Social Science, 9(11), 6176–6196. https://doi.org/10.47772/IJRISS.2025.91100485</w:t>
       </w:r>
     </w:p>
     <w:p>

</xml_diff>

<commit_message>
Draft_017: fix token tallies, L3 note, B11/VM5 distinction, Hyland wording
- Modal/lexical token counts corrected to sheet (can/could/may 6, might 3; indicating 2)
- L3 column note: 37 corpus-wide, 32 in zero-hedge (B11/B12/VM9 hold the five)
- B11 Working Test example contrasted with VM5/B17 topic-naming
- Hyland: "research articles" not "abstracts"
- Sensitivity p ≈ .025 confirmed from sheet
- Booster counts retained as verified Appendix C recount on current 25
</commit_message>
<xml_diff>
--- a/thesis/003_ThesisProposal_Draft_017.docx
+++ b/thesis/003_ThesisProposal_Draft_017.docx
@@ -2737,7 +2737,7 @@
           <w:szCs w:val="22"/>
           <w:rtl w:val="0"/>
         </w:rPr>
-        <w:t>Ambiguous forms such as can, potential, indicating, and possibility may function either as epistemic hedges or as non-epistemic lexical items depending on context. The following decision rules govern these cases. First, “can” combined with an active content verb describing a treatment effect (enhance, promote, reduce, help) is classified as capability (FP-Cap) regardless of whether it appears inside a “suggests that” clause, because the Working Test shows that removing “can” alone does not change the epistemic weight of the clause when “suggests” is already carrying the hedge. Second, the “indicating” tautology test covers not only numeric restatement but also field-standard interpretive thresholds: “non-toxic” from no mortality observed, “limited benefits” from poor performance, and “superior feed efficiency” from lower feed conversion ratio are treated as operational restatements (FP-Gen) rather than inferential hedges. Third, for “potential + noun” constructions, structural position is the primary disambiguator: aim, methods, and pure topic-naming frames are coded FP-Gen; results and conclusion frames that qualify a finding-claim are coded Lexical EC. The Working Test is applied as a secondary check: when removing the token clearly changes commitment to a proposition (e.g., "presence of potential mycobacterial infections" → "presence of mycobacterial infections"), the token is coded Lexical EC even in an aim or rationale sentence. The same position-based treatment applies to “possibility + noun” in aim and methods sentences. Fourth, when a sentence contains multiple hedge-like tokens, each token is tested individually in isolation, ignoring the other hedges in the sentence; a token counts only if removing it alone changes the epistemic weight of its own clause. The corpus therefore reflects contextual rather than purely lexical classification, and the 58 rejected candidates document the decision trail for tokens that were considered but excluded. Additionally, the outlier abstract Acs2 uses a repeated hedging template (“This suggests that while X might not have been Y, Z could still [verb] beneficial effects”) twice with light variation, inflating its own token count through formulaic repetition rather than independent hedging decisions.</w:t>
+        <w:t>Ambiguous forms such as can, potential, indicating, and possibility may function either as epistemic hedges or as non-epistemic lexical items depending on context. The following decision rules govern these cases. First, “can” combined with an active content verb describing a treatment effect (enhance, promote, reduce, help) is classified as capability (FP-Cap) regardless of whether it appears inside a “suggests that” clause, because the Working Test shows that removing “can” alone does not change the epistemic weight of the clause when “suggests” is already carrying the hedge. Second, the “indicating” tautology test covers not only numeric restatement but also field-standard interpretive thresholds: “non-toxic” from no mortality observed, “limited benefits” from poor performance, and “superior feed efficiency” from lower feed conversion ratio are treated as operational restatements (FP-Gen) rather than inferential hedges. Third, for “potential + noun” constructions, structural position is the primary disambiguator: aim, methods, and pure topic-naming frames are coded FP-Gen; results and conclusion frames that qualify a finding-claim are coded Lexical EC. The Working Test is applied as a secondary check: when removing the token clearly changes commitment to a proposition (e.g., "presence of potential mycobacterial infections" → "presence of mycobacterial infections"), the token is coded Lexical EC even in an aim or rationale sentence. This differs from pure topic-naming aims such as “explores the potential antifungal properties” (VM5) or “their potential pharmaceutical applications” (B17), where removing the token leaves a research-object name rather than an asserted existence claim; those remain FP-Gen. The same position-based treatment applies to “possibility + noun” in aim and methods sentences. Fourth, when a sentence contains multiple hedge-like tokens, each token is tested individually in isolation, ignoring the other hedges in the sentence; a token counts only if removing it alone changes the epistemic weight of its own clause. The corpus therefore reflects contextual rather than purely lexical classification, and the 58 rejected candidates document the decision trail for tokens that were considered but excluded. Additionally, the outlier abstract Acs2 uses a repeated hedging template (“This suggests that while X might not have been Y, Z could still [verb] beneficial effects”) twice with light variation, inflating its own token count through formulaic repetition rather than independent hedging decisions.</w:t>
       </w:r>
       <w:r>
         <w:rPr>
@@ -4954,7 +4954,7 @@
           <w:szCs w:val="22"/>
           <w:rtl w:val="0"/>
         </w:rPr>
-        <w:t>Within the lexical hedge category, the token “potential” accounted for 19 of the 41 lexical instances (46.3%), the single most frequent hedge token in the corpus. Other frequent lexical forms included “suggests” (7), “indicating” (6), and “suggesting” (3). Modal verbs were led by “can” (9), “could” (7), and “may” (6). Concordance of the 19 potential instances shows recurring frames such as “the potential of X as a Y,” “has potential as an X,” and “highlight their potential as X.” That recurrence supports reading many uses as learned formula rather than fully calibrated epistemic choice. Agriculture and Biology account for 15 of the 19 instances; Veterinary Medicine for 4.</w:t>
+        <w:t>Within the lexical hedge category, the token “potential” accounted for 19 of the 41 lexical instances (46.3%), the single most frequent hedge token in the corpus. Other frequent lexical forms included “suggests” (7), “suggest” (3), “suggesting” (3), and “indicating” (2). Modal verbs were led by “can” (6), “could” (6), “may” (6), and “might” (3). Concordance of the 19 potential instances shows recurring frames such as “the potential of X as a Y,” “has potential as an X,” and “highlight their potential as X.” That recurrence supports reading many uses as learned formula rather than fully calibrated epistemic choice. Agriculture and Biology account for 15 of the 19 instances; Veterinary Medicine for 4.</w:t>
       </w:r>
       <w:r>
         <w:rPr>
@@ -6132,7 +6132,7 @@
           <w:szCs w:val="22"/>
           <w:rtl w:val="0"/>
         </w:rPr>
-        <w:t>Additionally, 32 unhedged assertion sites were identified in the 25 zero-hedge abstracts. Of these, 20 were classified as result claims [R], 8 as generalizations [G], and 4 as causal claims [C]. (Five further unhedged sites appear in abstracts that also contain coded hedges and are excluded from this zero-hedge count.) These sites represent clauses where a hedge could have been inserted without changing the underlying facts, but the writer chose to state the claim with bare certainty. The presence of these unhedged sites in abstracts that contain zero hedges indicates an absence of overt hedging rather than cautious reporting. Expert abstracts rarely contain zero hedges (Hyland, 1998), making the 41.7% zero-hedge rate in this corpus a sharp departure from expert norms.</w:t>
+        <w:t>Additionally, 32 unhedged assertion sites were identified in the 25 zero-hedge abstracts. Of these, 20 were classified as result claims [R], 8 as generalizations [G], and 4 as causal claims [C]. (Five further unhedged sites appear in abstracts that also contain coded hedges (B11, B12, VM9) and are excluded from this zero-hedge count; Table 4’s L3 column reports the corpus-wide total of 37.) These sites represent clauses where a hedge could have been inserted without changing the underlying facts, but the writer chose to state the claim with bare certainty. The presence of these unhedged sites in abstracts that contain zero hedges indicates an absence of overt hedging rather than cautious reporting. Expert research articles rarely contain zero hedges (Hyland, 1998), making the 41.7% zero-hedge rate in this corpus a sharp departure from expert norms.</w:t>
       </w:r>
       <w:r>
         <w:rPr>
@@ -14171,7 +14171,7 @@
           <w:szCs w:val="22"/>
           <w:rtl w:val="0"/>
         </w:rPr>
-        <w:t>Extensions: “imply/implies/implying” functions as suggest. “Can be concluded / derived / stated / attributed to / seen as” is an inferential hedge, distinct from capability “can” (see Decision Rules). “Potentially” is an adverbial hedge. “Potential” naming the research object itself (e.g., “assessed the potential of X”) is not markable, it names a topic rather than qualifying a claim. Rule for “potential + noun” constructions: structural position is primary. If the phrase sits in an aim, methods, or pure topic-naming frame (naming the research object, e.g., “assessed the potential of X”), treat as topic-naming (FP-Gen). If it sits in a results or conclusion sentence qualifying a finding-claim, treat as a Lexical hedge (EC). The Working Test is applied as a secondary check: when removing the token clearly changes commitment to a proposition (e.g., "presence of potential mycobacterial infections" → "presence of mycobacterial infections"), the token is coded Lexical EC even in an aim or rationale sentence.</w:t>
+        <w:t>Extensions: “imply/implies/implying” functions as suggest. “Can be concluded / derived / stated / attributed to / seen as” is an inferential hedge, distinct from capability “can” (see Decision Rules). “Potentially” is an adverbial hedge. “Potential” naming the research object itself (e.g., “assessed the potential of X”) is not markable, it names a topic rather than qualifying a claim. Rule for “potential + noun” constructions: structural position is primary. If the phrase sits in an aim, methods, or pure topic-naming frame (naming the research object, e.g., “assessed the potential of X”), treat as topic-naming (FP-Gen). If it sits in a results or conclusion sentence qualifying a finding-claim, treat as a Lexical hedge (EC). The Working Test is applied as a secondary check: when removing the token clearly changes commitment to a proposition (e.g., "presence of potential mycobacterial infections" → "presence of mycobacterial infections"), the token is coded Lexical EC even in an aim or rationale sentence. This differs from pure topic-naming aims such as “explores the potential antifungal properties” (VM5) or “their potential pharmaceutical applications” (B17), where removing the token leaves a research-object name rather than an asserted existence claim; those remain FP-Gen.</w:t>
       </w:r>
       <w:r>
         <w:rPr>

</xml_diff>

<commit_message>
Draft_017: soften stats, Wang parallel, and booster/zero-hedge claims
- KW: note 65 tokens, no multiple-test correction, p fragile
- Wang: drop similar-proportion claim; acknowledge scale difference
- Boosters: descriptive count of reporting forms only; no comparison group;
  zero-hedge ≠ absolute commitment; binary findings can legitimately go unhedged
</commit_message>
<xml_diff>
--- a/thesis/003_ThesisProposal_Draft_017.docx
+++ b/thesis/003_ThesisProposal_Draft_017.docx
@@ -1474,7 +1474,7 @@
           <w:szCs w:val="22"/>
           <w:rtl w:val="0"/>
         </w:rPr>
-        <w:t xml:space="preserve">This sample size is consistent with comparable corpus-assisted discourse studies at the undergraduate level. Khunasathitchai et al. (2025) analyzed 60 abstracts, and Wang (2022) used similar per-discipline proportions. For a manually coded functional analysis within a single institution, 60 texts provide sufficient data for identifying patterns without exceeding the analytical capacity of a BA thesis. The study treats its findings as indicative patterns within the PSAU context, supplemented by exploratory inferential analyses (chi-square, Kruskal-Wallis) whose results are reported transparently but should not be treated as confirmatory given the small, zero-inflated sample. However, pilot testing revealed that 75% of the sampled abstracts contained zero hedging devices. The pilot’s 75% zero-hedge rate was higher than the main corpus’s 41.7%, likely reflecting the small pilot sample size (4 abstracts) rather than a systematic difference between the pilot and main corpora. The study acknowledges the high likelihood of a zero-inflated dataset. While the absence of hedging prevents a robust comparative analysis of hedge variety, it is treated in this study as a valid indicator of categorical claim formulation rather than a methodological failure.</w:t>
+        <w:t xml:space="preserve">This sample size is consistent with comparable corpus-assisted discourse studies at the undergraduate level. Khunasathitchai et al. (2025) analyzed 60 abstracts. Wang (2022) examined a much larger multi-field student corpus (829 papers across 16 fields); the present study does not claim comparable scale or design. For a manually coded functional analysis within a single institution, 60 texts provide sufficient data for identifying patterns without exceeding the analytical capacity of a BA thesis. The study treats its findings as indicative patterns within the PSAU context, supplemented by exploratory inferential analyses (chi-square, Kruskal-Wallis) whose results are reported transparently but should not be treated as confirmatory given the small, zero-inflated sample. However, pilot testing revealed that 75% of the sampled abstracts contained zero hedging devices. The pilot’s 75% zero-hedge rate was higher than the main corpus’s 41.7%, likely reflecting the small pilot sample size (4 abstracts) rather than a systematic difference between the pilot and main corpora. The study acknowledges the high likelihood of a zero-inflated dataset. While the absence of hedging prevents a robust comparative analysis of hedge variety, it is treated in this study as a valid indicator of categorical claim formulation rather than a methodological failure.</w:t>
       </w:r>
       <w:r>
         <w:rPr>
@@ -1526,7 +1526,7 @@
           <w:szCs w:val="22"/>
           <w:rtl w:val="0"/>
         </w:rPr>
-        <w:t>The abstract genre’s rhetorical compression may suppress hedging variety compared to full-text discussions. Findings reflect hedging in this constrained genre only and should not be extrapolated to developing researchers’ hedging competence in longer texts without further research. Additionally, this study is primarily delimited to hedging devices. A limited booster count was performed only on the 25 zero-hedge abstracts to check whether the absence of hedges coincided with assertive language; a full booster analysis across the corpus was not undertaken. While credibility in academic writing involves a balance of caution and certainty, this study focuses specifically on the management of uncertainty, which is often the more challenging rhetorical skill for developing L2 researchers to acquire.</w:t>
+        <w:t>The abstract genre’s rhetorical compression may suppress hedging variety compared to full-text discussions. Findings reflect hedging in this constrained genre only and should not be extrapolated to developing researchers’ hedging competence in longer texts without further research. Additionally, this study is primarily delimited to hedging devices. A limited count of assertive reporting forms was performed only on the 25 zero-hedge abstracts; no comparison with hedged abstracts was made, and a full booster analysis was not undertaken. While credibility in academic writing involves a balance of caution and certainty, this study focuses specifically on the management of uncertainty, which is often the more challenging rhetorical skill for developing L2 researchers to acquire.</w:t>
       </w:r>
       <w:r>
         <w:rPr>
@@ -2790,7 +2790,7 @@
           <w:szCs w:val="22"/>
           <w:rtl w:val="0"/>
         </w:rPr>
-        <w:t xml:space="preserve">This study uses a text corpus rather than human participants. The corpus consists of 60 undergraduate thesis abstracts from Agriculture, Veterinary Medicine, and Biology programs at PSAU. This study employs disproportionate stratified systematic sampling, with discipline as the stratification variable and fixed analytical targets per stratum (n=20 for Biology, n=20 for Veterinary Medicine, n=10 for Animal Science, and n=10 for Crop Science) to ensure equal representation regardless of population size. This means the sampling rate varies by population size, prioritizing equal sample sizes over proportional representation. For the Agriculture discipline, the sample is equally split between Crop Science (n=10) and Animal Science (n=10) to ensure balanced representation of the sub-disciplines. Within each stratum, a sampling interval k was calculated as k = N/n. The intervals were Biology k=7 (145÷20=7.25), Veterinary Medicine k=5 (104÷20=5.2), Animal Science k=4 (38÷10=3.8), and Crop Science k=9 (94÷10=9.4). Sampling began from a randomly selected position around the middle of each stratum’s catalog, proceeded forward by taking every kth thesis, and wrapped around to the beginning of the catalog when needed until the target sample was met. This sample size is appropriate for the study’s scope. Khunasathitchai et al. (2025) used 60 abstracts in a comparable corpus study, and Wang (2022) used similar per-discipline proportions. For a manually coded functional analysis at a single institution, 60 texts allow sufficient depth of interpretation within the timeframe and resources of a BA thesis. The study treats findings as baseline descriptive data for institutional curriculum review.</w:t>
+        <w:t xml:space="preserve">This study uses a text corpus rather than human participants. The corpus consists of 60 undergraduate thesis abstracts from Agriculture, Veterinary Medicine, and Biology programs at PSAU. This study employs disproportionate stratified systematic sampling, with discipline as the stratification variable and fixed analytical targets per stratum (n=20 for Biology, n=20 for Veterinary Medicine, n=10 for Animal Science, and n=10 for Crop Science) to ensure equal representation regardless of population size. This means the sampling rate varies by population size, prioritizing equal sample sizes over proportional representation. For the Agriculture discipline, the sample is equally split between Crop Science (n=10) and Animal Science (n=10) to ensure balanced representation of the sub-disciplines. Within each stratum, a sampling interval k was calculated as k = N/n. The intervals were Biology k=7 (145÷20=7.25), Veterinary Medicine k=5 (104÷20=5.2), Animal Science k=4 (38÷10=3.8), and Crop Science k=9 (94÷10=9.4). Sampling began from a randomly selected position around the middle of each stratum’s catalog, proceeded forward by taking every kth thesis, and wrapped around to the beginning of the catalog when needed until the target sample was met. This sample size is appropriate for the study’s scope. Khunasathitchai et al. (2025) used 60 abstracts in a comparable corpus study. Wang (2022) examined a much larger multi-field student corpus; the present study does not claim comparable scale. For a manually coded functional analysis at a single institution, 60 texts allow sufficient depth of interpretation within the timeframe and resources of a BA thesis. The study treats findings as baseline descriptive data for institutional curriculum review.</w:t>
       </w:r>
       <w:r>
         <w:rPr>
@@ -6132,7 +6132,7 @@
           <w:szCs w:val="22"/>
           <w:rtl w:val="0"/>
         </w:rPr>
-        <w:t>Additionally, 32 unhedged assertion sites were identified in the 25 zero-hedge abstracts. Of these, 20 were classified as result claims [R], 8 as generalizations [G], and 4 as causal claims [C]. (Five further unhedged sites appear in abstracts that also contain coded hedges (B11, B12, VM9) and are excluded from this zero-hedge count; Table 4’s L3 column reports the corpus-wide total of 37.) These sites represent clauses where a hedge could have been inserted without changing the underlying facts, but the writer chose to state the claim with bare certainty. The presence of these unhedged sites in abstracts that contain zero hedges indicates an absence of overt hedging rather than cautious reporting. Expert research articles rarely contain zero hedges (Hyland, 1998), making the 41.7% zero-hedge rate in this corpus a sharp departure from expert norms.</w:t>
+        <w:t>Additionally, 32 unhedged assertion sites were identified in the 25 zero-hedge abstracts. Of these, 20 were classified as result claims [R], 8 as generalizations [G], and 4 as causal claims [C]. (Five further unhedged sites appear in abstracts that also contain coded hedges (B11, B12, VM9) and are excluded from this zero-hedge count; Table 4’s L3 column reports the corpus-wide total of 37.) These sites represent clauses where a hedge could have been inserted without changing the underlying facts, but no hedge was used. The presence of these unhedged sites in zero-hedge abstracts records an absence of overt hedging; it does not by itself establish that the writer intended absolute commitment, especially where the underlying finding is binary or measured. Expert research articles rarely contain zero hedges (Hyland, 1998), making the 41.7% zero-hedge rate in this corpus a sharp departure from expert norms.</w:t>
       </w:r>
       <w:r>
         <w:rPr>
@@ -6158,7 +6158,7 @@
           <w:szCs w:val="22"/>
           <w:rtl w:val="0"/>
         </w:rPr>
-        <w:t>Booster analysis of the 25 zero-hedge abstracts revealed 79 booster tokens, averaging approximately 3.2 boosters per abstract. The most frequent boosters were showed (19 instances), highest (13), revealed (12), and observed (12). This density of assertive markers confirms that zero-hedge abstracts do not represent neutral reporting but rather an absence of overt hedging, where findings are stated with emphatic rather than tentative language.</w:t>
+        <w:t>A limited count of assertive reporting forms in the 25 zero-hedge abstracts found recurring items such as showed, revealed, observed, and highest (79 tokens in total, roughly 3.2 per abstract). These forms are reporting verbs and a superlative rather than a closed booster set, and the count was not run on the hedged abstracts, so no comparison group exists. The observation is descriptive only: some zero-hedge abstracts use assertive wording, but binary or measured findings can also legitimately appear without hedges, and the absence of a coded hedge is not treated here as proof of absolute commitment.</w:t>
       </w:r>
       <w:r>
         <w:rPr>
@@ -7681,7 +7681,7 @@
           <w:szCs w:val="22"/>
           <w:rtl w:val="0"/>
         </w:rPr>
-        <w:t>Per-abstract hedge distributions reveal substantial skew. Agriculture abstracts averaged 1.35 hedges (median = 1, SD = 1.84, range = 0–8), Biology averaged 1.40 (median = 1, SD = 1.31, range = 0–5), and Veterinary Medicine averaged 0.50 (median = 0, SD = 0.76, range = 0–3). The high standard deviation in Agriculture reflects the influence of Acs2, which contained 8 hedges alone. When Acs2 is excluded as a sensitivity check, Agriculture's density drops to 0.46 per 100 words, below Biology's 0.62, suggesting that the Agriculture &gt; Biology ranking is partly driven by a single outlier abstract. An exploratory Kruskal-Wallis test on per-abstract hedge counts yielded H ≈ 6.84, p ≈ .033. Given the small sample size and zero-inflated distribution, this result is treated as exploratory rather than as confirmatory evidence of a disciplinary difference. A sensitivity check that removes all 19 instances of "potential" leaves 46 hedges; the Kruskal-Wallis contrast remains significant in the same direction (approximately p ≈ .025), and Veterinary Medicine’s zero-hedge share rises further. The directional pattern is therefore not an artifact of the "potential" tokens alone.</w:t>
+        <w:t>Per-abstract hedge distributions reveal substantial skew. Agriculture abstracts averaged 1.35 hedges (median = 1, SD = 1.84, range = 0–8), Biology averaged 1.40 (median = 1, SD = 1.31, range = 0–5), and Veterinary Medicine averaged 0.50 (median = 0, SD = 0.76, range = 0–3). The high standard deviation in Agriculture reflects the influence of Acs2, which contained 8 hedges alone. When Acs2 is excluded as a sensitivity check, Agriculture's density drops to 0.46 per 100 words, below Biology's 0.62, suggesting that the Agriculture &gt; Biology ranking is partly driven by a single outlier abstract. An exploratory Kruskal-Wallis test on per-abstract hedge counts yielded H ≈ 6.84, p ≈ .033. Given the small sample size and zero-inflated distribution, this result is treated as exploratory rather than as confirmatory evidence of a disciplinary difference. With only 65 tokens across three groups and no correction for multiple tests, the p-values are fragile. A sensitivity check that removes all 19 instances of "potential" leaves 46 hedges; the Kruskal-Wallis contrast remains significant in the same direction (approximately p ≈ .025), and Veterinary Medicine’s zero-hedge share rises further. The directional pattern is therefore not an artifact of the "potential" tokens alone.</w:t>
       </w:r>
       <w:r>
         <w:rPr>

</xml_diff>

<commit_message>
Draft_017: resolve three self-contradictions from prior softens
- Definition of Terms: absence of hedges ≠ absolute commitment
- Recommendation: drop booster-language claim; suggest comparison design
- Part III: 100% EC is partly by construction; do not claim writers' view
</commit_message>
<xml_diff>
--- a/thesis/003_ThesisProposal_Draft_017.docx
+++ b/thesis/003_ThesisProposal_Draft_017.docx
@@ -1945,7 +1945,7 @@
           <w:szCs w:val="22"/>
           <w:rtl w:val="0"/>
         </w:rPr>
-        <w:t xml:space="preserve">conceptually, epistemic stance refers to the linguistic expression of a writer’s degree of commitment to the truth, certainty, or reliability of a proposition. It signals the writer’s judgment about the status of the knowledge they are presenting. Operationally, this refers to the aggregate pattern of hedging devices used in an abstract. A high frequency of hedges indicates a cautious or tentative stance, while a low frequency or absence of hedges indicates a stance of certainty or absolute commitment.</w:t>
+        <w:t xml:space="preserve">conceptually, epistemic stance refers to the linguistic expression of a writer’s degree of commitment to the truth, certainty, or reliability of a proposition. It signals the writer’s judgment about the status of the knowledge they are presenting. Operationally, this refers to the aggregate pattern of hedging devices used in an abstract. A high frequency of hedges indicates a cautious or tentative stance, while a low frequency or absence of hedges records fewer overt markers of caution; it does not by itself establish absolute commitment, especially where findings are binary or measured.</w:t>
       </w:r>
       <w:r>
         <w:rPr>
@@ -8431,7 +8431,7 @@
           <w:szCs w:val="22"/>
           <w:rtl w:val="0"/>
         </w:rPr>
-        <w:t>The relationship between hedge type and function further illuminates the patterns. Modal verbs (21 instances, all EC) were used almost exclusively to express possibility about results or implications, as in “the biosynthesis... may affect the overall development.” Lexical hedges (41 instances, all EC) were used to qualify the strength of findings, as in “results suggest that fermented banana peel... can significantly enhance growth.” The convergence of all hedge types on a single function reinforces the interpretation that these writers view hedging primarily as a tool for managing factual certainty, not for managing social or textual relationships.</w:t>
+        <w:t>The relationship between hedge type and function further illuminates the patterns. Modal verbs (21 instances, all EC) were used almost exclusively to express possibility about results or implications, as in “the biosynthesis... may affect the overall development.” Lexical hedges (41 instances, all EC) were used to qualify the strength of findings, as in “results suggest that fermented banana peel... can significantly enhance growth.” All retained hedges were coded Epistemic Caution. That uniformity is partly built into the Working Test, which screens for epistemic effect; the data therefore cannot strongly support a claim about how writers “view” hedging, only that the retained tokens functioned epistemically under this scheme.</w:t>
       </w:r>
       <w:r>
         <w:rPr>
@@ -8973,7 +8973,7 @@
           <w:szCs w:val="22"/>
           <w:rtl w:val="0"/>
         </w:rPr>
-        <w:t xml:space="preserve">The coding methodology developed in this study, including the codebook’s decision rules and the Layer 3 unhedged assertion site analysis, can serve as a template for similar studies in other disciplines, genres, or institutions. Future researchers may adapt the codebook for analyzing hedging in full-length thesis sections, research articles, or other academic genres where rhetorical space allows for greater hedge variety than the compressed abstract. Additionally, future studies should examine boosters (e.g., clearly, demonstrated, confirmed) alongside hedges to provide a fuller picture of epistemic stance, since some abstracts in this corpus contain zero hedges but still make assertive claims that may involve booster language.</w:t>
+        <w:t xml:space="preserve">The coding methodology developed in this study, including the codebook’s decision rules and the Layer 3 unhedged assertion site analysis, can serve as a template for similar studies in other disciplines, genres, or institutions. Future researchers may adapt the codebook for analyzing hedging in full-length thesis sections, research articles, or other academic genres where rhetorical space allows for greater hedge variety than the compressed abstract. Additionally, future studies could examine assertive reporting forms alongside hedges, with a comparison group that includes both zero-hedge and hedged abstracts, to test whether those forms cluster with the absence of hedges or appear across the board.</w:t>
       </w:r>
       <w:r>
         <w:rPr>

</xml_diff>

<commit_message>
Draft_017: scrub farm names, barangays, markets from Appendix C
Anonymization: EJR Anne Farm, specific barangays (Bucanan, Pandacaqui,
San Agustin, Batang 2nd), Magalang Public Market, Sta. Cruz replaced
with generic local descriptors. Aligns with fully-anonymized claim.
</commit_message>
<xml_diff>
--- a/thesis/003_ThesisProposal_Draft_017.docx
+++ b/thesis/003_ThesisProposal_Draft_017.docx
@@ -18317,7 +18317,7 @@
           <w:szCs w:val="22"/>
           <w:rtl w:val="0"/>
         </w:rPr>
-        <w:t xml:space="preserve">The study was conducted from June to July 2022 to determine the influence of the different sources of nutrients to rice straw mushrooms. The field experiment was conducted in Sitio Pitabacan, San Ildefonso, Magalang, Pampanga. The experiment was laid out using Complete Randomize Design (CRD), with four treatments replicated four times. The treatments were as follows: T₀- Untreated banana leaves substrate submerged in 55 gallon of water (Control); T₁- Banana leaves substrate submerged in mixture of 100 grams of Urea and 55 gallons of water; T₂- Banana leaves substrate submerged in mixture of 250 ml of fish amino acid and 55 gallons of water; and, T₃- Banana leaves substrate submerged in mixture of 250 ml of fermented plant juice and 55 gallons of water.</w:t>
+        <w:t xml:space="preserve">The study was conducted from June to July 2022 to determine the influence of the different sources of nutrients to rice straw mushrooms. The field experiment was conducted in Sitio Pitabacan, Magalang, Pampanga. The experiment was laid out using Complete Randomize Design (CRD), with four treatments replicated four times. The treatments were as follows: T₀- Untreated banana leaves substrate submerged in 55 gallon of water (Control); T₁- Banana leaves substrate submerged in mixture of 100 grams of Urea and 55 gallons of water; T₂- Banana leaves substrate submerged in mixture of 250 ml of fish amino acid and 55 gallons of water; and, T₃- Banana leaves substrate submerged in mixture of 250 ml of fermented plant juice and 55 gallons of water.</w:t>
       </w:r>
       <w:r>
         <w:rPr>
@@ -19671,7 +19671,7 @@
           <w:szCs w:val="22"/>
           <w:rtl w:val="0"/>
         </w:rPr>
-        <w:t xml:space="preserve"> be on developing and optimizing eco-bricks using a mixture of SUPs and UCO developed through trial and error. SUPs recovered from various donors from the Magalang Public Market, Pampanga and UCO. The preliminary trials established that molding faces some difficulty with increased ratios of UCO to SUPs. Thus, in the optimization process, varying ratios of UCO was used, starting with UCO to SUPs 1:1 as treatment 1, a decreasing ratio of UCO to SUPs. At equal parts by weight of UCO and SUPs, optimization started at Treatment 1 with a 1:1 ratio. Treatments 2—5 proceeded similarly, increasing the ratio of UCO to SUPs. Density measurements, water absorption, and drop tests were all performed and observed. A self-testing protocol based on current literature was used. The density was calculated relative to mass and volume; however, the water absorption test yielded inconsistent findings. A drop test was also performed, which </w:t>
+        <w:t xml:space="preserve"> be on developing and optimizing eco-bricks using a mixture of SUPs and UCO developed through trial and error. SUPs recovered from various donors from the a local public market in Pampanga and UCO. The preliminary trials established that molding faces some difficulty with increased ratios of UCO to SUPs. Thus, in the optimization process, varying ratios of UCO was used, starting with UCO to SUPs 1:1 as treatment 1, a decreasing ratio of UCO to SUPs. At equal parts by weight of UCO and SUPs, optimization started at Treatment 1 with a 1:1 ratio. Treatments 2—5 proceeded similarly, increasing the ratio of UCO to SUPs. Density measurements, water absorption, and drop tests were all performed and observed. A self-testing protocol based on current literature was used. The density was calculated relative to mass and volume; however, the water absorption test yielded inconsistent findings. A drop test was also performed, which </w:t>
       </w:r>
       <w:r>
         <w:rPr>
@@ -21489,7 +21489,7 @@
           <w:szCs w:val="22"/>
           <w:rtl w:val="0"/>
         </w:rPr>
-        <w:t xml:space="preserve">Methicillin-resistant Staphylococcus aureus (MRSA) is a common and potentially (EC) severe pathogen that has developed resistance to several types of antibiotics. MRSA bacteria can (FP-Cap) survive long on surfaces and objects, including second-hand clothing (SHC). The increasing popularity of SHC or “ukay-ukay” in the Philippines, coupled with potential (EC) public health concerns associated with transmitting pathogenic bacteria, emphasized this research’s need. Thus, this study detected the presence of S. aureus and MRSA in second-hand clothing. A total of fifteen most frequently purchased second-hand clothing (i.e., blouses, tee shirts, crop tops, tank tops, and hoodie jackets) were collected from three selected stalls in Sta. Cruz, Magalang, Pampanga. Bacteriological analyses demonstrated the presence of Staphylococcus species across all samples, with growth in high-salt-containing culture broth and characteristic growth on Mannitol Salt Agar (MSA). Biochemical tests revealed positive catalase and Gram-positive cocci in clusters typical of S. aureus. Antibiotic susceptibility testing indicated the presence of both methicillin-sensitive S. aureus (MSSA) and methicillin-resistant S. aureus (MRSA) strains among the collected samples, highlighting the potential (EC) public health risks associated with the handling and purchasing of second-hand clothing. This study, therefore, underscores the need for proper precautions to mitigate the spread of potentially (EC) harmful bacteria, including MRSA, on second-hand clothing. It highlights the importance of raising awareness among both vendors and consumers about the potential (EC) health risks associated with these garments.</w:t>
+        <w:t xml:space="preserve">Methicillin-resistant Staphylococcus aureus (MRSA) is a common and potentially (EC) severe pathogen that has developed resistance to several types of antibiotics. MRSA bacteria can (FP-Cap) survive long on surfaces and objects, including second-hand clothing (SHC). The increasing popularity of SHC or “ukay-ukay” in the Philippines, coupled with potential (EC) public health concerns associated with transmitting pathogenic bacteria, emphasized this research’s need. Thus, this study detected the presence of S. aureus and MRSA in second-hand clothing. A total of fifteen most frequently purchased second-hand clothing (i.e., blouses, tee shirts, crop tops, tank tops, and hoodie jackets) were collected from three selected stalls in Magalang, Pampanga. Bacteriological analyses demonstrated the presence of Staphylococcus species across all samples, with growth in high-salt-containing culture broth and characteristic growth on Mannitol Salt Agar (MSA). Biochemical tests revealed positive catalase and Gram-positive cocci in clusters typical of S. aureus. Antibiotic susceptibility testing indicated the presence of both methicillin-sensitive S. aureus (MSSA) and methicillin-resistant S. aureus (MRSA) strains among the collected samples, highlighting the potential (EC) public health risks associated with the handling and purchasing of second-hand clothing. This study, therefore, underscores the need for proper precautions to mitigate the spread of potentially (EC) harmful bacteria, including MRSA, on second-hand clothing. It highlights the importance of raising awareness among both vendors and consumers about the potential (EC) health risks associated with these garments.</w:t>
       </w:r>
       <w:r>
         <w:rPr>
@@ -22229,7 +22229,7 @@
           <w:szCs w:val="22"/>
           <w:rtl w:val="0"/>
         </w:rPr>
-        <w:t xml:space="preserve"> be considered. This study used Boullon’s Carrying Capacity Mathematical Model adopted from the Ecosystems Research and Development Bureau for computing the Tourism Carrying Capacity (TCC) of Sasmuan Pampanga Coastal Wetlands. Data on the parameters needed in TCC were collected through Key Informant Interviews, direct observation of the site, and a questionnaire-based survey for the tourism-related preferences and residents’ perceived impact of tourism activities. The Real Carrying Capacity per day was found to be a total of 13 boats and 156 visitors for fishing activity on the river stretch of Barangay Batang 2nd, 14 visitors in the Batang 2nd Staging Area, while 420 visitors for aquaculture farm fishing I and 317 visitors in aquaculture farm fishing II, while 8 visitors for bangus feeding I and a total of 9 visitors for bangus feeding II. Only 5 visitors were allowed for birdwatching and 65 visitors for swimming activity. The results revealed that present visitations in these activities are still below the carrying capacity. For descriptive statistics, three-hundred fifty (350) respondents from five coastal barangays of SPCW were purposively selected. Results showed that respondents perceived tourism activities have a positive impact and equal perceptions in ecological (62.00%), economic (59.71%), social (59.71%), and visitor experiences aspects (50.86%). However, tourism activities in the area are perceived to have a negative impact on SPCW’s local facilities (54.00%). Thus, local government </w:t>
+        <w:t xml:space="preserve"> be considered. This study used Boullon’s Carrying Capacity Mathematical Model adopted from the Ecosystems Research and Development Bureau for computing the Tourism Carrying Capacity (TCC) of Sasmuan Pampanga Coastal Wetlands. Data on the parameters needed in TCC were collected through Key Informant Interviews, direct observation of the site, and a questionnaire-based survey for the tourism-related preferences and residents’ perceived impact of tourism activities. The Real Carrying Capacity per day was found to be a total of 13 boats and 156 visitors for fishing activity on the river stretch of a local barangay, 14 visitors in the a local staging area Area, while 420 visitors for aquaculture farm fishing I and 317 visitors in aquaculture farm fishing II, while 8 visitors for bangus feeding I and a total of 9 visitors for bangus feeding II. Only 5 visitors were allowed for birdwatching and 65 visitors for swimming activity. The results revealed that present visitations in these activities are still below the carrying capacity. For descriptive statistics, three-hundred fifty (350) respondents from five coastal barangays of SPCW were purposively selected. Results showed that respondents perceived tourism activities have a positive impact and equal perceptions in ecological (62.00%), economic (59.71%), social (59.71%), and visitor experiences aspects (50.86%). However, tourism activities in the area are perceived to have a negative impact on SPCW’s local facilities (54.00%). Thus, local government </w:t>
       </w:r>
       <w:r>
         <w:rPr>
@@ -22924,7 +22924,7 @@
           <w:szCs w:val="22"/>
           <w:rtl w:val="0"/>
         </w:rPr>
-        <w:t xml:space="preserve">This study assessed the profiling, occurrence and antibiotic resistance of Escherichia coli and Salmonella spp., in retail chicken eggs sold in Magalang Public Market.. The study aimed to profile handling practices of egg vendors, detect E. coli and Salmonella spp. on retail chicken eggs sold in Magalang Public market and assess the degree of antibiotic susceptibility of the bacterial isolates. A total of 16 vendors were evaluated on their egg handling practices, evaluated using a survey checklist, focusing on the assessment of demographic profile and their egg handling practices aligned with the Code of Hygienic Practice for Eggs and Egg Products. For the detection of E. coli and Salmonella spp. isolates, a total of 36 samples were collected, comprised of 16 eggshell surface samples and 16 egg content sample. Samples were subjected to selective culture media, biochemical tests and antibiotic sensitivity testing of bacterial isolates. None of the samples tested positive for Salmonella spp. However, 19% of egg samples tested positive for E. coli on eosin methylene blue (EMB) agar, characterized by green metallic sheen colonies. The 6% of positive samples were detected on the egg shell surface, while 13% of isolated E. coli were located on the egg’s homogenized yolk and albumen. Antibiotic sensitivity testing using disk diffusion method following CLSI guidelines revealed 100% resistance to chloramphenicol, tetracycline, and streptomycin. While 33% showed resistance to meropenem. On the other hand, </w:t>
+        <w:t xml:space="preserve">This study assessed the profiling, occurrence and antibiotic resistance of Escherichia coli and Salmonella spp., in retail chicken eggs sold in a local public market.. The study aimed to profile handling practices of egg vendors, detect E. coli and Salmonella spp. on retail chicken eggs sold in a local public market and assess the degree of antibiotic susceptibility of the bacterial isolates. A total of 16 vendors were evaluated on their egg handling practices, evaluated using a survey checklist, focusing on the assessment of demographic profile and their egg handling practices aligned with the Code of Hygienic Practice for Eggs and Egg Products. For the detection of E. coli and Salmonella spp. isolates, a total of 36 samples were collected, comprised of 16 eggshell surface samples and 16 egg content sample. Samples were subjected to selective culture media, biochemical tests and antibiotic sensitivity testing of bacterial isolates. None of the samples tested positive for Salmonella spp. However, 19% of egg samples tested positive for E. coli on eosin methylene blue (EMB) agar, characterized by green metallic sheen colonies. The 6% of positive samples were detected on the egg shell surface, while 13% of isolated E. coli were located on the egg’s homogenized yolk and albumen. Antibiotic sensitivity testing using disk diffusion method following CLSI guidelines revealed 100% resistance to chloramphenicol, tetracycline, and streptomycin. While 33% showed resistance to meropenem. On the other hand, </w:t>
       </w:r>
       <w:r>
         <w:rPr>
@@ -23699,7 +23699,7 @@
           <w:szCs w:val="22"/>
           <w:rtl w:val="0"/>
         </w:rPr>
-        <w:t xml:space="preserve">Plastic pollution has been a long-standing environmental concern due to improper waste management. Its persistence in marine environments, particularly in the form of microplastics, posed potential (EC) health risks to aquatic species and humans through seafood consumption. This study was conducted to detect microplastics in Whiteleg shrimp (Litopenaeus vannamei) sold at the Magalang Pampanga Market. A total of 10 shrimp samples per stall were collected, equating to 30 shrimps overall from the 3 stalls available. Composite sampling was applied in this study; hence, all individual shrimps from each stall were counted as one sample. The samples were separated into two treatments: Treatment 1, which consisted of the hepatopancreas and gastrointestinal tract of the shrimp, and Treatment 2, which consisted of the shrimp muscle. The samples were subjected to light microscopy and were categorized as follows: Treatment 1 Stall 1 (T1S1), Treatment 1 Stall 2 (T1S2), Treatment 1 Stall 3 (T1S3), Treatment 2 Stall 1 (T2S1), Treatment 2 Stall 2 (T2S2), and Treatment 2 Stall 3 (T2S3). Each sample was added to a 10% KOH solution for the digestion of soft tissue. Afterwards, 60% sodium iodide was used for the density separation of microplastics and undigested organic matter. The supernatant was collected using a pipette and then transferred to a slide before subjecting to a light microscope. In each slide, 10 µl of sample was placed. This was repeated five times in separate slides. A total of 181 microplastics were detected across all samples, wherein the concentration of microplastics was higher in Treatment 1 [R] (74.03%). Fragments (39.02%) were the most dominant shape, followed by fibers (23.20%), lines (17.13%), and then pellets (3.31%). The most dominant color was gray (33.15%), followed by blue (24.31%), black (11.6%), red (9.39%), clear (7.73%), brown (6.63%), violet (3.31%), yellow (3.31%), and green (0.55%). Most of the particles ranged in size from 11–50 µm (58.01%), followed by &lt;10.9 µm (29.83%), 51–100 µm (6.08%), 101–200 µm (5.52%), and &gt;201 µm (1.10%). Through random sampling, one microplastic was selected from each shape for polymer analysis using Fourier Transform Infrared Spectroscopy (FTIR). The fragment had a 97% match with high-density polyethylene, the fiber had a 90% match with an olefin copolymer, and the line sample had a 96% match with polypropylene, while the pellet sample was rejected for analysis due to its small size. To reduce microplastic pollution, the findings recommend (FP-Rec) removing the shrimp’s GIT during preparation to avoid ingestion, use fishing gear made from durable or natural materials, regularly maintain and replace worn equipment, and properly dispose of plastics instead of discarding them into water bodies.</w:t>
+        <w:t xml:space="preserve">Plastic pollution has been a long-standing environmental concern due to improper waste management. Its persistence in marine environments, particularly in the form of microplastics, posed potential (EC) health risks to aquatic species and humans through seafood consumption. This study was conducted to detect microplastics in Whiteleg shrimp (Litopenaeus vannamei) sold at the a local public market. A total of 10 shrimp samples per stall were collected, equating to 30 shrimps overall from the 3 stalls available. Composite sampling was applied in this study; hence, all individual shrimps from each stall were counted as one sample. The samples were separated into two treatments: Treatment 1, which consisted of the hepatopancreas and gastrointestinal tract of the shrimp, and Treatment 2, which consisted of the shrimp muscle. The samples were subjected to light microscopy and were categorized as follows: Treatment 1 Stall 1 (T1S1), Treatment 1 Stall 2 (T1S2), Treatment 1 Stall 3 (T1S3), Treatment 2 Stall 1 (T2S1), Treatment 2 Stall 2 (T2S2), and Treatment 2 Stall 3 (T2S3). Each sample was added to a 10% KOH solution for the digestion of soft tissue. Afterwards, 60% sodium iodide was used for the density separation of microplastics and undigested organic matter. The supernatant was collected using a pipette and then transferred to a slide before subjecting to a light microscope. In each slide, 10 µl of sample was placed. This was repeated five times in separate slides. A total of 181 microplastics were detected across all samples, wherein the concentration of microplastics was higher in Treatment 1 [R] (74.03%). Fragments (39.02%) were the most dominant shape, followed by fibers (23.20%), lines (17.13%), and then pellets (3.31%). The most dominant color was gray (33.15%), followed by blue (24.31%), black (11.6%), red (9.39%), clear (7.73%), brown (6.63%), violet (3.31%), yellow (3.31%), and green (0.55%). Most of the particles ranged in size from 11–50 µm (58.01%), followed by &lt;10.9 µm (29.83%), 51–100 µm (6.08%), 101–200 µm (5.52%), and &gt;201 µm (1.10%). Through random sampling, one microplastic was selected from each shape for polymer analysis using Fourier Transform Infrared Spectroscopy (FTIR). The fragment had a 97% match with high-density polyethylene, the fiber had a 90% match with an olefin copolymer, and the line sample had a 96% match with polypropylene, while the pellet sample was rejected for analysis due to its small size. To reduce microplastic pollution, the findings recommend (FP-Rec) removing the shrimp’s GIT during preparation to avoid ingestion, use fishing gear made from durable or natural materials, regularly maintain and replace worn equipment, and properly dispose of plastics instead of discarding them into water bodies.</w:t>
       </w:r>
       <w:r>
         <w:rPr>
@@ -25234,7 +25234,7 @@
           <w:szCs w:val="22"/>
           <w:rtl w:val="0"/>
         </w:rPr>
-        <w:t xml:space="preserve">This experimental study examined the performance of finger pepper (Capsicum frutescens) treated with fermented banana peel as an organic amendment. The research was conducted in Barangay Bucanan, Magalang, Pampanga, from March to April 2025. Five treatments were tested: T1 – general recommendation (control), T2 – fermented banana peel applied twice weekly, T3 – 100% recommended fertilizer rate with fermented banana peel (twice weekly), T4 – 75% recommended fertilizer rate with fermented banana peel (twice weekly), and T5 – 50% recommended fertilizer rate with fermented banana peel (twice weekly). Parameters measured included days from transplanting to flowering, plant height at first harvest, number of fruits per plant, weight of fruits per plant (g), number of marketable and non- marketable fruits, and computed yield per hectare (tons/ha). This revealed that the application of fermented banana peel improved all growth and yield parameters assessed. Among all treatments, T5 (50% recommended fertilizer rate with fermented banana peel) yielded the most favorable results in terms of plant height, fruit quantity and weight, and overall productivity. These findings </w:t>
+        <w:t xml:space="preserve">This experimental study examined the performance of finger pepper (Capsicum frutescens) treated with fermented banana peel as an organic amendment. The research was conducted in a barangay in Magalang, Pampanga, from March to April 2025. Five treatments were tested: T1 – general recommendation (control), T2 – fermented banana peel applied twice weekly, T3 – 100% recommended fertilizer rate with fermented banana peel (twice weekly), T4 – 75% recommended fertilizer rate with fermented banana peel (twice weekly), and T5 – 50% recommended fertilizer rate with fermented banana peel (twice weekly). Parameters measured included days from transplanting to flowering, plant height at first harvest, number of fruits per plant, weight of fruits per plant (g), number of marketable and non- marketable fruits, and computed yield per hectare (tons/ha). This revealed that the application of fermented banana peel improved all growth and yield parameters assessed. Among all treatments, T5 (50% recommended fertilizer rate with fermented banana peel) yielded the most favorable results in terms of plant height, fruit quantity and weight, and overall productivity. These findings </w:t>
       </w:r>
       <w:r>
         <w:rPr>
@@ -25800,7 +25800,7 @@
           <w:szCs w:val="22"/>
           <w:rtl w:val="0"/>
         </w:rPr>
-        <w:t xml:space="preserve">The study was conducted at Barangay Pandacaqui, Mexico, Pampanga, from November 2022 to February 2023 to determine the effect of rooting hormones on monstera cuttings. The study used Complete Randomized Design (CRD) with four replications. The pot experiment comprised of main treatments: T1- Control (Water), T2- Aloe Vera gel, T3- Coconut water, T4- Moringa leaves extract, and T5- ANAA. Data were evaluated using Analysis of Variance (ANOVA). Based on the results of the study, different rooting hormones did not significantly influence the days to shoot emergence, number of shoots, number of leaves, number of adventitious roots, root diameter, length of the longest roots, number of rooted cuttings, and percentage of survival cuttings. Additionally, alternative rooting hormones and synthetic hormone applications had varying survival rates. The highest survival was found in ANAA, followed by control water (distilled or filtered water), coconut water, and aloe vera gel, and the lowest survival was found in moringa leaf extract. In conclusion, the number of rooted cuttings obtained by application of aloe vera gel and moringa leaf extract was comparable in percentage survival with that obtained by application of water (distilled or filtered water) on monstera cuttings. Most </w:t>
+        <w:t xml:space="preserve">The study was conducted at a barangay in Mexico, Pampanga, from November 2022 to February 2023 to determine the effect of rooting hormones on monstera cuttings. The study used Complete Randomized Design (CRD) with four replications. The pot experiment comprised of main treatments: T1- Control (Water), T2- Aloe Vera gel, T3- Coconut water, T4- Moringa leaves extract, and T5- ANAA. Data were evaluated using Analysis of Variance (ANOVA). Based on the results of the study, different rooting hormones did not significantly influence the days to shoot emergence, number of shoots, number of leaves, number of adventitious roots, root diameter, length of the longest roots, number of rooted cuttings, and percentage of survival cuttings. Additionally, alternative rooting hormones and synthetic hormone applications had varying survival rates. The highest survival was found in ANAA, followed by control water (distilled or filtered water), coconut water, and aloe vera gel, and the lowest survival was found in moringa leaf extract. In conclusion, the number of rooted cuttings obtained by application of aloe vera gel and moringa leaf extract was comparable in percentage survival with that obtained by application of water (distilled or filtered water) on monstera cuttings. Most </w:t>
       </w:r>
       <w:r>
         <w:rPr>
@@ -26072,7 +26072,7 @@
           <w:szCs w:val="22"/>
           <w:rtl w:val="0"/>
         </w:rPr>
-        <w:t xml:space="preserve">The study on the frequency of fermented azolla application on the growth and yield of onion was conducted at Barangay San Agustin, Magalang, Pampanga, from December 2024 to April 2025. The experiment consisted of T1 - 75 grams Trichoderma + 1 kg of fermented azolla 1x application, T2 - 75 grams Trichoderma + 1 kg of fermented azolla 2x application, T3 - 75 grams Trichoderma + 1 kg of fermented azolla 3x application, and T4 - 75 grams Trichoderma + 1 kg of fermented azolla 4x application. The parameters used to compare the four treatments were the plant height, number of leaves, bulb diameter, weight of marketable and non – marketable bulbs, and computed yield per hectare. The study found that Trichoderma and Fermented azolla application in onion cultivation significantly improved plant height, number of leaves, bulb diameter, weight of marketable bulbs and non- marketable bulbs, as well as the computed yield per hectare. Among all treatments, T3 (75 grams of Trichoderma + 1kg of fermented azolla 3x application) was found to be the most effective, yielding the best results. This </w:t>
+        <w:t xml:space="preserve">The study on the frequency of fermented azolla application on the growth and yield of onion was conducted at a barangay in Magalang, Pampanga, from December 2024 to April 2025. The experiment consisted of T1 - 75 grams Trichoderma + 1 kg of fermented azolla 1x application, T2 - 75 grams Trichoderma + 1 kg of fermented azolla 2x application, T3 - 75 grams Trichoderma + 1 kg of fermented azolla 3x application, and T4 - 75 grams Trichoderma + 1 kg of fermented azolla 4x application. The parameters used to compare the four treatments were the plant height, number of leaves, bulb diameter, weight of marketable and non – marketable bulbs, and computed yield per hectare. The study found that Trichoderma and Fermented azolla application in onion cultivation significantly improved plant height, number of leaves, bulb diameter, weight of marketable bulbs and non- marketable bulbs, as well as the computed yield per hectare. Among all treatments, T3 (75 grams of Trichoderma + 1kg of fermented azolla 3x application) was found to be the most effective, yielding the best results. This </w:t>
       </w:r>
       <w:r>
         <w:rPr>
@@ -27191,7 +27191,7 @@
           <w:szCs w:val="22"/>
           <w:rtl w:val="0"/>
         </w:rPr>
-        <w:t xml:space="preserve">A sixty three (63) days study was conducted to determine the growth performance of mallard duck fed with dietary mixed ration in Barangay Bucanan, Magalang, Pampanga. A total of ninety (90), 21 days old male mallard duck were used in the study. A single factor experiment in Randomized Complete Block Design (RCBD) was used in the study. Mallard ducks were randomly divided into three (3) treatments having ten (10) mallard ducks per treatment with three (3) replications. Treatment 1 - commercial feeds; Treatment 2 - 50% commercial feeds and 50% rice bran mixed with water spinach; and Treatment 3 - 50% commercial feeds and 50% rice bran mixed with golden apple snail. Data were analyzed by using Analyzed of Variance in RCBD through the Statistical Tool for Agricultural Research (STAR) application. Treatments were compared using the Least Significant Difference (LSD). The result of the study showed in the treatments that there were no significant differences observed in feed consumption, which </w:t>
+        <w:t xml:space="preserve">A sixty three (63) days study was conducted to determine the growth performance of mallard duck fed with dietary mixed ration in a barangay in Magalang, Pampanga. A total of ninety (90), 21 days old male mallard duck were used in the study. A single factor experiment in Randomized Complete Block Design (RCBD) was used in the study. Mallard ducks were randomly divided into three (3) treatments having ten (10) mallard ducks per treatment with three (3) replications. Treatment 1 - commercial feeds; Treatment 2 - 50% commercial feeds and 50% rice bran mixed with water spinach; and Treatment 3 - 50% commercial feeds and 50% rice bran mixed with golden apple snail. Data were analyzed by using Analyzed of Variance in RCBD through the Statistical Tool for Agricultural Research (STAR) application. Treatments were compared using the Least Significant Difference (LSD). The result of the study showed in the treatments that there were no significant differences observed in feed consumption, which </w:t>
       </w:r>
       <w:r>
         <w:rPr>
@@ -27778,7 +27778,7 @@
           <w:szCs w:val="22"/>
           <w:rtl w:val="0"/>
         </w:rPr>
-        <w:t xml:space="preserve">This study was conducted over a 35-day period from May 10, 2023, to June 14, 2023, at San Ildefonso, Magalang, Pampanga. The present study aimed to determine the growth response of crossbred New Zealand rabbits as influenced by varying levels of fermented Madre De Agua leaves. Eighteen (18), 2 months of crossbreed New Zealand rabbits were used in the study which were divided into three (3) treatments: T1 = 70% concentrate + 30% paragrass, T2 = 70% concentrate + 20% paragrass + 10% fermented Madre De Agua, T3 = 60% concentrate + 20% paragrass + 20% fermented Madre De Agua. A Completely Randomized Design was employed, and data was analyzed through ANOVA by Statistical Tool for Agricultural Research (STAR). Statistical analysis showed that there was no significant difference but showed numerical trends among the treatments in relation to initial weight, final weight, gain in weight, average daily gain, dry matter intake, and feed conversion ratio of the experimental rabbits In conclusion, all treatments are comparable in terms of growth, </w:t>
+        <w:t xml:space="preserve">This study was conducted over a 35-day period from May 10, 2023, to June 14, 2023, at Magalang, Pampanga. The present study aimed to determine the growth response of crossbred New Zealand rabbits as influenced by varying levels of fermented Madre De Agua leaves. Eighteen (18), 2 months of crossbreed New Zealand rabbits were used in the study which were divided into three (3) treatments: T1 = 70% concentrate + 30% paragrass, T2 = 70% concentrate + 20% paragrass + 10% fermented Madre De Agua, T3 = 60% concentrate + 20% paragrass + 20% fermented Madre De Agua. A Completely Randomized Design was employed, and data was analyzed through ANOVA by Statistical Tool for Agricultural Research (STAR). Statistical analysis showed that there was no significant difference but showed numerical trends among the treatments in relation to initial weight, final weight, gain in weight, average daily gain, dry matter intake, and feed conversion ratio of the experimental rabbits In conclusion, all treatments are comparable in terms of growth, </w:t>
       </w:r>
       <w:r>
         <w:rPr>
@@ -28133,7 +28133,7 @@
           <w:szCs w:val="22"/>
           <w:rtl w:val="0"/>
         </w:rPr>
-        <w:t xml:space="preserve">The study was conducted at EJR ANNE FARM, San Ildefonso, Magalang, Pampanga from April 25 to April 30, 2023 to find out the “Efficacy of Diatomaceous Earth (DE) and Neem Tree Extract (Azadirachta indica) on House Fly Larvae (Musca domestica) on Poultry Manure” where a total of nine hundred maggots (900) were used. The experiment was laid out using Complete Randomized Design (CRD) with three (3) treatments, namely, T1 –Carbonated rice hull and saw dust, T2 – Diatomaceous Earth, and T3 –Neem tree extract. The nine hundred maggots were divided into three (3) treatments at one hundred maggots (100) per treatment each treatment was replicated three (3) times with one hundred maggots (100) per replication. </w:t>
+        <w:t xml:space="preserve">The study was conducted at a local farm in Magalang, Pampanga from April 25 to April 30, 2023 to find out the “Efficacy of Diatomaceous Earth (DE) and Neem Tree Extract (Azadirachta indica) on House Fly Larvae (Musca domestica) on Poultry Manure” where a total of nine hundred maggots (900) were used. The experiment was laid out using Complete Randomized Design (CRD) with three (3) treatments, namely, T1 –Carbonated rice hull and saw dust, T2 – Diatomaceous Earth, and T3 –Neem tree extract. The nine hundred maggots were divided into three (3) treatments at one hundred maggots (100) per treatment each treatment was replicated three (3) times with one hundred maggots (100) per replication. </w:t>
       </w:r>
       <w:r>
         <w:rPr>

</xml_diff>

<commit_message>
Draft_017: scrub barangay/sitio names from Appendix B pilot abstracts
</commit_message>
<xml_diff>
--- a/thesis/003_ThesisProposal_Draft_017.docx
+++ b/thesis/003_ThesisProposal_Draft_017.docx
@@ -18149,7 +18149,7 @@
           <w:szCs w:val="22"/>
           <w:rtl w:val="0"/>
         </w:rPr>
-        <w:t xml:space="preserve">The study was conducted for 7 days from July 07 to July 13, 2022 at Brgy. San Roque, Magalang, Pampanga. The general objective of the study was to determine the acceptability and palatability of duck ham subjected to different curing process. Specifically, it aimed to find the sensory evaluation: appearance; aroma; taste/ flavor; texture; and over-all acceptability. A total of eight (8) Muscovy ducks were used in this study. The study used Hedonic Likert Scale and was subjected to Desriptive analysis. Factor A = Type of curing and Factor B = Spice rub. The treatments used in this study are the following. A₁ B₁ - Dry curing + Oregano, A₁ B₂ - Dry curing + Lemon grass, A₂ B₁ - Liquid curing + Oregano and A₁ B₂ - Liquid curing + Lemon grass. The sensory evaluation was conducted at Pampanga State Agricultural University, PAC, Magalang, Pampanga. Ten (10) college students, ten (10) teachers and ten (10) people who don’t eat duck were selected as respondents to evaluate the sample treatments. The data collected from the sensory evaluation were analysed using descriptive statistics.</w:t>
+        <w:t xml:space="preserve">The study was conducted for 7 days from July 07 to July 13, 2022 at a barangay in Magalang, Pampanga. The general objective of the study was to determine the acceptability and palatability of duck ham subjected to different curing process. Specifically, it aimed to find the sensory evaluation: appearance; aroma; taste/ flavor; texture; and over-all acceptability. A total of eight (8) Muscovy ducks were used in this study. The study used Hedonic Likert Scale and was subjected to Desriptive analysis. Factor A = Type of curing and Factor B = Spice rub. The treatments used in this study are the following. A₁ B₁ - Dry curing + Oregano, A₁ B₂ - Dry curing + Lemon grass, A₂ B₁ - Liquid curing + Oregano and A₁ B₂ - Liquid curing + Lemon grass. The sensory evaluation was conducted at Pampanga State Agricultural University, PAC, Magalang, Pampanga. Ten (10) college students, ten (10) teachers and ten (10) people who don’t eat duck were selected as respondents to evaluate the sample treatments. The data collected from the sensory evaluation were analysed using descriptive statistics.</w:t>
       </w:r>
       <w:r>
         <w:rPr>
@@ -18317,7 +18317,7 @@
           <w:szCs w:val="22"/>
           <w:rtl w:val="0"/>
         </w:rPr>
-        <w:t xml:space="preserve">The study was conducted from June to July 2022 to determine the influence of the different sources of nutrients to rice straw mushrooms. The field experiment was conducted in Sitio Pitabacan, Magalang, Pampanga. The experiment was laid out using Complete Randomize Design (CRD), with four treatments replicated four times. The treatments were as follows: T₀- Untreated banana leaves substrate submerged in 55 gallon of water (Control); T₁- Banana leaves substrate submerged in mixture of 100 grams of Urea and 55 gallons of water; T₂- Banana leaves substrate submerged in mixture of 250 ml of fish amino acid and 55 gallons of water; and, T₃- Banana leaves substrate submerged in mixture of 250 ml of fermented plant juice and 55 gallons of water.</w:t>
+        <w:t xml:space="preserve">The study was conducted from June to July 2022 to determine the influence of the different sources of nutrients to rice straw mushrooms. The field experiment was conducted in a sitio in Magalang, Pampanga. The experiment was laid out using Complete Randomize Design (CRD), with four treatments replicated four times. The treatments were as follows: T₀- Untreated banana leaves substrate submerged in 55 gallon of water (Control); T₁- Banana leaves substrate submerged in mixture of 100 grams of Urea and 55 gallons of water; T₂- Banana leaves substrate submerged in mixture of 250 ml of fish amino acid and 55 gallons of water; and, T₃- Banana leaves substrate submerged in mixture of 250 ml of fermented plant juice and 55 gallons of water.</w:t>
       </w:r>
       <w:r>
         <w:rPr>

</xml_diff>

<commit_message>
Draft_017: use [REDACTED] for anonymized sites in Appendices B and C
</commit_message>
<xml_diff>
--- a/thesis/003_ThesisProposal_Draft_017.docx
+++ b/thesis/003_ThesisProposal_Draft_017.docx
@@ -18149,7 +18149,7 @@
           <w:szCs w:val="22"/>
           <w:rtl w:val="0"/>
         </w:rPr>
-        <w:t xml:space="preserve">The study was conducted for 7 days from July 07 to July 13, 2022 at a barangay in Magalang, Pampanga. The general objective of the study was to determine the acceptability and palatability of duck ham subjected to different curing process. Specifically, it aimed to find the sensory evaluation: appearance; aroma; taste/ flavor; texture; and over-all acceptability. A total of eight (8) Muscovy ducks were used in this study. The study used Hedonic Likert Scale and was subjected to Desriptive analysis. Factor A = Type of curing and Factor B = Spice rub. The treatments used in this study are the following. A₁ B₁ - Dry curing + Oregano, A₁ B₂ - Dry curing + Lemon grass, A₂ B₁ - Liquid curing + Oregano and A₁ B₂ - Liquid curing + Lemon grass. The sensory evaluation was conducted at Pampanga State Agricultural University, PAC, Magalang, Pampanga. Ten (10) college students, ten (10) teachers and ten (10) people who don’t eat duck were selected as respondents to evaluate the sample treatments. The data collected from the sensory evaluation were analysed using descriptive statistics.</w:t>
+        <w:t xml:space="preserve">The study was conducted for 7 days from July 07 to July 13, 2022 at [REDACTED]. The general objective of the study was to determine the acceptability and palatability of duck ham subjected to different curing process. Specifically, it aimed to find the sensory evaluation: appearance; aroma; taste/ flavor; texture; and over-all acceptability. A total of eight (8) Muscovy ducks were used in this study. The study used Hedonic Likert Scale and was subjected to Desriptive analysis. Factor A = Type of curing and Factor B = Spice rub. The treatments used in this study are the following. A₁ B₁ - Dry curing + Oregano, A₁ B₂ - Dry curing + Lemon grass, A₂ B₁ - Liquid curing + Oregano and A₁ B₂ - Liquid curing + Lemon grass. The sensory evaluation was conducted at Pampanga State Agricultural University, PAC, Magalang, Pampanga. Ten (10) college students, ten (10) teachers and ten (10) people who don’t eat duck were selected as respondents to evaluate the sample treatments. The data collected from the sensory evaluation were analysed using descriptive statistics.</w:t>
       </w:r>
       <w:r>
         <w:rPr>
@@ -18317,7 +18317,7 @@
           <w:szCs w:val="22"/>
           <w:rtl w:val="0"/>
         </w:rPr>
-        <w:t xml:space="preserve">The study was conducted from June to July 2022 to determine the influence of the different sources of nutrients to rice straw mushrooms. The field experiment was conducted in a sitio in Magalang, Pampanga. The experiment was laid out using Complete Randomize Design (CRD), with four treatments replicated four times. The treatments were as follows: T₀- Untreated banana leaves substrate submerged in 55 gallon of water (Control); T₁- Banana leaves substrate submerged in mixture of 100 grams of Urea and 55 gallons of water; T₂- Banana leaves substrate submerged in mixture of 250 ml of fish amino acid and 55 gallons of water; and, T₃- Banana leaves substrate submerged in mixture of 250 ml of fermented plant juice and 55 gallons of water.</w:t>
+        <w:t xml:space="preserve">The study was conducted from June to July 2022 to determine the influence of the different sources of nutrients to rice straw mushrooms. The field experiment was conducted in [REDACTED]. The experiment was laid out using Complete Randomize Design (CRD), with four treatments replicated four times. The treatments were as follows: T₀- Untreated banana leaves substrate submerged in 55 gallon of water (Control); T₁- Banana leaves substrate submerged in mixture of 100 grams of Urea and 55 gallons of water; T₂- Banana leaves substrate submerged in mixture of 250 ml of fish amino acid and 55 gallons of water; and, T₃- Banana leaves substrate submerged in mixture of 250 ml of fermented plant juice and 55 gallons of water.</w:t>
       </w:r>
       <w:r>
         <w:rPr>
@@ -19671,7 +19671,7 @@
           <w:szCs w:val="22"/>
           <w:rtl w:val="0"/>
         </w:rPr>
-        <w:t xml:space="preserve"> be on developing and optimizing eco-bricks using a mixture of SUPs and UCO developed through trial and error. SUPs recovered from various donors from the a local public market in Pampanga and UCO. The preliminary trials established that molding faces some difficulty with increased ratios of UCO to SUPs. Thus, in the optimization process, varying ratios of UCO was used, starting with UCO to SUPs 1:1 as treatment 1, a decreasing ratio of UCO to SUPs. At equal parts by weight of UCO and SUPs, optimization started at Treatment 1 with a 1:1 ratio. Treatments 2—5 proceeded similarly, increasing the ratio of UCO to SUPs. Density measurements, water absorption, and drop tests were all performed and observed. A self-testing protocol based on current literature was used. The density was calculated relative to mass and volume; however, the water absorption test yielded inconsistent findings. A drop test was also performed, which </w:t>
+        <w:t xml:space="preserve"> be on developing and optimizing eco-bricks using a mixture of SUPs and UCO developed through trial and error. SUPs recovered from various donors from the [REDACTED] and UCO. The preliminary trials established that molding faces some difficulty with increased ratios of UCO to SUPs. Thus, in the optimization process, varying ratios of UCO was used, starting with UCO to SUPs 1:1 as treatment 1, a decreasing ratio of UCO to SUPs. At equal parts by weight of UCO and SUPs, optimization started at Treatment 1 with a 1:1 ratio. Treatments 2—5 proceeded similarly, increasing the ratio of UCO to SUPs. Density measurements, water absorption, and drop tests were all performed and observed. A self-testing protocol based on current literature was used. The density was calculated relative to mass and volume; however, the water absorption test yielded inconsistent findings. A drop test was also performed, which </w:t>
       </w:r>
       <w:r>
         <w:rPr>
@@ -22229,7 +22229,7 @@
           <w:szCs w:val="22"/>
           <w:rtl w:val="0"/>
         </w:rPr>
-        <w:t xml:space="preserve"> be considered. This study used Boullon’s Carrying Capacity Mathematical Model adopted from the Ecosystems Research and Development Bureau for computing the Tourism Carrying Capacity (TCC) of Sasmuan Pampanga Coastal Wetlands. Data on the parameters needed in TCC were collected through Key Informant Interviews, direct observation of the site, and a questionnaire-based survey for the tourism-related preferences and residents’ perceived impact of tourism activities. The Real Carrying Capacity per day was found to be a total of 13 boats and 156 visitors for fishing activity on the river stretch of a local barangay, 14 visitors in the a local staging area Area, while 420 visitors for aquaculture farm fishing I and 317 visitors in aquaculture farm fishing II, while 8 visitors for bangus feeding I and a total of 9 visitors for bangus feeding II. Only 5 visitors were allowed for birdwatching and 65 visitors for swimming activity. The results revealed that present visitations in these activities are still below the carrying capacity. For descriptive statistics, three-hundred fifty (350) respondents from five coastal barangays of SPCW were purposively selected. Results showed that respondents perceived tourism activities have a positive impact and equal perceptions in ecological (62.00%), economic (59.71%), social (59.71%), and visitor experiences aspects (50.86%). However, tourism activities in the area are perceived to have a negative impact on SPCW’s local facilities (54.00%). Thus, local government </w:t>
+        <w:t xml:space="preserve"> be considered. This study used Boullon’s Carrying Capacity Mathematical Model adopted from the Ecosystems Research and Development Bureau for computing the Tourism Carrying Capacity (TCC) of Sasmuan Pampanga Coastal Wetlands. Data on the parameters needed in TCC were collected through Key Informant Interviews, direct observation of the site, and a questionnaire-based survey for the tourism-related preferences and residents’ perceived impact of tourism activities. The Real Carrying Capacity per day was found to be a total of 13 boats and 156 visitors for fishing activity on the river stretch of [REDACTED], 14 visitors in the [REDACTED], while 420 visitors for aquaculture farm fishing I and 317 visitors in aquaculture farm fishing II, while 8 visitors for bangus feeding I and a total of 9 visitors for bangus feeding II. Only 5 visitors were allowed for birdwatching and 65 visitors for swimming activity. The results revealed that present visitations in these activities are still below the carrying capacity. For descriptive statistics, three-hundred fifty (350) respondents from five coastal barangays of SPCW were purposively selected. Results showed that respondents perceived tourism activities have a positive impact and equal perceptions in ecological (62.00%), economic (59.71%), social (59.71%), and visitor experiences aspects (50.86%). However, tourism activities in the area are perceived to have a negative impact on SPCW’s local facilities (54.00%). Thus, local government </w:t>
       </w:r>
       <w:r>
         <w:rPr>
@@ -22924,7 +22924,7 @@
           <w:szCs w:val="22"/>
           <w:rtl w:val="0"/>
         </w:rPr>
-        <w:t xml:space="preserve">This study assessed the profiling, occurrence and antibiotic resistance of Escherichia coli and Salmonella spp., in retail chicken eggs sold in a local public market.. The study aimed to profile handling practices of egg vendors, detect E. coli and Salmonella spp. on retail chicken eggs sold in a local public market and assess the degree of antibiotic susceptibility of the bacterial isolates. A total of 16 vendors were evaluated on their egg handling practices, evaluated using a survey checklist, focusing on the assessment of demographic profile and their egg handling practices aligned with the Code of Hygienic Practice for Eggs and Egg Products. For the detection of E. coli and Salmonella spp. isolates, a total of 36 samples were collected, comprised of 16 eggshell surface samples and 16 egg content sample. Samples were subjected to selective culture media, biochemical tests and antibiotic sensitivity testing of bacterial isolates. None of the samples tested positive for Salmonella spp. However, 19% of egg samples tested positive for E. coli on eosin methylene blue (EMB) agar, characterized by green metallic sheen colonies. The 6% of positive samples were detected on the egg shell surface, while 13% of isolated E. coli were located on the egg’s homogenized yolk and albumen. Antibiotic sensitivity testing using disk diffusion method following CLSI guidelines revealed 100% resistance to chloramphenicol, tetracycline, and streptomycin. While 33% showed resistance to meropenem. On the other hand, </w:t>
+        <w:t xml:space="preserve">This study assessed the profiling, occurrence and antibiotic resistance of Escherichia coli and Salmonella spp., in retail chicken eggs sold in [REDACTED]. The study aimed to profile handling practices of egg vendors, detect E. coli and Salmonella spp. on retail chicken eggs sold in [REDACTED] and assess the degree of antibiotic susceptibility of the bacterial isolates. A total of 16 vendors were evaluated on their egg handling practices, evaluated using a survey checklist, focusing on the assessment of demographic profile and their egg handling practices aligned with the Code of Hygienic Practice for Eggs and Egg Products. For the detection of E. coli and Salmonella spp. isolates, a total of 36 samples were collected, comprised of 16 eggshell surface samples and 16 egg content sample. Samples were subjected to selective culture media, biochemical tests and antibiotic sensitivity testing of bacterial isolates. None of the samples tested positive for Salmonella spp. However, 19% of egg samples tested positive for E. coli on eosin methylene blue (EMB) agar, characterized by green metallic sheen colonies. The 6% of positive samples were detected on the egg shell surface, while 13% of isolated E. coli were located on the egg’s homogenized yolk and albumen. Antibiotic sensitivity testing using disk diffusion method following CLSI guidelines revealed 100% resistance to chloramphenicol, tetracycline, and streptomycin. While 33% showed resistance to meropenem. On the other hand, </w:t>
       </w:r>
       <w:r>
         <w:rPr>
@@ -23699,7 +23699,7 @@
           <w:szCs w:val="22"/>
           <w:rtl w:val="0"/>
         </w:rPr>
-        <w:t xml:space="preserve">Plastic pollution has been a long-standing environmental concern due to improper waste management. Its persistence in marine environments, particularly in the form of microplastics, posed potential (EC) health risks to aquatic species and humans through seafood consumption. This study was conducted to detect microplastics in Whiteleg shrimp (Litopenaeus vannamei) sold at the a local public market. A total of 10 shrimp samples per stall were collected, equating to 30 shrimps overall from the 3 stalls available. Composite sampling was applied in this study; hence, all individual shrimps from each stall were counted as one sample. The samples were separated into two treatments: Treatment 1, which consisted of the hepatopancreas and gastrointestinal tract of the shrimp, and Treatment 2, which consisted of the shrimp muscle. The samples were subjected to light microscopy and were categorized as follows: Treatment 1 Stall 1 (T1S1), Treatment 1 Stall 2 (T1S2), Treatment 1 Stall 3 (T1S3), Treatment 2 Stall 1 (T2S1), Treatment 2 Stall 2 (T2S2), and Treatment 2 Stall 3 (T2S3). Each sample was added to a 10% KOH solution for the digestion of soft tissue. Afterwards, 60% sodium iodide was used for the density separation of microplastics and undigested organic matter. The supernatant was collected using a pipette and then transferred to a slide before subjecting to a light microscope. In each slide, 10 µl of sample was placed. This was repeated five times in separate slides. A total of 181 microplastics were detected across all samples, wherein the concentration of microplastics was higher in Treatment 1 [R] (74.03%). Fragments (39.02%) were the most dominant shape, followed by fibers (23.20%), lines (17.13%), and then pellets (3.31%). The most dominant color was gray (33.15%), followed by blue (24.31%), black (11.6%), red (9.39%), clear (7.73%), brown (6.63%), violet (3.31%), yellow (3.31%), and green (0.55%). Most of the particles ranged in size from 11–50 µm (58.01%), followed by &lt;10.9 µm (29.83%), 51–100 µm (6.08%), 101–200 µm (5.52%), and &gt;201 µm (1.10%). Through random sampling, one microplastic was selected from each shape for polymer analysis using Fourier Transform Infrared Spectroscopy (FTIR). The fragment had a 97% match with high-density polyethylene, the fiber had a 90% match with an olefin copolymer, and the line sample had a 96% match with polypropylene, while the pellet sample was rejected for analysis due to its small size. To reduce microplastic pollution, the findings recommend (FP-Rec) removing the shrimp’s GIT during preparation to avoid ingestion, use fishing gear made from durable or natural materials, regularly maintain and replace worn equipment, and properly dispose of plastics instead of discarding them into water bodies.</w:t>
+        <w:t xml:space="preserve">Plastic pollution has been a long-standing environmental concern due to improper waste management. Its persistence in marine environments, particularly in the form of microplastics, posed potential (EC) health risks to aquatic species and humans through seafood consumption. This study was conducted to detect microplastics in Whiteleg shrimp (Litopenaeus vannamei) sold at the [REDACTED]. A total of 10 shrimp samples per stall were collected, equating to 30 shrimps overall from the 3 stalls available. Composite sampling was applied in this study; hence, all individual shrimps from each stall were counted as one sample. The samples were separated into two treatments: Treatment 1, which consisted of the hepatopancreas and gastrointestinal tract of the shrimp, and Treatment 2, which consisted of the shrimp muscle. The samples were subjected to light microscopy and were categorized as follows: Treatment 1 Stall 1 (T1S1), Treatment 1 Stall 2 (T1S2), Treatment 1 Stall 3 (T1S3), Treatment 2 Stall 1 (T2S1), Treatment 2 Stall 2 (T2S2), and Treatment 2 Stall 3 (T2S3). Each sample was added to a 10% KOH solution for the digestion of soft tissue. Afterwards, 60% sodium iodide was used for the density separation of microplastics and undigested organic matter. The supernatant was collected using a pipette and then transferred to a slide before subjecting to a light microscope. In each slide, 10 µl of sample was placed. This was repeated five times in separate slides. A total of 181 microplastics were detected across all samples, wherein the concentration of microplastics was higher in Treatment 1 [R] (74.03%). Fragments (39.02%) were the most dominant shape, followed by fibers (23.20%), lines (17.13%), and then pellets (3.31%). The most dominant color was gray (33.15%), followed by blue (24.31%), black (11.6%), red (9.39%), clear (7.73%), brown (6.63%), violet (3.31%), yellow (3.31%), and green (0.55%). Most of the particles ranged in size from 11–50 µm (58.01%), followed by &lt;10.9 µm (29.83%), 51–100 µm (6.08%), 101–200 µm (5.52%), and &gt;201 µm (1.10%). Through random sampling, one microplastic was selected from each shape for polymer analysis using Fourier Transform Infrared Spectroscopy (FTIR). The fragment had a 97% match with high-density polyethylene, the fiber had a 90% match with an olefin copolymer, and the line sample had a 96% match with polypropylene, while the pellet sample was rejected for analysis due to its small size. To reduce microplastic pollution, the findings recommend (FP-Rec) removing the shrimp’s GIT during preparation to avoid ingestion, use fishing gear made from durable or natural materials, regularly maintain and replace worn equipment, and properly dispose of plastics instead of discarding them into water bodies.</w:t>
       </w:r>
       <w:r>
         <w:rPr>
@@ -25234,7 +25234,7 @@
           <w:szCs w:val="22"/>
           <w:rtl w:val="0"/>
         </w:rPr>
-        <w:t xml:space="preserve">This experimental study examined the performance of finger pepper (Capsicum frutescens) treated with fermented banana peel as an organic amendment. The research was conducted in a barangay in Magalang, Pampanga, from March to April 2025. Five treatments were tested: T1 – general recommendation (control), T2 – fermented banana peel applied twice weekly, T3 – 100% recommended fertilizer rate with fermented banana peel (twice weekly), T4 – 75% recommended fertilizer rate with fermented banana peel (twice weekly), and T5 – 50% recommended fertilizer rate with fermented banana peel (twice weekly). Parameters measured included days from transplanting to flowering, plant height at first harvest, number of fruits per plant, weight of fruits per plant (g), number of marketable and non- marketable fruits, and computed yield per hectare (tons/ha). This revealed that the application of fermented banana peel improved all growth and yield parameters assessed. Among all treatments, T5 (50% recommended fertilizer rate with fermented banana peel) yielded the most favorable results in terms of plant height, fruit quantity and weight, and overall productivity. These findings </w:t>
+        <w:t xml:space="preserve">This experimental study examined the performance of finger pepper (Capsicum frutescens) treated with fermented banana peel as an organic amendment. The research was conducted in [REDACTED], from March to April 2025. Five treatments were tested: T1 – general recommendation (control), T2 – fermented banana peel applied twice weekly, T3 – 100% recommended fertilizer rate with fermented banana peel (twice weekly), T4 – 75% recommended fertilizer rate with fermented banana peel (twice weekly), and T5 – 50% recommended fertilizer rate with fermented banana peel (twice weekly). Parameters measured included days from transplanting to flowering, plant height at first harvest, number of fruits per plant, weight of fruits per plant (g), number of marketable and non- marketable fruits, and computed yield per hectare (tons/ha). This revealed that the application of fermented banana peel improved all growth and yield parameters assessed. Among all treatments, T5 (50% recommended fertilizer rate with fermented banana peel) yielded the most favorable results in terms of plant height, fruit quantity and weight, and overall productivity. These findings </w:t>
       </w:r>
       <w:r>
         <w:rPr>
@@ -25800,7 +25800,7 @@
           <w:szCs w:val="22"/>
           <w:rtl w:val="0"/>
         </w:rPr>
-        <w:t xml:space="preserve">The study was conducted at a barangay in Mexico, Pampanga, from November 2022 to February 2023 to determine the effect of rooting hormones on monstera cuttings. The study used Complete Randomized Design (CRD) with four replications. The pot experiment comprised of main treatments: T1- Control (Water), T2- Aloe Vera gel, T3- Coconut water, T4- Moringa leaves extract, and T5- ANAA. Data were evaluated using Analysis of Variance (ANOVA). Based on the results of the study, different rooting hormones did not significantly influence the days to shoot emergence, number of shoots, number of leaves, number of adventitious roots, root diameter, length of the longest roots, number of rooted cuttings, and percentage of survival cuttings. Additionally, alternative rooting hormones and synthetic hormone applications had varying survival rates. The highest survival was found in ANAA, followed by control water (distilled or filtered water), coconut water, and aloe vera gel, and the lowest survival was found in moringa leaf extract. In conclusion, the number of rooted cuttings obtained by application of aloe vera gel and moringa leaf extract was comparable in percentage survival with that obtained by application of water (distilled or filtered water) on monstera cuttings. Most </w:t>
+        <w:t xml:space="preserve">The study was conducted at [REDACTED], from November 2022 to February 2023 to determine the effect of rooting hormones on monstera cuttings. The study used Complete Randomized Design (CRD) with four replications. The pot experiment comprised of main treatments: T1- Control (Water), T2- Aloe Vera gel, T3- Coconut water, T4- Moringa leaves extract, and T5- ANAA. Data were evaluated using Analysis of Variance (ANOVA). Based on the results of the study, different rooting hormones did not significantly influence the days to shoot emergence, number of shoots, number of leaves, number of adventitious roots, root diameter, length of the longest roots, number of rooted cuttings, and percentage of survival cuttings. Additionally, alternative rooting hormones and synthetic hormone applications had varying survival rates. The highest survival was found in ANAA, followed by control water (distilled or filtered water), coconut water, and aloe vera gel, and the lowest survival was found in moringa leaf extract. In conclusion, the number of rooted cuttings obtained by application of aloe vera gel and moringa leaf extract was comparable in percentage survival with that obtained by application of water (distilled or filtered water) on monstera cuttings. Most </w:t>
       </w:r>
       <w:r>
         <w:rPr>
@@ -26072,7 +26072,7 @@
           <w:szCs w:val="22"/>
           <w:rtl w:val="0"/>
         </w:rPr>
-        <w:t xml:space="preserve">The study on the frequency of fermented azolla application on the growth and yield of onion was conducted at a barangay in Magalang, Pampanga, from December 2024 to April 2025. The experiment consisted of T1 - 75 grams Trichoderma + 1 kg of fermented azolla 1x application, T2 - 75 grams Trichoderma + 1 kg of fermented azolla 2x application, T3 - 75 grams Trichoderma + 1 kg of fermented azolla 3x application, and T4 - 75 grams Trichoderma + 1 kg of fermented azolla 4x application. The parameters used to compare the four treatments were the plant height, number of leaves, bulb diameter, weight of marketable and non – marketable bulbs, and computed yield per hectare. The study found that Trichoderma and Fermented azolla application in onion cultivation significantly improved plant height, number of leaves, bulb diameter, weight of marketable bulbs and non- marketable bulbs, as well as the computed yield per hectare. Among all treatments, T3 (75 grams of Trichoderma + 1kg of fermented azolla 3x application) was found to be the most effective, yielding the best results. This </w:t>
+        <w:t xml:space="preserve">The study on the frequency of fermented azolla application on the growth and yield of onion was conducted at [REDACTED], from December 2024 to April 2025. The experiment consisted of T1 - 75 grams Trichoderma + 1 kg of fermented azolla 1x application, T2 - 75 grams Trichoderma + 1 kg of fermented azolla 2x application, T3 - 75 grams Trichoderma + 1 kg of fermented azolla 3x application, and T4 - 75 grams Trichoderma + 1 kg of fermented azolla 4x application. The parameters used to compare the four treatments were the plant height, number of leaves, bulb diameter, weight of marketable and non – marketable bulbs, and computed yield per hectare. The study found that Trichoderma and Fermented azolla application in onion cultivation significantly improved plant height, number of leaves, bulb diameter, weight of marketable bulbs and non- marketable bulbs, as well as the computed yield per hectare. Among all treatments, T3 (75 grams of Trichoderma + 1kg of fermented azolla 3x application) was found to be the most effective, yielding the best results. This </w:t>
       </w:r>
       <w:r>
         <w:rPr>
@@ -27191,7 +27191,7 @@
           <w:szCs w:val="22"/>
           <w:rtl w:val="0"/>
         </w:rPr>
-        <w:t xml:space="preserve">A sixty three (63) days study was conducted to determine the growth performance of mallard duck fed with dietary mixed ration in a barangay in Magalang, Pampanga. A total of ninety (90), 21 days old male mallard duck were used in the study. A single factor experiment in Randomized Complete Block Design (RCBD) was used in the study. Mallard ducks were randomly divided into three (3) treatments having ten (10) mallard ducks per treatment with three (3) replications. Treatment 1 - commercial feeds; Treatment 2 - 50% commercial feeds and 50% rice bran mixed with water spinach; and Treatment 3 - 50% commercial feeds and 50% rice bran mixed with golden apple snail. Data were analyzed by using Analyzed of Variance in RCBD through the Statistical Tool for Agricultural Research (STAR) application. Treatments were compared using the Least Significant Difference (LSD). The result of the study showed in the treatments that there were no significant differences observed in feed consumption, which </w:t>
+        <w:t xml:space="preserve">A sixty three (63) days study was conducted to determine the growth performance of mallard duck fed with dietary mixed ration in [REDACTED]. A total of ninety (90), 21 days old male mallard duck were used in the study. A single factor experiment in Randomized Complete Block Design (RCBD) was used in the study. Mallard ducks were randomly divided into three (3) treatments having ten (10) mallard ducks per treatment with three (3) replications. Treatment 1 - commercial feeds; Treatment 2 - 50% commercial feeds and 50% rice bran mixed with water spinach; and Treatment 3 - 50% commercial feeds and 50% rice bran mixed with golden apple snail. Data were analyzed by using Analyzed of Variance in RCBD through the Statistical Tool for Agricultural Research (STAR) application. Treatments were compared using the Least Significant Difference (LSD). The result of the study showed in the treatments that there were no significant differences observed in feed consumption, which </w:t>
       </w:r>
       <w:r>
         <w:rPr>
@@ -28133,7 +28133,7 @@
           <w:szCs w:val="22"/>
           <w:rtl w:val="0"/>
         </w:rPr>
-        <w:t xml:space="preserve">The study was conducted at a local farm in Magalang, Pampanga from April 25 to April 30, 2023 to find out the “Efficacy of Diatomaceous Earth (DE) and Neem Tree Extract (Azadirachta indica) on House Fly Larvae (Musca domestica) on Poultry Manure” where a total of nine hundred maggots (900) were used. The experiment was laid out using Complete Randomized Design (CRD) with three (3) treatments, namely, T1 –Carbonated rice hull and saw dust, T2 – Diatomaceous Earth, and T3 –Neem tree extract. The nine hundred maggots were divided into three (3) treatments at one hundred maggots (100) per treatment each treatment was replicated three (3) times with one hundred maggots (100) per replication. </w:t>
+        <w:t xml:space="preserve">The study was conducted at [REDACTED] from April 25 to April 30, 2023 to find out the “Efficacy of Diatomaceous Earth (DE) and Neem Tree Extract (Azadirachta indica) on House Fly Larvae (Musca domestica) on Poultry Manure” where a total of nine hundred maggots (900) were used. The experiment was laid out using Complete Randomized Design (CRD) with three (3) treatments, namely, T1 –Carbonated rice hull and saw dust, T2 – Diatomaceous Earth, and T3 –Neem tree extract. The nine hundred maggots were divided into three (3) treatments at one hundred maggots (100) per treatment each treatment was replicated three (3) times with one hundred maggots (100) per replication. </w:t>
       </w:r>
       <w:r>
         <w:rPr>

</xml_diff>

<commit_message>
Draft_017: use [REDACTED] markers for site anonymization in appendices
</commit_message>
<xml_diff>
--- a/thesis/003_ThesisProposal_Draft_017.docx
+++ b/thesis/003_ThesisProposal_Draft_017.docx
@@ -19056,7 +19056,7 @@
           <w:szCs w:val="22"/>
           <w:rtl w:val="0"/>
         </w:rPr>
-        <w:t xml:space="preserve">Clean water resources are essential for sustaining life, yet their scarcity and contamination pose significant global challenges, particularly in remote communities. This study addresses the pressing issue of water potability in Sitio Cananaoan, focusing on the detection of contaminants and pollutants that threaten human health. Water and soil samples were collected from the community, and heavy metal analysis was conducted to detect lead (Pb) and mercury (Hg). Microbial testing using Most Probable Number (MPN) was performed to assess the presence of bacterial coliform and Escherichia coli (E. coli) in water samples. Results revealed the presence of bacterial coliform and E. coli in both the main water source and communal water, </w:t>
+        <w:t xml:space="preserve">Clean water resources are essential for sustaining life, yet their scarcity and contamination pose significant global challenges, particularly in remote communities. This study addresses the pressing issue of water potability in [REDACTED], focusing on the detection of contaminants and pollutants that threaten human health. Water and soil samples were collected from the community, and heavy metal analysis was conducted to detect lead (Pb) and mercury (Hg). Microbial testing using Most Probable Number (MPN) was performed to assess the presence of bacterial coliform and Escherichia coli (E. coli) in water samples. Results revealed the presence of bacterial coliform and E. coli in both the main water source and communal water, </w:t>
       </w:r>
       <w:r>
         <w:rPr>
@@ -20602,7 +20602,7 @@
           <w:szCs w:val="22"/>
           <w:rtl w:val="0"/>
         </w:rPr>
-        <w:t xml:space="preserve">Currently, Central Luzon together with Calabarzon are regions that hold a pivotal position in the Philippines’ fishing industry. However, due to their adjacency to Manila Bay, which is highly polluted due to anthropogenic activities, these regions become vulnerable to bacterial infestation. Mycobacteriosis is a significant concern in cultivated milkfish, impacting both fish health and aquaculture productivity is reported in Nueva Ecija and in parts of Central Luzon. Hence, this study aimed to investigate the presence of potential (EC) mycobacterial infections in cultivated milkfish collected from fish-supplying areas of Pampanga. Using the Ziehl-Neelsen stain for acid-fast bacteria detection, along with biochemical testing methods such as the catalase test and assessing growth in the presence of the Salt Tolerance Test, revealed the presence of acid-fast bacteria in the tissues of infected milkfish, confirming the occurrence of mycobacteriosis infection [R]. Additionally, biochemical testing, specifically the catalase test, was utilized to identify the catalase enzyme activity characteristic of mycobacteria, catalase test positive shows the result of the formation of bubbles. Furthermore, the growth of mycobacteria in the presence of the Salt Tolerance Test was assessed, showing the ability of these bacteria to thrive in high-salt environments, which is crucial information for understanding their survival and spread in aquaculture settings. Overall, the combination of Ziehl-Neelsen staining, biochemical testing like the catalase test, and evaluating growth in the presence of the Salt Tolerance Test provides a comprehensive approach for diagnosing and studying mycobacteriosis in cultivated milkfish [G], offering insights that can (FP-Cap) guide effective management strategies to control the spread of this disease in aquaculture system.</w:t>
+        <w:t xml:space="preserve">Currently, Central Luzon together with Calabarzon are regions that hold a pivotal position in the Philippines’ fishing industry. However, due to their adjacency to [REDACTED], which is highly polluted due to anthropogenic activities, these regions become vulnerable to bacterial infestation. Mycobacteriosis is a significant concern in cultivated milkfish, impacting both fish health and aquaculture productivity is reported in [REDACTED] and in parts of Central Luzon. Hence, this study aimed to investigate the presence of potential (EC) mycobacterial infections in cultivated milkfish collected from fish-supplying areas of [REDACTED]. Using the Ziehl-Neelsen stain for acid-fast bacteria detection, along with biochemical testing methods such as the catalase test and assessing growth in the presence of the Salt Tolerance Test, revealed the presence of acid-fast bacteria in the tissues of infected milkfish, confirming the occurrence of mycobacteriosis infection [R]. Additionally, biochemical testing, specifically the catalase test, was utilized to identify the catalase enzyme activity characteristic of mycobacteria, catalase test positive shows the result of the formation of bubbles. Furthermore, the growth of mycobacteria in the presence of the Salt Tolerance Test was assessed, showing the ability of these bacteria to thrive in high-salt environments, which is crucial information for understanding their survival and spread in aquaculture settings. Overall, the combination of Ziehl-Neelsen staining, biochemical testing like the catalase test, and evaluating growth in the presence of the Salt Tolerance Test provides a comprehensive approach for diagnosing and studying mycobacteriosis in cultivated milkfish [G], offering insights that can (FP-Cap) guide effective management strategies to control the spread of this disease in aquaculture system.</w:t>
       </w:r>
       <w:r>
         <w:rPr>
@@ -21489,7 +21489,7 @@
           <w:szCs w:val="22"/>
           <w:rtl w:val="0"/>
         </w:rPr>
-        <w:t xml:space="preserve">Methicillin-resistant Staphylococcus aureus (MRSA) is a common and potentially (EC) severe pathogen that has developed resistance to several types of antibiotics. MRSA bacteria can (FP-Cap) survive long on surfaces and objects, including second-hand clothing (SHC). The increasing popularity of SHC or “ukay-ukay” in the Philippines, coupled with potential (EC) public health concerns associated with transmitting pathogenic bacteria, emphasized this research’s need. Thus, this study detected the presence of S. aureus and MRSA in second-hand clothing. A total of fifteen most frequently purchased second-hand clothing (i.e., blouses, tee shirts, crop tops, tank tops, and hoodie jackets) were collected from three selected stalls in Magalang, Pampanga. Bacteriological analyses demonstrated the presence of Staphylococcus species across all samples, with growth in high-salt-containing culture broth and characteristic growth on Mannitol Salt Agar (MSA). Biochemical tests revealed positive catalase and Gram-positive cocci in clusters typical of S. aureus. Antibiotic susceptibility testing indicated the presence of both methicillin-sensitive S. aureus (MSSA) and methicillin-resistant S. aureus (MRSA) strains among the collected samples, highlighting the potential (EC) public health risks associated with the handling and purchasing of second-hand clothing. This study, therefore, underscores the need for proper precautions to mitigate the spread of potentially (EC) harmful bacteria, including MRSA, on second-hand clothing. It highlights the importance of raising awareness among both vendors and consumers about the potential (EC) health risks associated with these garments.</w:t>
+        <w:t xml:space="preserve">Methicillin-resistant Staphylococcus aureus (MRSA) is a common and potentially (EC) severe pathogen that has developed resistance to several types of antibiotics. MRSA bacteria can (FP-Cap) survive long on surfaces and objects, including second-hand clothing (SHC). The increasing popularity of SHC or “ukay-ukay” in the Philippines, coupled with potential (EC) public health concerns associated with transmitting pathogenic bacteria, emphasized this research’s need. Thus, this study detected the presence of S. aureus and MRSA in second-hand clothing. A total of fifteen most frequently purchased second-hand clothing (i.e., blouses, tee shirts, crop tops, tank tops, and hoodie jackets) were collected from [REDACTED]. Bacteriological analyses demonstrated the presence of Staphylococcus species across all samples, with growth in high-salt-containing culture broth and characteristic growth on Mannitol Salt Agar (MSA). Biochemical tests revealed positive catalase and Gram-positive cocci in clusters typical of S. aureus. Antibiotic susceptibility testing indicated the presence of both methicillin-sensitive S. aureus (MSSA) and methicillin-resistant S. aureus (MRSA) strains among the collected samples, highlighting the potential (EC) public health risks associated with the handling and purchasing of second-hand clothing. This study, therefore, underscores the need for proper precautions to mitigate the spread of potentially (EC) harmful bacteria, including MRSA, on second-hand clothing. It highlights the importance of raising awareness among both vendors and consumers about the potential (EC) health risks associated with these garments.</w:t>
       </w:r>
       <w:r>
         <w:rPr>
@@ -23060,7 +23060,7 @@
           <w:szCs w:val="22"/>
           <w:rtl w:val="0"/>
         </w:rPr>
-        <w:t xml:space="preserve">The Escherichia coli and Campylobacter jejuni are two of the foodborne pathogens affecting public health around the world. A cross-sectional bacteriological study was conducted from January to February 2025 in Mexico, Pampanga. This study presents the bacteriological analysis of E. coli and C. jejuni from 12 raw buffalo milk samples from 12 vendors. Data were gathered from vendors through modified and patterned questionnaires to assess demographics and hygiene practices of vendors. </w:t>
+        <w:t xml:space="preserve">The Escherichia coli and Campylobacter jejuni are two of the foodborne pathogens affecting public health around the world. A cross-sectional bacteriological study was conducted from January to February 2025 in [REDACTED]. This study presents the bacteriological analysis of E. coli and C. jejuni from 12 raw buffalo milk samples from 12 vendors. Data were gathered from vendors through modified and patterned questionnaires to assess demographics and hygiene practices of vendors. </w:t>
       </w:r>
       <w:r>
         <w:rPr>
@@ -23427,7 +23427,7 @@
           <w:szCs w:val="22"/>
           <w:rtl w:val="0"/>
         </w:rPr>
-        <w:t xml:space="preserve">Canine heartworm (Dirofilaria immitis) infection is a significant health concern for dogs in many regions. This study investigated the association between clinical signs and microscopy/serological detection of heartworm at the Angeles City Veterinary Clinic. Canines below six months of age and those receiving annual macrocyclic lactones were excluded. A questionnaire was utilized to collect data, and 100 single step rapid test kits canine heartworm Ag (AccuVet®) were employed along with direct blood smears. However, no positive results were observed in the diagnostic tests conducted. Thus, no significant association between clinical signs and heartworm infection </w:t>
+        <w:t xml:space="preserve">Canine heartworm (Dirofilaria immitis) infection is a significant health concern for dogs in many regions. This study investigated the association between clinical signs and microscopy/serological detection of heartworm at the [REDACTED]. Canines below six months of age and those receiving annual macrocyclic lactones were excluded. A questionnaire was utilized to collect data, and 100 single step rapid test kits canine heartworm Ag (AccuVet®) were employed along with direct blood smears. However, no positive results were observed in the diagnostic tests conducted. Thus, no significant association between clinical signs and heartworm infection </w:t>
       </w:r>
       <w:r>
         <w:rPr>
@@ -24013,7 +24013,7 @@
           <w:szCs w:val="22"/>
           <w:rtl w:val="0"/>
         </w:rPr>
-        <w:t xml:space="preserve">This study was conducted to help determine the overall health of stray cats within the vicinity of Dr. Andres M. Luciano District Hospital, Magalang, Pampanga, based on their hematological profiles. All 16 cats that were captured, regardless of age and sex, were included in this study. The stray cats’ hematological profiles were compared to normal parameters to assess their health status and whether they had the </w:t>
+        <w:t xml:space="preserve">This study was conducted to help determine the overall health of stray cats within the vicinity of Dr. Andres M. Luciano [REDACTED], based on their hematological profiles. All 16 cats that were captured, regardless of age and sex, were included in this study. The stray cats’ hematological profiles were compared to normal parameters to assess their health status and whether they had the </w:t>
       </w:r>
       <w:r>
         <w:rPr>
@@ -24107,7 +24107,7 @@
           <w:szCs w:val="22"/>
           <w:rtl w:val="0"/>
         </w:rPr>
-        <w:t xml:space="preserve">The African swine fever (ASF) is an ongoing global disease of swine presenting clinical signs similar to hog cholera and causing significant socioeconomic problems. Studies on the detection of ASF virus focus on using viremic blood and lymph tissues from infected pigs at the farm level. Hence, this study aimed to detect ASF virus from suspected pork samples from meat retail stores in selected areas of Magalang, Pampanga using a survey questionnaire and molecular diagnostic methods. Profiling of meat retail vendors revealed that commercial farms and public markets were their principal sources of meat. PCR assay showed that no sample tested positive for ASF. The result of collective community and government efforts </w:t>
+        <w:t xml:space="preserve">The African swine fever (ASF) is an ongoing global disease of swine presenting clinical signs similar to hog cholera and causing significant socioeconomic problems. Studies on the detection of ASF virus focus on using viremic blood and lymph tissues from infected pigs at the farm level. Hence, this study aimed to detect ASF virus from suspected pork samples from [REDACTED] using a survey questionnaire and molecular diagnostic methods. Profiling of meat retail vendors revealed that commercial farms and public markets were their principal sources of meat. PCR assay showed that no sample tested positive for ASF. The result of collective community and government efforts </w:t>
       </w:r>
       <w:r>
         <w:rPr>
@@ -24149,7 +24149,7 @@
           <w:szCs w:val="22"/>
           <w:rtl w:val="0"/>
         </w:rPr>
-        <w:t xml:space="preserve"> be effective in preventing, controlling, and managing the spread of ASF, but it is not conclusive that ASF is not present in the municipality of Magalang. Nevertheless, it is </w:t>
+        <w:t xml:space="preserve"> be effective in preventing, controlling, and managing the spread of ASF, but it is not conclusive that ASF is not present in the municipality of [REDACTED]. Nevertheless, it is </w:t>
       </w:r>
       <w:r>
         <w:rPr>
@@ -24841,7 +24841,7 @@
           <w:szCs w:val="22"/>
           <w:rtl w:val="0"/>
         </w:rPr>
-        <w:t xml:space="preserve"> be transmitted from dogs to humans. This study determined the level of awareness among dog owners regarding canine zoonotic diseases. Specifically, it (1) determined the participants' sociodemographic profile, (2) identified their level of awareness on selected zoonotic disease such as rabies, leptospirosis, ancylostomiasis and toxocariasis, and dermatophytosis, (3) identified the primary sources of information about zoonotic diseases, and (4) determined whether there was a significant association between sociodemographic variables and awareness on zoonoses. Data gathered from a total of 86 dog owners visiting the selected veterinary clinics in Mabalacat City, Pampanga, was subjected to descriptive statistics (frequency distribution and weighted mean), while Pearson’s correlation determined association between awareness on zoonotic diseases and the sociodemographic factors. Results showed that participants were mostly 26 to 40 years old (43%), females (66.3%), college graduates (67.4%), from lower middle-income families (54.7%), had owned dogs for more than five years (46.5%), and were owners of at least one to two dogs (44.2%). </w:t>
+        <w:t xml:space="preserve"> be transmitted from dogs to humans. This study determined the level of awareness among dog owners regarding canine zoonotic diseases. Specifically, it (1) determined the participants' sociodemographic profile, (2) identified their level of awareness on selected zoonotic disease such as rabies, leptospirosis, ancylostomiasis and toxocariasis, and dermatophytosis, (3) identified the primary sources of information about zoonotic diseases, and (4) determined whether there was a significant association between sociodemographic variables and awareness on zoonoses. Data gathered from a total of 86 dog owners visiting the selected veterinary clinics in [REDACTED], was subjected to descriptive statistics (frequency distribution and weighted mean), while Pearson’s correlation determined association between awareness on zoonotic diseases and the sociodemographic factors. Results showed that participants were mostly 26 to 40 years old (43%), females (66.3%), college graduates (67.4%), from lower middle-income families (54.7%), had owned dogs for more than five years (46.5%), and were owners of at least one to two dogs (44.2%). </w:t>
       </w:r>
       <w:r>
         <w:rPr>
@@ -24978,7 +24978,7 @@
           <w:szCs w:val="22"/>
           <w:rtl w:val="0"/>
         </w:rPr>
-        <w:t xml:space="preserve">Salmonella spp. and Escherichia coli are two significant bacteria that are a source of human foodborne illness. They result from consuming meat or fish that bacteria have contaminated. The purpose of this study was to determine the anti-microbial resistance of isolated Salmonella spp. and E. coli from commercially available fish in the Pampang Public Market, Angeles City. A total of 30 whole fish, three (3) different fish in 10 different stalls were used to test Salmonella spp. and E. coli. Six (6) out of 30 samples in XLD were Salmonella spp. positive, where they exhibited red or yellow colonies with a black in the center, meanwhile three (3) out of 30 samples in EMB were E. coli positive, where they showed a metallic green sheen. In the antibiotic sensitivity testing of six (6) positive samples in Salmonella spp., four (4) showed resistance to ceftazidime (33.33%), chloramphenicol (16.67%), imipenem (16.17%), and tetracycline (83.33%). Of the three (3) positive samples, E. coli exhibited resistance to ceftazidime (33.33%), chloramphenicol (33.33%), imipenem (66.67%), and tetracycline (66.67%).</w:t>
+        <w:t xml:space="preserve">Salmonella spp. and Escherichia coli are two significant bacteria that are a source of human foodborne illness. They result from consuming meat or fish that bacteria have contaminated. The purpose of this study was to determine the anti-microbial resistance of isolated Salmonella spp. and E. coli from commercially available fish in the [REDACTED]. A total of 30 whole fish, three (3) different fish in 10 different stalls were used to test Salmonella spp. and E. coli. Six (6) out of 30 samples in XLD were Salmonella spp. positive, where they exhibited red or yellow colonies with a black in the center, meanwhile three (3) out of 30 samples in EMB were E. coli positive, where they showed a metallic green sheen. In the antibiotic sensitivity testing of six (6) positive samples in Salmonella spp., four (4) showed resistance to ceftazidime (33.33%), chloramphenicol (16.67%), imipenem (16.17%), and tetracycline (83.33%). Of the three (3) positive samples, E. coli exhibited resistance to ceftazidime (33.33%), chloramphenicol (33.33%), imipenem (66.67%), and tetracycline (66.67%).</w:t>
       </w:r>
       <w:r>
         <w:rPr>
@@ -25978,7 +25978,7 @@
           <w:szCs w:val="22"/>
           <w:rtl w:val="0"/>
         </w:rPr>
-        <w:t xml:space="preserve">The study was conducted to determine the growth and yield performance of sweet potatoes treated with seaweed extract foliar spray from December 2023 to February 2024 in Telapayong, Arayat, Pampanga. The experiment utilized a Randomized Complete Block Design (RCBD) with five treatments replicated four times. Based on the results of the study, there are significant differences in the length of vines at 60 days after planting (DAP), while other parameters showed no significant differences. These include length of vines at 30 DAP and 70 DAP, number of marketable tubers per plant, number of non-marketable tubers per plant, length of tubers per plant, weight of tubers per plant, diameter of tubers per plant, computed yield per hectare, and cost and return analysis among the seaweed extract treatments. The study found that sweet potatoes treated with different seaweed extract foliar sprays showed varying levels of growth and yield. According to the Super Bureau's VSP6, all treatments had the highest mean values across all parameters. However, the positive control had the highest mean values for vine length, weight of tubers per plant, and marketable yield per sample area. Therefore, the application of seaweed extract as a bio stimulant did not significantly enhance the growth and yield of sweet potato. However, the negative control </w:t>
+        <w:t xml:space="preserve">The study was conducted to determine the growth and yield performance of sweet potatoes treated with seaweed extract foliar spray from December 2023 to February 2024 in [REDACTED]. The experiment utilized a Randomized Complete Block Design (RCBD) with five treatments replicated four times. Based on the results of the study, there are significant differences in the length of vines at 60 days after planting (DAP), while other parameters showed no significant differences. These include length of vines at 30 DAP and 70 DAP, number of marketable tubers per plant, number of non-marketable tubers per plant, length of tubers per plant, weight of tubers per plant, diameter of tubers per plant, computed yield per hectare, and cost and return analysis among the seaweed extract treatments. The study found that sweet potatoes treated with different seaweed extract foliar sprays showed varying levels of growth and yield. According to the Super Bureau's VSP6, all treatments had the highest mean values across all parameters. However, the positive control had the highest mean values for vine length, weight of tubers per plant, and marketable yield per sample area. Therefore, the application of seaweed extract as a bio stimulant did not significantly enhance the growth and yield of sweet potato. However, the negative control </w:t>
       </w:r>
       <w:r>
         <w:rPr>
@@ -26440,7 +26440,7 @@
           <w:szCs w:val="22"/>
           <w:rtl w:val="0"/>
         </w:rPr>
-        <w:t xml:space="preserve">The study on the performance of eggplant applied with different methods of Kuhol Amino Acid Application was conducted at Lapaz , Magalang Pampanga, from December 2024 to March 2024 . The Mucho F1 eggplant variety was used as an experimental crop in the study. The experiment was laid out following Randomized Complete Block Design (RCBD) with three replications and four treatments, namely: T1 – Negative Control T2 – Foliar Application of Kuhol Amino Acid; T3 – Drenching Application of Kuhol Amino Acid; T4 – Inorganic Fertilizer (RR). Based on the results, </w:t>
+        <w:t xml:space="preserve">The study on the performance of eggplant applied with different methods of Kuhol Amino Acid Application was conducted at [REDACTED], from December 2024 to March 2024 . The Mucho F1 eggplant variety was used as an experimental crop in the study. The experiment was laid out following Randomized Complete Block Design (RCBD) with three replications and four treatments, namely: T1 – Negative Control T2 – Foliar Application of Kuhol Amino Acid; T3 – Drenching Application of Kuhol Amino Acid; T4 – Inorganic Fertilizer (RR). Based on the results, </w:t>
       </w:r>
       <w:r>
         <w:rPr>
@@ -26618,7 +26618,7 @@
           <w:szCs w:val="22"/>
           <w:rtl w:val="0"/>
         </w:rPr>
-        <w:t xml:space="preserve">A field experiment was conducted from December 2024 to January 2025 in Mitla Proper, Porac, Pampanga, to evaluate the effects of varying soaking durations in Azospirillum spp. biofertilizer on the early growth and development of sugarcane (Saccharum officinarum) setts. The study employed a Randomized Complete Block Design (RCBD) with four treatments: T1 (24-hour water soak, control), T2 (24-hour Azospirillum spp. soak), T3 (20-hour Azospirillum spp. soak), and T4 (16-hour Azospirillum spp. soak), each replicated three times. Parameters assessed included percentage of survival, root elongation rate, root area, fresh root and shoot biomass, and root-to-shoot ratio. Results indicated that the 24-hour Azospirillum spp. treatment (T2) significantly enhanced survival rates on Days 8 and 11, root elongation rate, root area, fresh root and shoot biomass, compared to the control. However, no significant differences were observed in root-to-shoot ratio among the treatments. These findings </w:t>
+        <w:t xml:space="preserve">A field experiment was conducted from December 2024 to January 2025 in [REDACTED], to evaluate the effects of varying soaking durations in Azospirillum spp. biofertilizer on the early growth and development of sugarcane (Saccharum officinarum) setts. The study employed a Randomized Complete Block Design (RCBD) with four treatments: T1 (24-hour water soak, control), T2 (24-hour Azospirillum spp. soak), T3 (20-hour Azospirillum spp. soak), and T4 (16-hour Azospirillum spp. soak), each replicated three times. Parameters assessed included percentage of survival, root elongation rate, root area, fresh root and shoot biomass, and root-to-shoot ratio. Results indicated that the 24-hour Azospirillum spp. treatment (T2) significantly enhanced survival rates on Days 8 and 11, root elongation rate, root area, fresh root and shoot biomass, compared to the control. However, no significant differences were observed in root-to-shoot ratio among the treatments. These findings </w:t>
       </w:r>
       <w:r>
         <w:rPr>
@@ -26755,7 +26755,7 @@
           <w:szCs w:val="22"/>
           <w:rtl w:val="0"/>
         </w:rPr>
-        <w:t xml:space="preserve">The field study was conducted from January 2023 to April 2023 at Parulung, Concepcion, and Tarlac to evaluate the performance of rice as supplemented with foliar fertilizer. The experimental design used is a randomized complete block design (RCBD) with three treatments replicated three times. The following treatments were used: T1: recommended rate of NPK based on soil analysis; T2: recommended rate of NPK + 19-19-19; and T3: recommended rate of NPK + 14-14-14. The results of the study revealed the following: </w:t>
+        <w:t xml:space="preserve">The field study was conducted from January 2023 to April 2023 at [REDACTED] to evaluate the performance of rice as supplemented with foliar fertilizer. The experimental design used is a randomized complete block design (RCBD) with three treatments replicated three times. The following treatments were used: T1: recommended rate of NPK based on soil analysis; T2: recommended rate of NPK + 19-19-19; and T3: recommended rate of NPK + 14-14-14. The results of the study revealed the following: </w:t>
       </w:r>
       <w:r>
         <w:rPr>
@@ -26917,7 +26917,7 @@
           <w:szCs w:val="22"/>
           <w:rtl w:val="0"/>
         </w:rPr>
-        <w:t xml:space="preserve">The field was conducted for 35 days from April 6, to May 10, 2023 in Sitio. Mapaco, Talimundoc Marimla Concepcion, and Tarlac to determine the effect of feeding para grass mixed with varying levels of Gmelina arborea on the growth performance of rabbits. The experimental design used was a randomized complete block design (RCBD) with three treatments replicated three times. The following treatments were used: T1 ([Control] 60% Para grass + 40% Concentrate Feeds), T2 (20% GA Leaves + 40% Para grass + 40% Concentrate Feeds), and T3 (30% GA Leaves + 30% Para grass + 40% Concentrate Feeds). The results of the study revealed the following: </w:t>
+        <w:t xml:space="preserve">The field was conducted for 35 days from April 6, to May 10, 2023 in [REDACTED], [REDACTED] to determine the effect of feeding para grass mixed with varying levels of Gmelina arborea on the growth performance of rabbits. The experimental design used was a randomized complete block design (RCBD) with three treatments replicated three times. The following treatments were used: T1 ([Control] 60% Para grass + 40% Concentrate Feeds), T2 (20% GA Leaves + 40% Para grass + 40% Concentrate Feeds), and T3 (30% GA Leaves + 30% Para grass + 40% Concentrate Feeds). The results of the study revealed the following: </w:t>
       </w:r>
       <w:r>
         <w:rPr>
@@ -27369,7 +27369,7 @@
           <w:szCs w:val="22"/>
           <w:rtl w:val="0"/>
         </w:rPr>
-        <w:t xml:space="preserve">The study was conducted for 30 days, from April 26, 2023, to May 25, 2023, at Marbea, Magalang, Pampanga. The study aimed to determine the average initial weight, average final weight, average gain in weight, average daily gain (ADG), average feed consumption, average feed conversion ratio (FCR), average water consumption, and cost and return of the study. The study used eighteen (18) F1 New Zealand rabbits at 2 months of age. A Completely Randomized Design (CRD) was used in the study. The rabbits were divided into 3 treatments, 2 replications, and 6 rabbits per treatment. The experimental treatments were as follows: T1 = Pure Water (Control); T2 = 5 grams of ginger powder/L of water; and T3 = 8 grams of ginger powder/L of water, which were replicated three (3) times. The statistical analysis </w:t>
+        <w:t xml:space="preserve">The study was conducted for 30 days, from April 26, 2023, to May 25, 2023, at [REDACTED]. The study aimed to determine the average initial weight, average final weight, average gain in weight, average daily gain (ADG), average feed consumption, average feed conversion ratio (FCR), average water consumption, and cost and return of the study. The study used eighteen (18) F1 New Zealand rabbits at 2 months of age. A Completely Randomized Design (CRD) was used in the study. The rabbits were divided into 3 treatments, 2 replications, and 6 rabbits per treatment. The experimental treatments were as follows: T1 = Pure Water (Control); T2 = 5 grams of ginger powder/L of water; and T3 = 8 grams of ginger powder/L of water, which were replicated three (3) times. The statistical analysis </w:t>
       </w:r>
       <w:r>
         <w:rPr>
@@ -27778,7 +27778,7 @@
           <w:szCs w:val="22"/>
           <w:rtl w:val="0"/>
         </w:rPr>
-        <w:t xml:space="preserve">This study was conducted over a 35-day period from May 10, 2023, to June 14, 2023, at Magalang, Pampanga. The present study aimed to determine the growth response of crossbred New Zealand rabbits as influenced by varying levels of fermented Madre De Agua leaves. Eighteen (18), 2 months of crossbreed New Zealand rabbits were used in the study which were divided into three (3) treatments: T1 = 70% concentrate + 30% paragrass, T2 = 70% concentrate + 20% paragrass + 10% fermented Madre De Agua, T3 = 60% concentrate + 20% paragrass + 20% fermented Madre De Agua. A Completely Randomized Design was employed, and data was analyzed through ANOVA by Statistical Tool for Agricultural Research (STAR). Statistical analysis showed that there was no significant difference but showed numerical trends among the treatments in relation to initial weight, final weight, gain in weight, average daily gain, dry matter intake, and feed conversion ratio of the experimental rabbits In conclusion, all treatments are comparable in terms of growth, </w:t>
+        <w:t xml:space="preserve">This study was conducted over a 35-day period from May 10, 2023, to June 14, 2023, at [REDACTED]. The present study aimed to determine the growth response of crossbred New Zealand rabbits as influenced by varying levels of fermented Madre De Agua leaves. Eighteen (18), 2 months of crossbreed New Zealand rabbits were used in the study which were divided into three (3) treatments: T1 = 70% concentrate + 30% paragrass, T2 = 70% concentrate + 20% paragrass + 10% fermented Madre De Agua, T3 = 60% concentrate + 20% paragrass + 20% fermented Madre De Agua. A Completely Randomized Design was employed, and data was analyzed through ANOVA by Statistical Tool for Agricultural Research (STAR). Statistical analysis showed that there was no significant difference but showed numerical trends among the treatments in relation to initial weight, final weight, gain in weight, average daily gain, dry matter intake, and feed conversion ratio of the experimental rabbits In conclusion, all treatments are comparable in terms of growth, </w:t>
       </w:r>
       <w:r>
         <w:rPr>
@@ -28311,7 +28311,7 @@
           <w:szCs w:val="22"/>
           <w:rtl w:val="0"/>
         </w:rPr>
-        <w:t xml:space="preserve">The study was conducted at Sitio Corba, San Vicente, Concepcion, Tarlac, for 35 days, from April 16 to May 20, 2023. The study was carried out to search for alternatives to protein sources. The objective of the study was to determine the growth response of F1 New Zealand white rabbits as influenced by the roughage-to-concentrate ratio. A total of eighteen (18) heads of six (6)-week-old female New Zealand White Rabbits were selected and distributed into three (3) groups, each treatment replicated thrice with 2 rabbits per replication. Results showed no significant difference (P&lt;0.05) in final weight, gain in weight, and average daily gain in all the treatment groups. The control group (T1) was fed 70% guinea grass and 30% concentrates. For T2 and T3, the guinea grass was replaced with fresh azolla on an equi-weight basis at levels of 10 and 20 percent, respectively. In conclusion, based on the results, it </w:t>
+        <w:t xml:space="preserve">The study was conducted at [REDACTED], for 35 days, from April 16 to May 20, 2023. The study was carried out to search for alternatives to protein sources. The objective of the study was to determine the growth response of F1 New Zealand white rabbits as influenced by the roughage-to-concentrate ratio. A total of eighteen (18) heads of six (6)-week-old female New Zealand White Rabbits were selected and distributed into three (3) groups, each treatment replicated thrice with 2 rabbits per replication. Results showed no significant difference (P&lt;0.05) in final weight, gain in weight, and average daily gain in all the treatment groups. The control group (T1) was fed 70% guinea grass and 30% concentrates. For T2 and T3, the guinea grass was replaced with fresh azolla on an equi-weight basis at levels of 10 and 20 percent, respectively. In conclusion, based on the results, it </w:t>
       </w:r>
       <w:r>
         <w:rPr>

</xml_diff>

<commit_message>
Draft_017: tag DO connectors and REC in Appendix C; Excel P/DO sheet
</commit_message>
<xml_diff>
--- a/thesis/003_ThesisProposal_Draft_017.docx
+++ b/thesis/003_ThesisProposal_Draft_017.docx
@@ -18540,7 +18540,7 @@
           <w:szCs w:val="22"/>
           <w:rtl w:val="0"/>
         </w:rPr>
-        <w:t xml:space="preserve">This appendix presents the 60 abstracts with all coding marks applied. Layer 1 = color highlight on hedge tokens (blue = Modal Verbs, red = Lexical Hedges, yellow = Adverbial Hedges, green = Clause-Level Hedges). Layer 2 = function label in colored text (EC = orange, P = purple, DO = teal). False positives = strikethrough + reason code in grey. Layer 3 (unhedged sites) = grey highlight + [R]/[G]/[C] bracket.</w:t>
+        <w:t xml:space="preserve">This appendix presents the 60 abstracts with all coding marks applied. Layer 1 = color highlight on hedge tokens (blue = Modal Verbs, red = Lexical Hedges, yellow = Adverbial Hedges, green = Clause-Level Hedges). Layer 2 = function label in colored text (EC = orange, P = purple, DO = teal). Discourse connectors (Hence/Thus) are tagged (DO) even when not hedges. Recommendations are tagged (FP-Rec). False positives = strikethrough + reason code in grey. Layer 3 (unhedged sites) = grey highlight + [R]/[G]/[C] bracket.</w:t>
       </w:r>
       <w:r>
         <w:rPr>
@@ -19671,7 +19671,7 @@
           <w:szCs w:val="22"/>
           <w:rtl w:val="0"/>
         </w:rPr>
-        <w:t xml:space="preserve"> be on developing and optimizing eco-bricks using a mixture of SUPs and UCO developed through trial and error. SUPs recovered from various donors from the [REDACTED] and UCO. The preliminary trials established that molding faces some difficulty with increased ratios of UCO to SUPs. Thus, in the optimization process, varying ratios of UCO was used, starting with UCO to SUPs 1:1 as treatment 1, a decreasing ratio of UCO to SUPs. At equal parts by weight of UCO and SUPs, optimization started at Treatment 1 with a 1:1 ratio. Treatments 2—5 proceeded similarly, increasing the ratio of UCO to SUPs. Density measurements, water absorption, and drop tests were all performed and observed. A self-testing protocol based on current literature was used. The density was calculated relative to mass and volume; however, the water absorption test yielded inconsistent findings. A drop test was also performed, which </w:t>
+        <w:t xml:space="preserve"> be on developing and optimizing eco-bricks using a mixture of SUPs and UCO developed through trial and error. SUPs recovered from various donors from the [REDACTED] and UCO. The preliminary trials established that molding faces some difficulty with increased ratios of UCO to SUPs. Thus (DO), in the optimization process, varying ratios of UCO was used, starting with UCO to SUPs 1:1 as treatment 1, a decreasing ratio of UCO to SUPs. At equal parts by weight of UCO and SUPs, optimization started at Treatment 1 with a 1:1 ratio. Treatments 2—5 proceeded similarly, increasing the ratio of UCO to SUPs. Density measurements, water absorption, and drop tests were all performed and observed. A self-testing protocol based on current literature was used. The density was calculated relative to mass and volume; however, the water absorption test yielded inconsistent findings. A drop test was also performed, which </w:t>
       </w:r>
       <w:r>
         <w:rPr>
@@ -19890,7 +19890,7 @@
           <w:szCs w:val="22"/>
           <w:rtl w:val="0"/>
         </w:rPr>
-        <w:t xml:space="preserve"> aimed to evaluate the embryo toxicity, lethality, and teratogenicity of Ziziphus talanai-infused nanozeolite pellets on Danio rerio was performed at the Biology and Chemistry Laboratory of Pampanga State Agricultural University from October 2023 to January 2024. Various treatments in the formulation of pellets and laboratory experiments were set up using Completely Randomized Design (CRD). The study showed that cassava starch as combined with Ziziphus talanai-infused nanozeolite at 1:9 ratio improved the water-holding capacity of derived pellets, thus making a remarkable choice as a binder. The hatching and survival of Danio rerio embryos were enhanced by 200 ppm concentration of Z. talanai-infused nanozeolite pellet suspension while demonstrating lower toxicity compared to other concentrations tested. Based on the Acute Toxicity Index, the median lethal concentration (LC₅₀) in D. rerio embryos at 96 hpf (hours post-fertilization) showed that Z. talanai-infused nanozeolite pellet at a concentration of 49.79 µg/mL falls within the ‘slightly toxic’ classification, thus demonstrating that nanozeolite enhances the delivery of compounds within Z. talanai extract. Coagulation of embryos was primarily observed within 400 ppm to 1,000 ppm concentrations of Z. talanai-infused nanozeolite pellet suspensions under 40x magnification, </w:t>
+        <w:t xml:space="preserve"> aimed to evaluate the embryo toxicity, lethality, and teratogenicity of Ziziphus talanai-infused nanozeolite pellets on Danio rerio was performed at the Biology and Chemistry Laboratory of Pampanga State Agricultural University from October 2023 to January 2024. Various treatments in the formulation of pellets and laboratory experiments were set up using Completely Randomized Design (CRD). The study showed that cassava starch as combined with Ziziphus talanai-infused nanozeolite at 1:9 ratio improved the water-holding capacity of derived pellets, thus (DO) making a remarkable choice as a binder. The hatching and survival of Danio rerio embryos were enhanced by 200 ppm concentration of Z. talanai-infused nanozeolite pellet suspension while demonstrating lower toxicity compared to other concentrations tested. Based on the Acute Toxicity Index, the median lethal concentration (LC₅₀) in D. rerio embryos at 96 hpf (hours post-fertilization) showed that Z. talanai-infused nanozeolite pellet at a concentration of 49.79 µg/mL falls within the ‘slightly toxic’ classification, thus (DO) demonstrating that nanozeolite enhances the delivery of compounds within Z. talanai extract. Coagulation of embryos was primarily observed within 400 ppm to 1,000 ppm concentrations of Z. talanai-infused nanozeolite pellet suspensions under 40x magnification, </w:t>
       </w:r>
       <w:r>
         <w:rPr>
@@ -19974,7 +19974,7 @@
           <w:szCs w:val="22"/>
           <w:rtl w:val="0"/>
         </w:rPr>
-        <w:t xml:space="preserve"> that such observation was induced by the Z. talanai-infused nanozeolite pellet suspension. Hence, the biosynthesis of Z. talanai-infused nanozeolite pellets is feasible and </w:t>
+        <w:t xml:space="preserve"> that such observation was induced by the Z. talanai-infused nanozeolite pellet suspension. Hence (DO), the biosynthesis of Z. talanai-infused nanozeolite pellets is feasible and </w:t>
       </w:r>
       <w:r>
         <w:rPr>
@@ -20425,7 +20425,7 @@
           <w:szCs w:val="22"/>
           <w:rtl w:val="0"/>
         </w:rPr>
-        <w:t xml:space="preserve">It is well recognized that heavy metals harm human health through the food chain. The danger to human health associated with consuming fish contaminated with heavy metals were assessed. This study aimed to determine the presence of lead in the flesh part of selected fish species, Common carp (Cyprinus carpio), Roho labeo (Labeo rohita), and Silver carp (Hypophthalmichthys molitrix), in addition to determine the Knowledge, Attitude, and Practices (KAP) of fishers along the Pampanga River. A test method used is Inductively Coupled Plasma — Optical Emission Spectrometry (ICP-OES) in identifying heavy metals in biota. The self-administered questionnaires were distributed to 20 respondents, questionnaires compromised of socio-demographic characteristics and the KAP’s of fishers along the Pampanga River. Data analyses were done using SPSS (version 23). Data were explored using descriptive statistics. The results show that lead in any of the selected fish, with a &lt;0.013 mg/kg result is below the FAO and WHO’s allowed limits of 2 mg/kg and 0.5 mg/kg, respectively. Based on the result from KAP Analysis, knowledge scored M=1.7200 with SD equivalent to 0.10052 which is interpreted as poor knowledge. The attitude score M=3.1150 and SD=0.093330 which means a moderate attitude and lastly, practices score M = 2.8850 and SD = .13485 which is equivalent to have good practices. Thus, the researcher provided a policy proposal to focus on issues that needed to be addressed in the community. In terms of practices, proper waste management </w:t>
+        <w:t xml:space="preserve">It is well recognized that heavy metals harm human health through the food chain. The danger to human health associated with consuming fish contaminated with heavy metals were assessed. This study aimed to determine the presence of lead in the flesh part of selected fish species, Common carp (Cyprinus carpio), Roho labeo (Labeo rohita), and Silver carp (Hypophthalmichthys molitrix), in addition to determine the Knowledge, Attitude, and Practices (KAP) of fishers along the Pampanga River. A test method used is Inductively Coupled Plasma — Optical Emission Spectrometry (ICP-OES) in identifying heavy metals in biota. The self-administered questionnaires were distributed to 20 respondents, questionnaires compromised of socio-demographic characteristics and the KAP’s of fishers along the Pampanga River. Data analyses were done using SPSS (version 23). Data were explored using descriptive statistics. The results show that lead in any of the selected fish, with a &lt;0.013 mg/kg result is below the FAO and WHO’s allowed limits of 2 mg/kg and 0.5 mg/kg, respectively. Based on the result from KAP Analysis, knowledge scored M=1.7200 with SD equivalent to 0.10052 which is interpreted as poor knowledge. The attitude score M=3.1150 and SD=0.093330 which means a moderate attitude and lastly, practices score M = 2.8850 and SD = .13485 which is equivalent to have good practices. Thus (DO), the researcher provided a policy proposal to focus on issues that needed to be addressed in the community. In terms of practices, proper waste management </w:t>
       </w:r>
       <w:r>
         <w:rPr>
@@ -20602,7 +20602,7 @@
           <w:szCs w:val="22"/>
           <w:rtl w:val="0"/>
         </w:rPr>
-        <w:t xml:space="preserve">Currently, Central Luzon together with Calabarzon are regions that hold a pivotal position in the Philippines’ fishing industry. However, due to their adjacency to [REDACTED], which is highly polluted due to anthropogenic activities, these regions become vulnerable to bacterial infestation. Mycobacteriosis is a significant concern in cultivated milkfish, impacting both fish health and aquaculture productivity is reported in [REDACTED] and in parts of Central Luzon. Hence, this study aimed to investigate the presence of potential (EC) mycobacterial infections in cultivated milkfish collected from fish-supplying areas of [REDACTED]. Using the Ziehl-Neelsen stain for acid-fast bacteria detection, along with biochemical testing methods such as the catalase test and assessing growth in the presence of the Salt Tolerance Test, revealed the presence of acid-fast bacteria in the tissues of infected milkfish, confirming the occurrence of mycobacteriosis infection [R]. Additionally, biochemical testing, specifically the catalase test, was utilized to identify the catalase enzyme activity characteristic of mycobacteria, catalase test positive shows the result of the formation of bubbles. Furthermore, the growth of mycobacteria in the presence of the Salt Tolerance Test was assessed, showing the ability of these bacteria to thrive in high-salt environments, which is crucial information for understanding their survival and spread in aquaculture settings. Overall, the combination of Ziehl-Neelsen staining, biochemical testing like the catalase test, and evaluating growth in the presence of the Salt Tolerance Test provides a comprehensive approach for diagnosing and studying mycobacteriosis in cultivated milkfish [G], offering insights that can (FP-Cap) guide effective management strategies to control the spread of this disease in aquaculture system.</w:t>
+        <w:t xml:space="preserve">Currently, Central Luzon together with Calabarzon are regions that hold a pivotal position in the Philippines’ fishing industry. However, due to their adjacency to [REDACTED], which is highly polluted due to anthropogenic activities, these regions become vulnerable to bacterial infestation. Mycobacteriosis is a significant concern in cultivated milkfish, impacting both fish health and aquaculture productivity is reported in [REDACTED] and in parts of Central Luzon. Hence (DO), this study aimed to investigate the presence of potential (EC) mycobacterial infections in cultivated milkfish collected from fish-supplying areas of [REDACTED]. Using the Ziehl-Neelsen stain for acid-fast bacteria detection, along with biochemical testing methods such as the catalase test and assessing growth in the presence of the Salt Tolerance Test, revealed the presence of acid-fast bacteria in the tissues of infected milkfish, confirming the occurrence of mycobacteriosis infection [R]. Additionally, biochemical testing, specifically the catalase test, was utilized to identify the catalase enzyme activity characteristic of mycobacteria, catalase test positive shows the result of the formation of bubbles. Furthermore, the growth of mycobacteria in the presence of the Salt Tolerance Test was assessed, showing the ability of these bacteria to thrive in high-salt environments, which is crucial information for understanding their survival and spread in aquaculture settings. Overall, the combination of Ziehl-Neelsen staining, biochemical testing like the catalase test, and evaluating growth in the presence of the Salt Tolerance Test provides a comprehensive approach for diagnosing and studying mycobacteriosis in cultivated milkfish [G], offering insights that can (FP-Cap) guide effective management strategies to control the spread of this disease in aquaculture system.</w:t>
       </w:r>
       <w:r>
         <w:rPr>
@@ -20821,7 +20821,7 @@
           <w:szCs w:val="22"/>
           <w:rtl w:val="0"/>
         </w:rPr>
-        <w:t xml:space="preserve">Antimicrobial resistance is a major threat to public health worldwide, making infections difficult to treat. This problem calls for developing novel and alternative strategies to attenuate microorganisms without inducing resistance. Hence, lactic acid bacteria (LAB) have emerged as a focal point due to their potential (EC) quorum quenching (QQ) activities. In this study, lactic acid bacteria were obtained from a parallel study, and the antimicrobial activity of the top 10 isolates was evaluated through spectrophotometric and turbidimetric analyses for the initial screening of gut isolates. Nine out of ten isolates exhibit quorum quenching activities by inhibiting the swarming motility of Pseudomonas aeruginosa [R]. The metabolic compounds of the isolates were subjected to initial characterization using enzyme and pH neutralization, which revealed that organic acids were responsible for the inhibitory activity. The inhibition activity of LAB isolates against the quorum sensing-mediated swarming motility in P. aeruginosa was due to strong antibacterial activity [R].</w:t>
+        <w:t xml:space="preserve">Antimicrobial resistance is a major threat to public health worldwide, making infections difficult to treat. This problem calls for developing novel and alternative strategies to attenuate microorganisms without inducing resistance. Hence (DO), lactic acid bacteria (LAB) have emerged as a focal point due to their potential (EC) quorum quenching (QQ) activities. In this study, lactic acid bacteria were obtained from a parallel study, and the antimicrobial activity of the top 10 isolates was evaluated through spectrophotometric and turbidimetric analyses for the initial screening of gut isolates. Nine out of ten isolates exhibit quorum quenching activities by inhibiting the swarming motility of Pseudomonas aeruginosa [R]. The metabolic compounds of the isolates were subjected to initial characterization using enzyme and pH neutralization, which revealed that organic acids were responsible for the inhibitory activity. The inhibition activity of LAB isolates against the quorum sensing-mediated swarming motility in P. aeruginosa was due to strong antibacterial activity [R].</w:t>
       </w:r>
       <w:r>
         <w:rPr>
@@ -21489,7 +21489,7 @@
           <w:szCs w:val="22"/>
           <w:rtl w:val="0"/>
         </w:rPr>
-        <w:t xml:space="preserve">Methicillin-resistant Staphylococcus aureus (MRSA) is a common and potentially (EC) severe pathogen that has developed resistance to several types of antibiotics. MRSA bacteria can (FP-Cap) survive long on surfaces and objects, including second-hand clothing (SHC). The increasing popularity of SHC or “ukay-ukay” in the Philippines, coupled with potential (EC) public health concerns associated with transmitting pathogenic bacteria, emphasized this research’s need. Thus, this study detected the presence of S. aureus and MRSA in second-hand clothing. A total of fifteen most frequently purchased second-hand clothing (i.e., blouses, tee shirts, crop tops, tank tops, and hoodie jackets) were collected from [REDACTED]. Bacteriological analyses demonstrated the presence of Staphylococcus species across all samples, with growth in high-salt-containing culture broth and characteristic growth on Mannitol Salt Agar (MSA). Biochemical tests revealed positive catalase and Gram-positive cocci in clusters typical of S. aureus. Antibiotic susceptibility testing indicated the presence of both methicillin-sensitive S. aureus (MSSA) and methicillin-resistant S. aureus (MRSA) strains among the collected samples, highlighting the potential (EC) public health risks associated with the handling and purchasing of second-hand clothing. This study, therefore, underscores the need for proper precautions to mitigate the spread of potentially (EC) harmful bacteria, including MRSA, on second-hand clothing. It highlights the importance of raising awareness among both vendors and consumers about the potential (EC) health risks associated with these garments.</w:t>
+        <w:t xml:space="preserve">Methicillin-resistant Staphylococcus aureus (MRSA) is a common and potentially (EC) severe pathogen that has developed resistance to several types of antibiotics. MRSA bacteria can (FP-Cap) survive long on surfaces and objects, including second-hand clothing (SHC). The increasing popularity of SHC or “ukay-ukay” in the Philippines, coupled with potential (EC) public health concerns associated with transmitting pathogenic bacteria, emphasized this research’s need. Thus (DO), this study detected the presence of S. aureus and MRSA in second-hand clothing. A total of fifteen most frequently purchased second-hand clothing (i.e., blouses, tee shirts, crop tops, tank tops, and hoodie jackets) were collected from [REDACTED]. Bacteriological analyses demonstrated the presence of Staphylococcus species across all samples, with growth in high-salt-containing culture broth and characteristic growth on Mannitol Salt Agar (MSA). Biochemical tests revealed positive catalase and Gram-positive cocci in clusters typical of S. aureus. Antibiotic susceptibility testing indicated the presence of both methicillin-sensitive S. aureus (MSSA) and methicillin-resistant S. aureus (MRSA) strains among the collected samples, highlighting the potential (EC) public health risks associated with the handling and purchasing of second-hand clothing. This study, therefore, underscores the need for proper precautions to mitigate the spread of potentially (EC) harmful bacteria, including MRSA, on second-hand clothing. It highlights the importance of raising awareness among both vendors and consumers about the potential (EC) health risks associated with these garments.</w:t>
       </w:r>
       <w:r>
         <w:rPr>
@@ -22188,7 +22188,7 @@
           <w:szCs w:val="22"/>
           <w:rtl w:val="0"/>
         </w:rPr>
-        <w:t xml:space="preserve">Wetlands are becoming popular as important tourist destinations due to their unique natural beauty and diverse wildlife. These vital ecosystems are at risk from the unregulated and unsustainable tourist visits that cause detrimental effects on the environment and host communities. Hence, sustainable planning and management approaches </w:t>
+        <w:t xml:space="preserve">Wetlands are becoming popular as important tourist destinations due to their unique natural beauty and diverse wildlife. These vital ecosystems are at risk from the unregulated and unsustainable tourist visits that cause detrimental effects on the environment and host communities. Hence (DO), sustainable planning and management approaches </w:t>
       </w:r>
       <w:r>
         <w:rPr>
@@ -22229,7 +22229,7 @@
           <w:szCs w:val="22"/>
           <w:rtl w:val="0"/>
         </w:rPr>
-        <w:t xml:space="preserve"> be considered. This study used Boullon’s Carrying Capacity Mathematical Model adopted from the Ecosystems Research and Development Bureau for computing the Tourism Carrying Capacity (TCC) of Sasmuan Pampanga Coastal Wetlands. Data on the parameters needed in TCC were collected through Key Informant Interviews, direct observation of the site, and a questionnaire-based survey for the tourism-related preferences and residents’ perceived impact of tourism activities. The Real Carrying Capacity per day was found to be a total of 13 boats and 156 visitors for fishing activity on the river stretch of [REDACTED], 14 visitors in the [REDACTED], while 420 visitors for aquaculture farm fishing I and 317 visitors in aquaculture farm fishing II, while 8 visitors for bangus feeding I and a total of 9 visitors for bangus feeding II. Only 5 visitors were allowed for birdwatching and 65 visitors for swimming activity. The results revealed that present visitations in these activities are still below the carrying capacity. For descriptive statistics, three-hundred fifty (350) respondents from five coastal barangays of SPCW were purposively selected. Results showed that respondents perceived tourism activities have a positive impact and equal perceptions in ecological (62.00%), economic (59.71%), social (59.71%), and visitor experiences aspects (50.86%). However, tourism activities in the area are perceived to have a negative impact on SPCW’s local facilities (54.00%). Thus, local government </w:t>
+        <w:t xml:space="preserve"> be considered. This study used Boullon’s Carrying Capacity Mathematical Model adopted from the Ecosystems Research and Development Bureau for computing the Tourism Carrying Capacity (TCC) of Sasmuan Pampanga Coastal Wetlands. Data on the parameters needed in TCC were collected through Key Informant Interviews, direct observation of the site, and a questionnaire-based survey for the tourism-related preferences and residents’ perceived impact of tourism activities. The Real Carrying Capacity per day was found to be a total of 13 boats and 156 visitors for fishing activity on the river stretch of [REDACTED], 14 visitors in the [REDACTED], while 420 visitors for aquaculture farm fishing I and 317 visitors in aquaculture farm fishing II, while 8 visitors for bangus feeding I and a total of 9 visitors for bangus feeding II. Only 5 visitors were allowed for birdwatching and 65 visitors for swimming activity. The results revealed that present visitations in these activities are still below the carrying capacity. For descriptive statistics, three-hundred fifty (350) respondents from five coastal barangays of SPCW were purposively selected. Results showed that respondents perceived tourism activities have a positive impact and equal perceptions in ecological (62.00%), economic (59.71%), social (59.71%), and visitor experiences aspects (50.86%). However, tourism activities in the area are perceived to have a negative impact on SPCW’s local facilities (54.00%). Thus (DO), local government </w:t>
       </w:r>
       <w:r>
         <w:rPr>
@@ -22406,7 +22406,7 @@
           <w:szCs w:val="22"/>
           <w:rtl w:val="0"/>
         </w:rPr>
-        <w:t xml:space="preserve"> of Trichoderma harzianum, an endophytic fungus, as a biocontrol agent for Cercospora leaf spot-on eggplants in the Philippines. Cercospora melongenae is a plant-pathogenic fungus that causes significant damage to eggplant crops, and the overuse of chemical pesticides has adverse effects on human health and the environment. As such, using alternative approaches, such as endophytic fungi, has gained attention from researchers. The study used thirty isolated leaf samples, twenty-one subcultures has been done and four different pathogenic fungi were identified. Moreover, there is an antagonistic effect of Trichoderma hazianum against the pathogenic fungi that cause disease in eggplant crops. Hence, the study aimed to investigate the antagonistic </w:t>
+        <w:t xml:space="preserve"> of Trichoderma harzianum, an endophytic fungus, as a biocontrol agent for Cercospora leaf spot-on eggplants in the Philippines. Cercospora melongenae is a plant-pathogenic fungus that causes significant damage to eggplant crops, and the overuse of chemical pesticides has adverse effects on human health and the environment. As such, using alternative approaches, such as endophytic fungi, has gained attention from researchers. The study used thirty isolated leaf samples, twenty-one subcultures has been done and four different pathogenic fungi were identified. Moreover, there is an antagonistic effect of Trichoderma hazianum against the pathogenic fungi that cause disease in eggplant crops. Hence (DO), the study aimed to investigate the antagonistic </w:t>
       </w:r>
       <w:r>
         <w:rPr>
@@ -23427,7 +23427,7 @@
           <w:szCs w:val="22"/>
           <w:rtl w:val="0"/>
         </w:rPr>
-        <w:t xml:space="preserve">Canine heartworm (Dirofilaria immitis) infection is a significant health concern for dogs in many regions. This study investigated the association between clinical signs and microscopy/serological detection of heartworm at the [REDACTED]. Canines below six months of age and those receiving annual macrocyclic lactones were excluded. A questionnaire was utilized to collect data, and 100 single step rapid test kits canine heartworm Ag (AccuVet®) were employed along with direct blood smears. However, no positive results were observed in the diagnostic tests conducted. Thus, no significant association between clinical signs and heartworm infection </w:t>
+        <w:t xml:space="preserve">Canine heartworm (Dirofilaria immitis) infection is a significant health concern for dogs in many regions. This study investigated the association between clinical signs and microscopy/serological detection of heartworm at the [REDACTED]. Canines below six months of age and those receiving annual macrocyclic lactones were excluded. A questionnaire was utilized to collect data, and 100 single step rapid test kits canine heartworm Ag (AccuVet®) were employed along with direct blood smears. However, no positive results were observed in the diagnostic tests conducted. Thus (DO), no significant association between clinical signs and heartworm infection </w:t>
       </w:r>
       <w:r>
         <w:rPr>
@@ -23699,7 +23699,7 @@
           <w:szCs w:val="22"/>
           <w:rtl w:val="0"/>
         </w:rPr>
-        <w:t xml:space="preserve">Plastic pollution has been a long-standing environmental concern due to improper waste management. Its persistence in marine environments, particularly in the form of microplastics, posed potential (EC) health risks to aquatic species and humans through seafood consumption. This study was conducted to detect microplastics in Whiteleg shrimp (Litopenaeus vannamei) sold at the [REDACTED]. A total of 10 shrimp samples per stall were collected, equating to 30 shrimps overall from the 3 stalls available. Composite sampling was applied in this study; hence, all individual shrimps from each stall were counted as one sample. The samples were separated into two treatments: Treatment 1, which consisted of the hepatopancreas and gastrointestinal tract of the shrimp, and Treatment 2, which consisted of the shrimp muscle. The samples were subjected to light microscopy and were categorized as follows: Treatment 1 Stall 1 (T1S1), Treatment 1 Stall 2 (T1S2), Treatment 1 Stall 3 (T1S3), Treatment 2 Stall 1 (T2S1), Treatment 2 Stall 2 (T2S2), and Treatment 2 Stall 3 (T2S3). Each sample was added to a 10% KOH solution for the digestion of soft tissue. Afterwards, 60% sodium iodide was used for the density separation of microplastics and undigested organic matter. The supernatant was collected using a pipette and then transferred to a slide before subjecting to a light microscope. In each slide, 10 µl of sample was placed. This was repeated five times in separate slides. A total of 181 microplastics were detected across all samples, wherein the concentration of microplastics was higher in Treatment 1 [R] (74.03%). Fragments (39.02%) were the most dominant shape, followed by fibers (23.20%), lines (17.13%), and then pellets (3.31%). The most dominant color was gray (33.15%), followed by blue (24.31%), black (11.6%), red (9.39%), clear (7.73%), brown (6.63%), violet (3.31%), yellow (3.31%), and green (0.55%). Most of the particles ranged in size from 11–50 µm (58.01%), followed by &lt;10.9 µm (29.83%), 51–100 µm (6.08%), 101–200 µm (5.52%), and &gt;201 µm (1.10%). Through random sampling, one microplastic was selected from each shape for polymer analysis using Fourier Transform Infrared Spectroscopy (FTIR). The fragment had a 97% match with high-density polyethylene, the fiber had a 90% match with an olefin copolymer, and the line sample had a 96% match with polypropylene, while the pellet sample was rejected for analysis due to its small size. To reduce microplastic pollution, the findings recommend (FP-Rec) removing the shrimp’s GIT during preparation to avoid ingestion, use fishing gear made from durable or natural materials, regularly maintain and replace worn equipment, and properly dispose of plastics instead of discarding them into water bodies.</w:t>
+        <w:t xml:space="preserve">Plastic pollution has been a long-standing environmental concern due to improper waste management. Its persistence in marine environments, particularly in the form of microplastics, posed potential (EC) health risks to aquatic species and humans through seafood consumption. This study was conducted to detect microplastics in Whiteleg shrimp (Litopenaeus vannamei) sold at the [REDACTED]. A total of 10 shrimp samples per stall were collected, equating to 30 shrimps overall from the 3 stalls available. Composite sampling was applied in this study; hence (DO), all individual shrimps from each stall were counted as one sample. The samples were separated into two treatments: Treatment 1, which consisted of the hepatopancreas and gastrointestinal tract of the shrimp, and Treatment 2, which consisted of the shrimp muscle. The samples were subjected to light microscopy and were categorized as follows: Treatment 1 Stall 1 (T1S1), Treatment 1 Stall 2 (T1S2), Treatment 1 Stall 3 (T1S3), Treatment 2 Stall 1 (T2S1), Treatment 2 Stall 2 (T2S2), and Treatment 2 Stall 3 (T2S3). Each sample was added to a 10% KOH solution for the digestion of soft tissue. Afterwards, 60% sodium iodide was used for the density separation of microplastics and undigested organic matter. The supernatant was collected using a pipette and then transferred to a slide before subjecting to a light microscope. In each slide, 10 µl of sample was placed. This was repeated five times in separate slides. A total of 181 microplastics were detected across all samples, wherein the concentration of microplastics was higher in Treatment 1 [R] (74.03%). Fragments (39.02%) were the most dominant shape, followed by fibers (23.20%), lines (17.13%), and then pellets (3.31%). The most dominant color was gray (33.15%), followed by blue (24.31%), black (11.6%), red (9.39%), clear (7.73%), brown (6.63%), violet (3.31%), yellow (3.31%), and green (0.55%). Most of the particles ranged in size from 11–50 µm (58.01%), followed by &lt;10.9 µm (29.83%), 51–100 µm (6.08%), 101–200 µm (5.52%), and &gt;201 µm (1.10%). Through random sampling, one microplastic was selected from each shape for polymer analysis using Fourier Transform Infrared Spectroscopy (FTIR). The fragment had a 97% match with high-density polyethylene, the fiber had a 90% match with an olefin copolymer, and the line sample had a 96% match with polypropylene, while the pellet sample was rejected for analysis due to its small size. To reduce microplastic pollution, the findings recommend (FP-Rec) removing the shrimp’s GIT during preparation to avoid ingestion, use fishing gear made from durable or natural materials, regularly maintain and replace worn equipment, and properly dispose of plastics instead of discarding them into water bodies.</w:t>
       </w:r>
       <w:r>
         <w:rPr>
@@ -24107,7 +24107,7 @@
           <w:szCs w:val="22"/>
           <w:rtl w:val="0"/>
         </w:rPr>
-        <w:t xml:space="preserve">The African swine fever (ASF) is an ongoing global disease of swine presenting clinical signs similar to hog cholera and causing significant socioeconomic problems. Studies on the detection of ASF virus focus on using viremic blood and lymph tissues from infected pigs at the farm level. Hence, this study aimed to detect ASF virus from suspected pork samples from [REDACTED] using a survey questionnaire and molecular diagnostic methods. Profiling of meat retail vendors revealed that commercial farms and public markets were their principal sources of meat. PCR assay showed that no sample tested positive for ASF. The result of collective community and government efforts </w:t>
+        <w:t xml:space="preserve">The African swine fever (ASF) is an ongoing global disease of swine presenting clinical signs similar to hog cholera and causing significant socioeconomic problems. Studies on the detection of ASF virus focus on using viremic blood and lymph tissues from infected pigs at the farm level. Hence (DO), this study aimed to detect ASF virus from suspected pork samples from [REDACTED] using a survey questionnaire and molecular diagnostic methods. Profiling of meat retail vendors revealed that commercial farms and public markets were their principal sources of meat. PCR assay showed that no sample tested positive for ASF. The result of collective community and government efforts </w:t>
       </w:r>
       <w:r>
         <w:rPr>

</xml_diff>

<commit_message>
Second pass: tag remaining DO (Therefore, In conclusion); P still absent
</commit_message>
<xml_diff>
--- a/thesis/003_ThesisProposal_Draft_017.docx
+++ b/thesis/003_ThesisProposal_Draft_017.docx
@@ -19755,7 +19755,7 @@
           <w:szCs w:val="22"/>
           <w:rtl w:val="0"/>
         </w:rPr>
-        <w:t xml:space="preserve">. Therefore, further research </w:t>
+        <w:t xml:space="preserve">. Therefore (DO), further research </w:t>
       </w:r>
       <w:r>
         <w:rPr>
@@ -21489,7 +21489,7 @@
           <w:szCs w:val="22"/>
           <w:rtl w:val="0"/>
         </w:rPr>
-        <w:t xml:space="preserve">Methicillin-resistant Staphylococcus aureus (MRSA) is a common and potentially (EC) severe pathogen that has developed resistance to several types of antibiotics. MRSA bacteria can (FP-Cap) survive long on surfaces and objects, including second-hand clothing (SHC). The increasing popularity of SHC or “ukay-ukay” in the Philippines, coupled with potential (EC) public health concerns associated with transmitting pathogenic bacteria, emphasized this research’s need. Thus (DO), this study detected the presence of S. aureus and MRSA in second-hand clothing. A total of fifteen most frequently purchased second-hand clothing (i.e., blouses, tee shirts, crop tops, tank tops, and hoodie jackets) were collected from [REDACTED]. Bacteriological analyses demonstrated the presence of Staphylococcus species across all samples, with growth in high-salt-containing culture broth and characteristic growth on Mannitol Salt Agar (MSA). Biochemical tests revealed positive catalase and Gram-positive cocci in clusters typical of S. aureus. Antibiotic susceptibility testing indicated the presence of both methicillin-sensitive S. aureus (MSSA) and methicillin-resistant S. aureus (MRSA) strains among the collected samples, highlighting the potential (EC) public health risks associated with the handling and purchasing of second-hand clothing. This study, therefore, underscores the need for proper precautions to mitigate the spread of potentially (EC) harmful bacteria, including MRSA, on second-hand clothing. It highlights the importance of raising awareness among both vendors and consumers about the potential (EC) health risks associated with these garments.</w:t>
+        <w:t xml:space="preserve">Methicillin-resistant Staphylococcus aureus (MRSA) is a common and potentially (EC) severe pathogen that has developed resistance to several types of antibiotics. MRSA bacteria can (FP-Cap) survive long on surfaces and objects, including second-hand clothing (SHC). The increasing popularity of SHC or “ukay-ukay” in the Philippines, coupled with potential (EC) public health concerns associated with transmitting pathogenic bacteria, emphasized this research’s need. Thus (DO), this study detected the presence of S. aureus and MRSA in second-hand clothing. A total of fifteen most frequently purchased second-hand clothing (i.e., blouses, tee shirts, crop tops, tank tops, and hoodie jackets) were collected from [REDACTED]. Bacteriological analyses demonstrated the presence of Staphylococcus species across all samples, with growth in high-salt-containing culture broth and characteristic growth on Mannitol Salt Agar (MSA). Biochemical tests revealed positive catalase and Gram-positive cocci in clusters typical of S. aureus. Antibiotic susceptibility testing indicated the presence of both methicillin-sensitive S. aureus (MSSA) and methicillin-resistant S. aureus (MRSA) strains among the collected samples, highlighting the potential (EC) public health risks associated with the handling and purchasing of second-hand clothing. This study, therefore (DO), underscores the need for proper precautions to mitigate the spread of potentially (EC) harmful bacteria, including MRSA, on second-hand clothing. It highlights the importance of raising awareness among both vendors and consumers about the potential (EC) health risks associated with these garments.</w:t>
       </w:r>
       <w:r>
         <w:rPr>
@@ -22365,7 +22365,7 @@
           <w:szCs w:val="22"/>
           <w:rtl w:val="0"/>
         </w:rPr>
-        <w:t xml:space="preserve">Many farmers have been facing many problems towards their crops. One of the common factors affecting the production of eggplant is the pathogenic diseases. The fungal disease commonly found in Eggplant (Solanum melongena) is Cercospora leaf spot, a plant-pathogenic fungus, Cercospora melongenae. Therefore, this study aims to examine the </w:t>
+        <w:t xml:space="preserve">Many farmers have been facing many problems towards their crops. One of the common factors affecting the production of eggplant is the pathogenic diseases. The fungal disease commonly found in Eggplant (Solanum melongena) is Cercospora leaf spot, a plant-pathogenic fungus, Cercospora melongenae. Therefore (DO), this study aims to examine the </w:t>
       </w:r>
       <w:r>
         <w:rPr>
@@ -25800,7 +25800,7 @@
           <w:szCs w:val="22"/>
           <w:rtl w:val="0"/>
         </w:rPr>
-        <w:t xml:space="preserve">The study was conducted at [REDACTED], from November 2022 to February 2023 to determine the effect of rooting hormones on monstera cuttings. The study used Complete Randomized Design (CRD) with four replications. The pot experiment comprised of main treatments: T1- Control (Water), T2- Aloe Vera gel, T3- Coconut water, T4- Moringa leaves extract, and T5- ANAA. Data were evaluated using Analysis of Variance (ANOVA). Based on the results of the study, different rooting hormones did not significantly influence the days to shoot emergence, number of shoots, number of leaves, number of adventitious roots, root diameter, length of the longest roots, number of rooted cuttings, and percentage of survival cuttings. Additionally, alternative rooting hormones and synthetic hormone applications had varying survival rates. The highest survival was found in ANAA, followed by control water (distilled or filtered water), coconut water, and aloe vera gel, and the lowest survival was found in moringa leaf extract. In conclusion, the number of rooted cuttings obtained by application of aloe vera gel and moringa leaf extract was comparable in percentage survival with that obtained by application of water (distilled or filtered water) on monstera cuttings. Most </w:t>
+        <w:t xml:space="preserve">The study was conducted at [REDACTED], from November 2022 to February 2023 to determine the effect of rooting hormones on monstera cuttings. The study used Complete Randomized Design (CRD) with four replications. The pot experiment comprised of main treatments: T1- Control (Water), T2- Aloe Vera gel, T3- Coconut water, T4- Moringa leaves extract, and T5- ANAA. Data were evaluated using Analysis of Variance (ANOVA). Based on the results of the study, different rooting hormones did not significantly influence the days to shoot emergence, number of shoots, number of leaves, number of adventitious roots, root diameter, length of the longest roots, number of rooted cuttings, and percentage of survival cuttings. Additionally, alternative rooting hormones and synthetic hormone applications had varying survival rates. The highest survival was found in ANAA, followed by control water (distilled or filtered water), coconut water, and aloe vera gel, and the lowest survival was found in moringa leaf extract. In conclusion (DO), the number of rooted cuttings obtained by application of aloe vera gel and moringa leaf extract was comparable in percentage survival with that obtained by application of water (distilled or filtered water) on monstera cuttings. Most </w:t>
       </w:r>
       <w:r>
         <w:rPr>
@@ -25978,7 +25978,7 @@
           <w:szCs w:val="22"/>
           <w:rtl w:val="0"/>
         </w:rPr>
-        <w:t xml:space="preserve">The study was conducted to determine the growth and yield performance of sweet potatoes treated with seaweed extract foliar spray from December 2023 to February 2024 in [REDACTED]. The experiment utilized a Randomized Complete Block Design (RCBD) with five treatments replicated four times. Based on the results of the study, there are significant differences in the length of vines at 60 days after planting (DAP), while other parameters showed no significant differences. These include length of vines at 30 DAP and 70 DAP, number of marketable tubers per plant, number of non-marketable tubers per plant, length of tubers per plant, weight of tubers per plant, diameter of tubers per plant, computed yield per hectare, and cost and return analysis among the seaweed extract treatments. The study found that sweet potatoes treated with different seaweed extract foliar sprays showed varying levels of growth and yield. According to the Super Bureau's VSP6, all treatments had the highest mean values across all parameters. However, the positive control had the highest mean values for vine length, weight of tubers per plant, and marketable yield per sample area. Therefore, the application of seaweed extract as a bio stimulant did not significantly enhance the growth and yield of sweet potato. However, the negative control </w:t>
+        <w:t xml:space="preserve">The study was conducted to determine the growth and yield performance of sweet potatoes treated with seaweed extract foliar spray from December 2023 to February 2024 in [REDACTED]. The experiment utilized a Randomized Complete Block Design (RCBD) with five treatments replicated four times. Based on the results of the study, there are significant differences in the length of vines at 60 days after planting (DAP), while other parameters showed no significant differences. These include length of vines at 30 DAP and 70 DAP, number of marketable tubers per plant, number of non-marketable tubers per plant, length of tubers per plant, weight of tubers per plant, diameter of tubers per plant, computed yield per hectare, and cost and return analysis among the seaweed extract treatments. The study found that sweet potatoes treated with different seaweed extract foliar sprays showed varying levels of growth and yield. According to the Super Bureau's VSP6, all treatments had the highest mean values across all parameters. However, the positive control had the highest mean values for vine length, weight of tubers per plant, and marketable yield per sample area. Therefore (DO), the application of seaweed extract as a bio stimulant did not significantly enhance the growth and yield of sweet potato. However, the negative control </w:t>
       </w:r>
       <w:r>
         <w:rPr>
@@ -26250,7 +26250,7 @@
           <w:szCs w:val="22"/>
           <w:rtl w:val="0"/>
         </w:rPr>
-        <w:t xml:space="preserve"> limited benefits. Throughout the study, plants in Treatments 2 and 4 exhibited more vigorous and healthier growth, with well-developed roots, expanded foliage, and stable shoot formation. The positive effects of rice hull and vermicompost were attributed to better nutrient availability, improved soil aeration, enhanced microbial activity, and more efficient moisture retention. In conclusion, the use of rice hull and vermicompost significantly enhanced the growth and survival of Adansonii. These findings highlight their </w:t>
+        <w:t xml:space="preserve"> limited benefits. Throughout the study, plants in Treatments 2 and 4 exhibited more vigorous and healthier growth, with well-developed roots, expanded foliage, and stable shoot formation. The positive effects of rice hull and vermicompost were attributed to better nutrient availability, improved soil aeration, enhanced microbial activity, and more efficient moisture retention. In conclusion (DO), the use of rice hull and vermicompost significantly enhanced the growth and survival of Adansonii. These findings highlight their </w:t>
       </w:r>
       <w:r>
         <w:rPr>
@@ -26797,7 +26797,7 @@
           <w:szCs w:val="22"/>
           <w:rtl w:val="0"/>
         </w:rPr>
-        <w:t xml:space="preserve">. No significant differences were observed in terms of the number of days from transplanting to flowering, plant height, number of unproductive tillers, length of panicle, number of filled grains, number of unfilled grains, and weight of 1,000 seeds. In conclusion, </w:t>
+        <w:t xml:space="preserve">. No significant differences were observed in terms of the number of days from transplanting to flowering, plant height, number of unproductive tillers, length of panicle, number of filled grains, number of unfilled grains, and weight of 1,000 seeds. In conclusion (DO), </w:t>
       </w:r>
       <w:r>
         <w:rPr>
@@ -27233,7 +27233,7 @@
           <w:szCs w:val="22"/>
           <w:rtl w:val="0"/>
         </w:rPr>
-        <w:t xml:space="preserve"> that treatments were comparable on parameters. However, final weight, gain in weight, average daily gain in weight and feed conversion ratio had highly significance differences at (P&lt;0.01). This indicates that ducks fed with 100% commercial feeds rice bran mixed with golden apple snail performed better in final weight, gain in weight, average daily gain in weight and feed conversion ratio. In conclusion, proved the treatment 1(100% CF) are the most efficient compared to treatment 2 where 50% commercial feeds and 50% rice bran mixed with water spinach and treatment 3 where 50% commercial feeds and 50% rice bran mixed with golden apple snail. It </w:t>
+        <w:t xml:space="preserve"> that treatments were comparable on parameters. However, final weight, gain in weight, average daily gain in weight and feed conversion ratio had highly significance differences at (P&lt;0.01). This indicates that ducks fed with 100% commercial feeds rice bran mixed with golden apple snail performed better in final weight, gain in weight, average daily gain in weight and feed conversion ratio. In conclusion (DO), proved the treatment 1(100% CF) are the most efficient compared to treatment 2 where 50% commercial feeds and 50% rice bran mixed with water spinach and treatment 3 where 50% commercial feeds and 50% rice bran mixed with golden apple snail. It </w:t>
       </w:r>
       <w:r>
         <w:rPr>
@@ -27778,7 +27778,7 @@
           <w:szCs w:val="22"/>
           <w:rtl w:val="0"/>
         </w:rPr>
-        <w:t xml:space="preserve">This study was conducted over a 35-day period from May 10, 2023, to June 14, 2023, at [REDACTED]. The present study aimed to determine the growth response of crossbred New Zealand rabbits as influenced by varying levels of fermented Madre De Agua leaves. Eighteen (18), 2 months of crossbreed New Zealand rabbits were used in the study which were divided into three (3) treatments: T1 = 70% concentrate + 30% paragrass, T2 = 70% concentrate + 20% paragrass + 10% fermented Madre De Agua, T3 = 60% concentrate + 20% paragrass + 20% fermented Madre De Agua. A Completely Randomized Design was employed, and data was analyzed through ANOVA by Statistical Tool for Agricultural Research (STAR). Statistical analysis showed that there was no significant difference but showed numerical trends among the treatments in relation to initial weight, final weight, gain in weight, average daily gain, dry matter intake, and feed conversion ratio of the experimental rabbits In conclusion, all treatments are comparable in terms of growth, </w:t>
+        <w:t xml:space="preserve">This study was conducted over a 35-day period from May 10, 2023, to June 14, 2023, at [REDACTED]. The present study aimed to determine the growth response of crossbred New Zealand rabbits as influenced by varying levels of fermented Madre De Agua leaves. Eighteen (18), 2 months of crossbreed New Zealand rabbits were used in the study which were divided into three (3) treatments: T1 = 70% concentrate + 30% paragrass, T2 = 70% concentrate + 20% paragrass + 10% fermented Madre De Agua, T3 = 60% concentrate + 20% paragrass + 20% fermented Madre De Agua. A Completely Randomized Design was employed, and data was analyzed through ANOVA by Statistical Tool for Agricultural Research (STAR). Statistical analysis showed that there was no significant difference but showed numerical trends among the treatments in relation to initial weight, final weight, gain in weight, average daily gain, dry matter intake, and feed conversion ratio of the experimental rabbits In conclusion (DO), all treatments are comparable in terms of growth, </w:t>
       </w:r>
       <w:r>
         <w:rPr>
@@ -28217,7 +28217,7 @@
           <w:szCs w:val="22"/>
           <w:rtl w:val="0"/>
         </w:rPr>
-        <w:t xml:space="preserve">. Therefore, it is </w:t>
+        <w:t xml:space="preserve">. Therefore (DO), it is </w:t>
       </w:r>
       <w:r>
         <w:rPr>
@@ -28311,7 +28311,7 @@
           <w:szCs w:val="22"/>
           <w:rtl w:val="0"/>
         </w:rPr>
-        <w:t xml:space="preserve">The study was conducted at [REDACTED], for 35 days, from April 16 to May 20, 2023. The study was carried out to search for alternatives to protein sources. The objective of the study was to determine the growth response of F1 New Zealand white rabbits as influenced by the roughage-to-concentrate ratio. A total of eighteen (18) heads of six (6)-week-old female New Zealand White Rabbits were selected and distributed into three (3) groups, each treatment replicated thrice with 2 rabbits per replication. Results showed no significant difference (P&lt;0.05) in final weight, gain in weight, and average daily gain in all the treatment groups. The control group (T1) was fed 70% guinea grass and 30% concentrates. For T2 and T3, the guinea grass was replaced with fresh azolla on an equi-weight basis at levels of 10 and 20 percent, respectively. In conclusion, based on the results, it </w:t>
+        <w:t xml:space="preserve">The study was conducted at [REDACTED], for 35 days, from April 16 to May 20, 2023. The study was carried out to search for alternatives to protein sources. The objective of the study was to determine the growth response of F1 New Zealand white rabbits as influenced by the roughage-to-concentrate ratio. A total of eighteen (18) heads of six (6)-week-old female New Zealand White Rabbits were selected and distributed into three (3) groups, each treatment replicated thrice with 2 rabbits per replication. Results showed no significant difference (P&lt;0.05) in final weight, gain in weight, and average daily gain in all the treatment groups. The control group (T1) was fed 70% guinea grass and 30% concentrates. For T2 and T3, the guinea grass was replaced with fresh azolla on an equi-weight basis at levels of 10 and 20 percent, respectively. In conclusion (DO), based on the results, it </w:t>
       </w:r>
       <w:r>
         <w:rPr>

</xml_diff>

<commit_message>
Apply teal color (00B0F0) to all DO function labels per legend
</commit_message>
<xml_diff>
--- a/thesis/003_ThesisProposal_Draft_017.docx
+++ b/thesis/003_ThesisProposal_Draft_017.docx
@@ -7812,7 +7812,34 @@
           <w:szCs w:val="22"/>
           <w:rtl w:val="0"/>
         </w:rPr>
-        <w:t>All 65 hedge tokens in the corpus served the function of Epistemic Caution (EC). No instances of Politeness/Deference (P) or Discourse Organization (DO) were identified. Table 5 presents the function distribution.</w:t>
+        <w:t xml:space="preserve">All 65 hedge tokens in the corpus served the function of Epistemic Caution (EC). No instances of Politeness/Deference (P) or Discourse Organization </w:t>
+      </w:r>
+      <w:r>
+        <w:rPr>
+          <w:rFonts w:ascii="Georgia" w:cs="Georgia" w:eastAsia="Georgia" w:hAnsi="Georgia"/>
+          <w:b w:val="0"/>
+          <w:bCs w:val="0"/>
+          <w:i w:val="0"/>
+          <w:iCs w:val="0"/>
+          <w:sz w:val="22"/>
+          <w:szCs w:val="22"/>
+          <w:rtl w:val="0"/>
+          <w:color w:val="00B0F0"/>
+        </w:rPr>
+        <w:t xml:space="preserve">(DO)</w:t>
+      </w:r>
+      <w:r>
+        <w:rPr>
+          <w:rFonts w:ascii="Georgia" w:cs="Georgia" w:eastAsia="Georgia" w:hAnsi="Georgia"/>
+          <w:b w:val="0"/>
+          <w:bCs w:val="0"/>
+          <w:i w:val="0"/>
+          <w:iCs w:val="0"/>
+          <w:sz w:val="22"/>
+          <w:szCs w:val="22"/>
+          <w:rtl w:val="0"/>
+        </w:rPr>
+        <w:t xml:space="preserve"> were identified. Table 5 presents the function distribution.</w:t>
       </w:r>
       <w:r>
         <w:rPr>
@@ -8203,7 +8230,21 @@
                 <w:szCs w:val="18"/>
                 <w:rtl w:val="0"/>
               </w:rPr>
-              <w:t xml:space="preserve">Discourse Organization (DO)</w:t>
+              <w:t xml:space="preserve">Discourse Organization </w:t>
+            </w:r>
+            <w:r>
+              <w:rPr>
+                <w:rFonts w:ascii="Georgia" w:cs="Georgia" w:eastAsia="Georgia" w:hAnsi="Georgia"/>
+                <w:b w:val="0"/>
+                <w:bCs w:val="0"/>
+                <w:i w:val="0"/>
+                <w:iCs w:val="0"/>
+                <w:sz w:val="18"/>
+                <w:szCs w:val="18"/>
+                <w:rtl w:val="0"/>
+                <w:color w:val="00B0F0"/>
+              </w:rPr>
+              <w:t xml:space="preserve">(DO)</w:t>
             </w:r>
             <w:r>
               <w:rPr>
@@ -18540,7 +18581,34 @@
           <w:szCs w:val="22"/>
           <w:rtl w:val="0"/>
         </w:rPr>
-        <w:t xml:space="preserve">This appendix presents the 60 abstracts with all coding marks applied. Layer 1 = color highlight on hedge tokens (blue = Modal Verbs, red = Lexical Hedges, yellow = Adverbial Hedges, green = Clause-Level Hedges). Layer 2 = function label in colored text (EC = orange, P = purple, DO = teal). Discourse connectors (Hence/Thus) are tagged (DO) even when not hedges. Layer 2 functions are only EC, P, and DO. False positives = strikethrough + reason code in grey (e.g. FP-Rec = recommendation, not a function). Layer 3 (unhedged sites) = grey highlight + [R]/[G]/[C] bracket.</w:t>
+        <w:t xml:space="preserve">This appendix presents the 60 abstracts with all coding marks applied. Layer 1 = color highlight on hedge tokens (blue = Modal Verbs, red = Lexical Hedges, yellow = Adverbial Hedges, green = Clause-Level Hedges). Layer 2 = function label in colored text (EC = orange, P = purple, DO = teal). Discourse connectors (Hence/Thus) are tagged </w:t>
+      </w:r>
+      <w:r>
+        <w:rPr>
+          <w:rFonts w:ascii="Georgia" w:cs="Georgia" w:eastAsia="Georgia" w:hAnsi="Georgia"/>
+          <w:b w:val="0"/>
+          <w:bCs w:val="0"/>
+          <w:i w:val="0"/>
+          <w:iCs w:val="0"/>
+          <w:sz w:val="22"/>
+          <w:szCs w:val="22"/>
+          <w:rtl w:val="0"/>
+          <w:color w:val="00B0F0"/>
+        </w:rPr>
+        <w:t xml:space="preserve">(DO)</w:t>
+      </w:r>
+      <w:r>
+        <w:rPr>
+          <w:rFonts w:ascii="Georgia" w:cs="Georgia" w:eastAsia="Georgia" w:hAnsi="Georgia"/>
+          <w:b w:val="0"/>
+          <w:bCs w:val="0"/>
+          <w:i w:val="0"/>
+          <w:iCs w:val="0"/>
+          <w:sz w:val="22"/>
+          <w:szCs w:val="22"/>
+          <w:rtl w:val="0"/>
+        </w:rPr>
+        <w:t xml:space="preserve"> even when not hedges. Layer 2 functions are only EC, P, and DO. False positives = strikethrough + reason code in grey (e.g. FP-Rec = recommendation, not a function). Layer 3 (unhedged sites) = grey highlight + [R]/[G]/[C] bracket.</w:t>
       </w:r>
       <w:r>
         <w:rPr>
@@ -19671,7 +19739,35 @@
           <w:szCs w:val="22"/>
           <w:rtl w:val="0"/>
         </w:rPr>
-        <w:t xml:space="preserve"> be on developing and optimizing eco-bricks using a mixture of SUPs and UCO developed through trial and error. SUPs recovered from various donors from the [REDACTED] and UCO. The preliminary trials established that molding faces some difficulty with increased ratios of UCO to SUPs. Thus (DO), in the optimization process, varying ratios of UCO was used, starting with UCO to SUPs 1:1 as treatment 1, a decreasing ratio of UCO to SUPs. At equal parts by weight of UCO and SUPs, optimization started at Treatment 1 with a 1:1 ratio. Treatments 2—5 proceeded similarly, increasing the ratio of UCO to SUPs. Density measurements, water absorption, and drop tests were all performed and observed. A self-testing protocol based on current literature was used. The density was calculated relative to mass and volume; however, the water absorption test yielded inconsistent findings. A drop test was also performed, which </w:t>
+        <w:t xml:space="preserve"> be on developing and optimizing eco-bricks using a mixture of SUPs and UCO developed through trial and error. SUPs recovered from various donors from the [REDACTED] and UCO. The preliminary trials established that molding faces some difficulty with increased ratios of UCO to SUPs. Thus </w:t>
+      </w:r>
+      <w:r>
+        <w:rPr>
+          <w:rFonts w:ascii="Georgia" w:cs="Georgia" w:eastAsia="Georgia" w:hAnsi="Georgia"/>
+          <w:b w:val="0"/>
+          <w:bCs w:val="0"/>
+          <w:i w:val="0"/>
+          <w:iCs w:val="0"/>
+          <w:sz w:val="22"/>
+          <w:szCs w:val="22"/>
+          <w:rtl w:val="0"/>
+          <w:color w:val="00B0F0"/>
+        </w:rPr>
+        <w:t xml:space="preserve">(DO)</w:t>
+      </w:r>
+      <w:r>
+        <w:rPr>
+          <w:rFonts w:ascii="Georgia" w:cs="Georgia" w:eastAsia="Georgia" w:hAnsi="Georgia"/>
+          <w:b w:val="0"/>
+          <w:bCs w:val="0"/>
+          <w:i w:val="0"/>
+          <w:iCs w:val="0"/>
+          <w:color w:val="000000"/>
+          <w:sz w:val="22"/>
+          <w:szCs w:val="22"/>
+          <w:rtl w:val="0"/>
+        </w:rPr>
+        <w:t xml:space="preserve">, in the optimization process, varying ratios of UCO was used, starting with UCO to SUPs 1:1 as treatment 1, a decreasing ratio of UCO to SUPs. At equal parts by weight of UCO and SUPs, optimization started at Treatment 1 with a 1:1 ratio. Treatments 2—5 proceeded similarly, increasing the ratio of UCO to SUPs. Density measurements, water absorption, and drop tests were all performed and observed. A self-testing protocol based on current literature was used. The density was calculated relative to mass and volume; however, the water absorption test yielded inconsistent findings. A drop test was also performed, which </w:t>
       </w:r>
       <w:r>
         <w:rPr>
@@ -19755,7 +19851,35 @@
           <w:szCs w:val="22"/>
           <w:rtl w:val="0"/>
         </w:rPr>
-        <w:t xml:space="preserve">. Therefore (DO), further research </w:t>
+        <w:t xml:space="preserve">. Therefore </w:t>
+      </w:r>
+      <w:r>
+        <w:rPr>
+          <w:rFonts w:ascii="Georgia" w:cs="Georgia" w:eastAsia="Georgia" w:hAnsi="Georgia"/>
+          <w:b w:val="0"/>
+          <w:bCs w:val="0"/>
+          <w:i w:val="0"/>
+          <w:iCs w:val="0"/>
+          <w:sz w:val="22"/>
+          <w:szCs w:val="22"/>
+          <w:rtl w:val="0"/>
+          <w:color w:val="00B0F0"/>
+        </w:rPr>
+        <w:t xml:space="preserve">(DO)</w:t>
+      </w:r>
+      <w:r>
+        <w:rPr>
+          <w:rFonts w:ascii="Georgia" w:cs="Georgia" w:eastAsia="Georgia" w:hAnsi="Georgia"/>
+          <w:b w:val="0"/>
+          <w:bCs w:val="0"/>
+          <w:i w:val="0"/>
+          <w:iCs w:val="0"/>
+          <w:color w:val="000000"/>
+          <w:sz w:val="22"/>
+          <w:szCs w:val="22"/>
+          <w:rtl w:val="0"/>
+        </w:rPr>
+        <w:t xml:space="preserve">, further research </w:t>
       </w:r>
       <w:r>
         <w:rPr>
@@ -19890,7 +20014,55 @@
           <w:szCs w:val="22"/>
           <w:rtl w:val="0"/>
         </w:rPr>
-        <w:t xml:space="preserve"> aimed to evaluate the embryo toxicity, lethality, and teratogenicity of Ziziphus talanai-infused nanozeolite pellets on Danio rerio was performed at the Biology and Chemistry Laboratory of Pampanga State Agricultural University from October 2023 to January 2024. Various treatments in the formulation of pellets and laboratory experiments were set up using Completely Randomized Design (CRD). The study showed that cassava starch as combined with Ziziphus talanai-infused nanozeolite at 1:9 ratio improved the water-holding capacity of derived pellets, thus (DO) making a remarkable choice as a binder. The hatching and survival of Danio rerio embryos were enhanced by 200 ppm concentration of Z. talanai-infused nanozeolite pellet suspension while demonstrating lower toxicity compared to other concentrations tested. Based on the Acute Toxicity Index, the median lethal concentration (LC₅₀) in D. rerio embryos at 96 hpf (hours post-fertilization) showed that Z. talanai-infused nanozeolite pellet at a concentration of 49.79 µg/mL falls within the ‘slightly toxic’ classification, thus (DO) demonstrating that nanozeolite enhances the delivery of compounds within Z. talanai extract. Coagulation of embryos was primarily observed within 400 ppm to 1,000 ppm concentrations of Z. talanai-infused nanozeolite pellet suspensions under 40x magnification, </w:t>
+        <w:t xml:space="preserve"> aimed to evaluate the embryo toxicity, lethality, and teratogenicity of Ziziphus talanai-infused nanozeolite pellets on Danio rerio was performed at the Biology and Chemistry Laboratory of Pampanga State Agricultural University from October 2023 to January 2024. Various treatments in the formulation of pellets and laboratory experiments were set up using Completely Randomized Design (CRD). The study showed that cassava starch as combined with Ziziphus talanai-infused nanozeolite at 1:9 ratio improved the water-holding capacity of derived pellets, thus </w:t>
+      </w:r>
+      <w:r>
+        <w:rPr>
+          <w:rFonts w:ascii="Georgia" w:cs="Georgia" w:eastAsia="Georgia" w:hAnsi="Georgia"/>
+          <w:b w:val="0"/>
+          <w:bCs w:val="0"/>
+          <w:i w:val="0"/>
+          <w:iCs w:val="0"/>
+          <w:sz w:val="22"/>
+          <w:szCs w:val="22"/>
+          <w:rtl w:val="0"/>
+          <w:color w:val="00B0F0"/>
+        </w:rPr>
+        <w:t xml:space="preserve">(DO)</w:t>
+      </w:r>
+      <w:r>
+        <w:rPr>
+          <w:rFonts w:ascii="Georgia" w:cs="Georgia" w:eastAsia="Georgia" w:hAnsi="Georgia"/>
+          <w:b w:val="0"/>
+          <w:bCs w:val="0"/>
+          <w:i w:val="0"/>
+          <w:iCs w:val="0"/>
+          <w:color w:val="000000"/>
+          <w:sz w:val="22"/>
+          <w:szCs w:val="22"/>
+          <w:rtl w:val="0"/>
+        </w:rPr>
+        <w:t xml:space="preserve"> making a remarkable choice as a binder. The hatching and survival of Danio rerio embryos were enhanced by 200 ppm concentration of Z. talanai-infused nanozeolite pellet suspension while demonstrating lower toxicity compared to other concentrations tested. Based on the Acute Toxicity Index, the median lethal concentration (LC₅₀) in D. rerio embryos at 96 hpf (hours post-fertilization) showed that Z. talanai-infused nanozeolite pellet at a concentration of 49.79 µg/mL falls within the ‘slightly toxic’ classification, thus </w:t>
+      </w:r>
+      <w:r>
+        <w:rPr>
+          <w:color w:val="00B0F0"/>
+        </w:rPr>
+        <w:t>(DO)</w:t>
+      </w:r>
+      <w:r>
+        <w:rPr>
+          <w:rFonts w:ascii="Georgia" w:cs="Georgia" w:eastAsia="Georgia" w:hAnsi="Georgia"/>
+          <w:b w:val="0"/>
+          <w:bCs w:val="0"/>
+          <w:i w:val="0"/>
+          <w:iCs w:val="0"/>
+          <w:color w:val="000000"/>
+          <w:sz w:val="22"/>
+          <w:szCs w:val="22"/>
+          <w:rtl w:val="0"/>
+        </w:rPr>
+        <w:t xml:space="preserve"> demonstrating that nanozeolite enhances the delivery of compounds within Z. talanai extract. Coagulation of embryos was primarily observed within 400 ppm to 1,000 ppm concentrations of Z. talanai-infused nanozeolite pellet suspensions under 40x magnification, </w:t>
       </w:r>
       <w:r>
         <w:rPr>
@@ -19974,7 +20146,35 @@
           <w:szCs w:val="22"/>
           <w:rtl w:val="0"/>
         </w:rPr>
-        <w:t xml:space="preserve"> that such observation was induced by the Z. talanai-infused nanozeolite pellet suspension. Hence (DO), the biosynthesis of Z. talanai-infused nanozeolite pellets is feasible and </w:t>
+        <w:t xml:space="preserve"> that such observation was induced by the Z. talanai-infused nanozeolite pellet suspension. Hence </w:t>
+      </w:r>
+      <w:r>
+        <w:rPr>
+          <w:rFonts w:ascii="Georgia" w:cs="Georgia" w:eastAsia="Georgia" w:hAnsi="Georgia"/>
+          <w:b w:val="0"/>
+          <w:bCs w:val="0"/>
+          <w:i w:val="0"/>
+          <w:iCs w:val="0"/>
+          <w:sz w:val="22"/>
+          <w:szCs w:val="22"/>
+          <w:rtl w:val="0"/>
+          <w:color w:val="00B0F0"/>
+        </w:rPr>
+        <w:t xml:space="preserve">(DO)</w:t>
+      </w:r>
+      <w:r>
+        <w:rPr>
+          <w:rFonts w:ascii="Georgia" w:cs="Georgia" w:eastAsia="Georgia" w:hAnsi="Georgia"/>
+          <w:b w:val="0"/>
+          <w:bCs w:val="0"/>
+          <w:i w:val="0"/>
+          <w:iCs w:val="0"/>
+          <w:color w:val="000000"/>
+          <w:sz w:val="22"/>
+          <w:szCs w:val="22"/>
+          <w:rtl w:val="0"/>
+        </w:rPr>
+        <w:t xml:space="preserve">, the biosynthesis of Z. talanai-infused nanozeolite pellets is feasible and </w:t>
       </w:r>
       <w:r>
         <w:rPr>
@@ -20425,7 +20625,35 @@
           <w:szCs w:val="22"/>
           <w:rtl w:val="0"/>
         </w:rPr>
-        <w:t xml:space="preserve">It is well recognized that heavy metals harm human health through the food chain. The danger to human health associated with consuming fish contaminated with heavy metals were assessed. This study aimed to determine the presence of lead in the flesh part of selected fish species, Common carp (Cyprinus carpio), Roho labeo (Labeo rohita), and Silver carp (Hypophthalmichthys molitrix), in addition to determine the Knowledge, Attitude, and Practices (KAP) of fishers along the Pampanga River. A test method used is Inductively Coupled Plasma — Optical Emission Spectrometry (ICP-OES) in identifying heavy metals in biota. The self-administered questionnaires were distributed to 20 respondents, questionnaires compromised of socio-demographic characteristics and the KAP’s of fishers along the Pampanga River. Data analyses were done using SPSS (version 23). Data were explored using descriptive statistics. The results show that lead in any of the selected fish, with a &lt;0.013 mg/kg result is below the FAO and WHO’s allowed limits of 2 mg/kg and 0.5 mg/kg, respectively. Based on the result from KAP Analysis, knowledge scored M=1.7200 with SD equivalent to 0.10052 which is interpreted as poor knowledge. The attitude score M=3.1150 and SD=0.093330 which means a moderate attitude and lastly, practices score M = 2.8850 and SD = .13485 which is equivalent to have good practices. Thus (DO), the researcher provided a policy proposal to focus on issues that needed to be addressed in the community. In terms of practices, proper waste management </w:t>
+        <w:t xml:space="preserve">It is well recognized that heavy metals harm human health through the food chain. The danger to human health associated with consuming fish contaminated with heavy metals were assessed. This study aimed to determine the presence of lead in the flesh part of selected fish species, Common carp (Cyprinus carpio), Roho labeo (Labeo rohita), and Silver carp (Hypophthalmichthys molitrix), in addition to determine the Knowledge, Attitude, and Practices (KAP) of fishers along the Pampanga River. A test method used is Inductively Coupled Plasma — Optical Emission Spectrometry (ICP-OES) in identifying heavy metals in biota. The self-administered questionnaires were distributed to 20 respondents, questionnaires compromised of socio-demographic characteristics and the KAP’s of fishers along the Pampanga River. Data analyses were done using SPSS (version 23). Data were explored using descriptive statistics. The results show that lead in any of the selected fish, with a &lt;0.013 mg/kg result is below the FAO and WHO’s allowed limits of 2 mg/kg and 0.5 mg/kg, respectively. Based on the result from KAP Analysis, knowledge scored M=1.7200 with SD equivalent to 0.10052 which is interpreted as poor knowledge. The attitude score M=3.1150 and SD=0.093330 which means a moderate attitude and lastly, practices score M = 2.8850 and SD = .13485 which is equivalent to have good practices. Thus </w:t>
+      </w:r>
+      <w:r>
+        <w:rPr>
+          <w:rFonts w:ascii="Georgia" w:cs="Georgia" w:eastAsia="Georgia" w:hAnsi="Georgia"/>
+          <w:b w:val="0"/>
+          <w:bCs w:val="0"/>
+          <w:i w:val="0"/>
+          <w:iCs w:val="0"/>
+          <w:sz w:val="22"/>
+          <w:szCs w:val="22"/>
+          <w:rtl w:val="0"/>
+          <w:color w:val="00B0F0"/>
+        </w:rPr>
+        <w:t xml:space="preserve">(DO)</w:t>
+      </w:r>
+      <w:r>
+        <w:rPr>
+          <w:rFonts w:ascii="Georgia" w:cs="Georgia" w:eastAsia="Georgia" w:hAnsi="Georgia"/>
+          <w:b w:val="0"/>
+          <w:bCs w:val="0"/>
+          <w:i w:val="0"/>
+          <w:iCs w:val="0"/>
+          <w:color w:val="000000"/>
+          <w:sz w:val="22"/>
+          <w:szCs w:val="22"/>
+          <w:rtl w:val="0"/>
+        </w:rPr>
+        <w:t xml:space="preserve">, the researcher provided a policy proposal to focus on issues that needed to be addressed in the community. In terms of practices, proper waste management </w:t>
       </w:r>
       <w:r>
         <w:rPr>
@@ -20602,7 +20830,35 @@
           <w:szCs w:val="22"/>
           <w:rtl w:val="0"/>
         </w:rPr>
-        <w:t xml:space="preserve">Currently, Central Luzon together with Calabarzon are regions that hold a pivotal position in the Philippines’ fishing industry. However, due to their adjacency to [REDACTED], which is highly polluted due to anthropogenic activities, these regions become vulnerable to bacterial infestation. Mycobacteriosis is a significant concern in cultivated milkfish, impacting both fish health and aquaculture productivity is reported in [REDACTED] and in parts of Central Luzon. Hence (DO), this study aimed to investigate the presence of potential (EC) mycobacterial infections in cultivated milkfish collected from fish-supplying areas of [REDACTED]. Using the Ziehl-Neelsen stain for acid-fast bacteria detection, along with biochemical testing methods such as the catalase test and assessing growth in the presence of the Salt Tolerance Test, revealed the presence of acid-fast bacteria in the tissues of infected milkfish, confirming the occurrence of mycobacteriosis infection [R]. Additionally, biochemical testing, specifically the catalase test, was utilized to identify the catalase enzyme activity characteristic of mycobacteria, catalase test positive shows the result of the formation of bubbles. Furthermore, the growth of mycobacteria in the presence of the Salt Tolerance Test was assessed, showing the ability of these bacteria to thrive in high-salt environments, which is crucial information for understanding their survival and spread in aquaculture settings. Overall, the combination of Ziehl-Neelsen staining, biochemical testing like the catalase test, and evaluating growth in the presence of the Salt Tolerance Test provides a comprehensive approach for diagnosing and studying mycobacteriosis in cultivated milkfish [G], offering insights that can (FP-Cap) guide effective management strategies to control the spread of this disease in aquaculture system.</w:t>
+        <w:t xml:space="preserve">Currently, Central Luzon together with Calabarzon are regions that hold a pivotal position in the Philippines’ fishing industry. However, due to their adjacency to [REDACTED], which is highly polluted due to anthropogenic activities, these regions become vulnerable to bacterial infestation. Mycobacteriosis is a significant concern in cultivated milkfish, impacting both fish health and aquaculture productivity is reported in [REDACTED] and in parts of Central Luzon. Hence </w:t>
+      </w:r>
+      <w:r>
+        <w:rPr>
+          <w:rFonts w:ascii="Georgia" w:cs="Georgia" w:eastAsia="Georgia" w:hAnsi="Georgia"/>
+          <w:b w:val="0"/>
+          <w:bCs w:val="0"/>
+          <w:i w:val="0"/>
+          <w:iCs w:val="0"/>
+          <w:sz w:val="22"/>
+          <w:szCs w:val="22"/>
+          <w:rtl w:val="0"/>
+          <w:color w:val="00B0F0"/>
+        </w:rPr>
+        <w:t xml:space="preserve">(DO)</w:t>
+      </w:r>
+      <w:r>
+        <w:rPr>
+          <w:rFonts w:ascii="Georgia" w:cs="Georgia" w:eastAsia="Georgia" w:hAnsi="Georgia"/>
+          <w:b w:val="0"/>
+          <w:bCs w:val="0"/>
+          <w:i w:val="0"/>
+          <w:iCs w:val="0"/>
+          <w:color w:val="000000"/>
+          <w:sz w:val="22"/>
+          <w:szCs w:val="22"/>
+          <w:rtl w:val="0"/>
+        </w:rPr>
+        <w:t xml:space="preserve">, this study aimed to investigate the presence of potential (EC) mycobacterial infections in cultivated milkfish collected from fish-supplying areas of [REDACTED]. Using the Ziehl-Neelsen stain for acid-fast bacteria detection, along with biochemical testing methods such as the catalase test and assessing growth in the presence of the Salt Tolerance Test, revealed the presence of acid-fast bacteria in the tissues of infected milkfish, confirming the occurrence of mycobacteriosis infection [R]. Additionally, biochemical testing, specifically the catalase test, was utilized to identify the catalase enzyme activity characteristic of mycobacteria, catalase test positive shows the result of the formation of bubbles. Furthermore, the growth of mycobacteria in the presence of the Salt Tolerance Test was assessed, showing the ability of these bacteria to thrive in high-salt environments, which is crucial information for understanding their survival and spread in aquaculture settings. Overall, the combination of Ziehl-Neelsen staining, biochemical testing like the catalase test, and evaluating growth in the presence of the Salt Tolerance Test provides a comprehensive approach for diagnosing and studying mycobacteriosis in cultivated milkfish [G], offering insights that can (FP-Cap) guide effective management strategies to control the spread of this disease in aquaculture system.</w:t>
       </w:r>
       <w:r>
         <w:rPr>
@@ -20821,7 +21077,35 @@
           <w:szCs w:val="22"/>
           <w:rtl w:val="0"/>
         </w:rPr>
-        <w:t xml:space="preserve">Antimicrobial resistance is a major threat to public health worldwide, making infections difficult to treat. This problem calls for developing novel and alternative strategies to attenuate microorganisms without inducing resistance. Hence (DO), lactic acid bacteria (LAB) have emerged as a focal point due to their potential (EC) quorum quenching (QQ) activities. In this study, lactic acid bacteria were obtained from a parallel study, and the antimicrobial activity of the top 10 isolates was evaluated through spectrophotometric and turbidimetric analyses for the initial screening of gut isolates. Nine out of ten isolates exhibit quorum quenching activities by inhibiting the swarming motility of Pseudomonas aeruginosa [R]. The metabolic compounds of the isolates were subjected to initial characterization using enzyme and pH neutralization, which revealed that organic acids were responsible for the inhibitory activity. The inhibition activity of LAB isolates against the quorum sensing-mediated swarming motility in P. aeruginosa was due to strong antibacterial activity [R].</w:t>
+        <w:t xml:space="preserve">Antimicrobial resistance is a major threat to public health worldwide, making infections difficult to treat. This problem calls for developing novel and alternative strategies to attenuate microorganisms without inducing resistance. Hence </w:t>
+      </w:r>
+      <w:r>
+        <w:rPr>
+          <w:rFonts w:ascii="Georgia" w:cs="Georgia" w:eastAsia="Georgia" w:hAnsi="Georgia"/>
+          <w:b w:val="0"/>
+          <w:bCs w:val="0"/>
+          <w:i w:val="0"/>
+          <w:iCs w:val="0"/>
+          <w:sz w:val="22"/>
+          <w:szCs w:val="22"/>
+          <w:rtl w:val="0"/>
+          <w:color w:val="00B0F0"/>
+        </w:rPr>
+        <w:t xml:space="preserve">(DO)</w:t>
+      </w:r>
+      <w:r>
+        <w:rPr>
+          <w:rFonts w:ascii="Georgia" w:cs="Georgia" w:eastAsia="Georgia" w:hAnsi="Georgia"/>
+          <w:b w:val="0"/>
+          <w:bCs w:val="0"/>
+          <w:i w:val="0"/>
+          <w:iCs w:val="0"/>
+          <w:color w:val="000000"/>
+          <w:sz w:val="22"/>
+          <w:szCs w:val="22"/>
+          <w:rtl w:val="0"/>
+        </w:rPr>
+        <w:t xml:space="preserve">, lactic acid bacteria (LAB) have emerged as a focal point due to their potential (EC) quorum quenching (QQ) activities. In this study, lactic acid bacteria were obtained from a parallel study, and the antimicrobial activity of the top 10 isolates was evaluated through spectrophotometric and turbidimetric analyses for the initial screening of gut isolates. Nine out of ten isolates exhibit quorum quenching activities by inhibiting the swarming motility of Pseudomonas aeruginosa [R]. The metabolic compounds of the isolates were subjected to initial characterization using enzyme and pH neutralization, which revealed that organic acids were responsible for the inhibitory activity. The inhibition activity of LAB isolates against the quorum sensing-mediated swarming motility in P. aeruginosa was due to strong antibacterial activity [R].</w:t>
       </w:r>
       <w:r>
         <w:rPr>
@@ -21489,7 +21773,55 @@
           <w:szCs w:val="22"/>
           <w:rtl w:val="0"/>
         </w:rPr>
-        <w:t xml:space="preserve">Methicillin-resistant Staphylococcus aureus (MRSA) is a common and potentially (EC) severe pathogen that has developed resistance to several types of antibiotics. MRSA bacteria can (FP-Cap) survive long on surfaces and objects, including second-hand clothing (SHC). The increasing popularity of SHC or “ukay-ukay” in the Philippines, coupled with potential (EC) public health concerns associated with transmitting pathogenic bacteria, emphasized this research’s need. Thus (DO), this study detected the presence of S. aureus and MRSA in second-hand clothing. A total of fifteen most frequently purchased second-hand clothing (i.e., blouses, tee shirts, crop tops, tank tops, and hoodie jackets) were collected from [REDACTED]. Bacteriological analyses demonstrated the presence of Staphylococcus species across all samples, with growth in high-salt-containing culture broth and characteristic growth on Mannitol Salt Agar (MSA). Biochemical tests revealed positive catalase and Gram-positive cocci in clusters typical of S. aureus. Antibiotic susceptibility testing indicated the presence of both methicillin-sensitive S. aureus (MSSA) and methicillin-resistant S. aureus (MRSA) strains among the collected samples, highlighting the potential (EC) public health risks associated with the handling and purchasing of second-hand clothing. This study, therefore (DO), underscores the need for proper precautions to mitigate the spread of potentially (EC) harmful bacteria, including MRSA, on second-hand clothing. It highlights the importance of raising awareness among both vendors and consumers about the potential (EC) health risks associated with these garments.</w:t>
+        <w:t xml:space="preserve">Methicillin-resistant Staphylococcus aureus (MRSA) is a common and potentially (EC) severe pathogen that has developed resistance to several types of antibiotics. MRSA bacteria can (FP-Cap) survive long on surfaces and objects, including second-hand clothing (SHC). The increasing popularity of SHC or “ukay-ukay” in the Philippines, coupled with potential (EC) public health concerns associated with transmitting pathogenic bacteria, emphasized this research’s need. Thus </w:t>
+      </w:r>
+      <w:r>
+        <w:rPr>
+          <w:rFonts w:ascii="Georgia" w:cs="Georgia" w:eastAsia="Georgia" w:hAnsi="Georgia"/>
+          <w:b w:val="0"/>
+          <w:bCs w:val="0"/>
+          <w:i w:val="0"/>
+          <w:iCs w:val="0"/>
+          <w:sz w:val="22"/>
+          <w:szCs w:val="22"/>
+          <w:rtl w:val="0"/>
+          <w:color w:val="00B0F0"/>
+        </w:rPr>
+        <w:t xml:space="preserve">(DO)</w:t>
+      </w:r>
+      <w:r>
+        <w:rPr>
+          <w:rFonts w:ascii="Georgia" w:cs="Georgia" w:eastAsia="Georgia" w:hAnsi="Georgia"/>
+          <w:b w:val="0"/>
+          <w:bCs w:val="0"/>
+          <w:i w:val="0"/>
+          <w:iCs w:val="0"/>
+          <w:color w:val="000000"/>
+          <w:sz w:val="22"/>
+          <w:szCs w:val="22"/>
+          <w:rtl w:val="0"/>
+        </w:rPr>
+        <w:t xml:space="preserve">, this study detected the presence of S. aureus and MRSA in second-hand clothing. A total of fifteen most frequently purchased second-hand clothing (i.e., blouses, tee shirts, crop tops, tank tops, and hoodie jackets) were collected from [REDACTED]. Bacteriological analyses demonstrated the presence of Staphylococcus species across all samples, with growth in high-salt-containing culture broth and characteristic growth on Mannitol Salt Agar (MSA). Biochemical tests revealed positive catalase and Gram-positive cocci in clusters typical of S. aureus. Antibiotic susceptibility testing indicated the presence of both methicillin-sensitive S. aureus (MSSA) and methicillin-resistant S. aureus (MRSA) strains among the collected samples, highlighting the potential (EC) public health risks associated with the handling and purchasing of second-hand clothing. This study, therefore </w:t>
+      </w:r>
+      <w:r>
+        <w:rPr>
+          <w:color w:val="00B0F0"/>
+        </w:rPr>
+        <w:t>(DO)</w:t>
+      </w:r>
+      <w:r>
+        <w:rPr>
+          <w:rFonts w:ascii="Georgia" w:cs="Georgia" w:eastAsia="Georgia" w:hAnsi="Georgia"/>
+          <w:b w:val="0"/>
+          <w:bCs w:val="0"/>
+          <w:i w:val="0"/>
+          <w:iCs w:val="0"/>
+          <w:color w:val="000000"/>
+          <w:sz w:val="22"/>
+          <w:szCs w:val="22"/>
+          <w:rtl w:val="0"/>
+        </w:rPr>
+        <w:t xml:space="preserve">, underscores the need for proper precautions to mitigate the spread of potentially (EC) harmful bacteria, including MRSA, on second-hand clothing. It highlights the importance of raising awareness among both vendors and consumers about the potential (EC) health risks associated with these garments.</w:t>
       </w:r>
       <w:r>
         <w:rPr>
@@ -22188,7 +22520,35 @@
           <w:szCs w:val="22"/>
           <w:rtl w:val="0"/>
         </w:rPr>
-        <w:t xml:space="preserve">Wetlands are becoming popular as important tourist destinations due to their unique natural beauty and diverse wildlife. These vital ecosystems are at risk from the unregulated and unsustainable tourist visits that cause detrimental effects on the environment and host communities. Hence (DO), sustainable planning and management approaches </w:t>
+        <w:t xml:space="preserve">Wetlands are becoming popular as important tourist destinations due to their unique natural beauty and diverse wildlife. These vital ecosystems are at risk from the unregulated and unsustainable tourist visits that cause detrimental effects on the environment and host communities. Hence </w:t>
+      </w:r>
+      <w:r>
+        <w:rPr>
+          <w:rFonts w:ascii="Georgia" w:cs="Georgia" w:eastAsia="Georgia" w:hAnsi="Georgia"/>
+          <w:b w:val="0"/>
+          <w:bCs w:val="0"/>
+          <w:i w:val="0"/>
+          <w:iCs w:val="0"/>
+          <w:sz w:val="22"/>
+          <w:szCs w:val="22"/>
+          <w:rtl w:val="0"/>
+          <w:color w:val="00B0F0"/>
+        </w:rPr>
+        <w:t xml:space="preserve">(DO)</w:t>
+      </w:r>
+      <w:r>
+        <w:rPr>
+          <w:rFonts w:ascii="Georgia" w:cs="Georgia" w:eastAsia="Georgia" w:hAnsi="Georgia"/>
+          <w:b w:val="0"/>
+          <w:bCs w:val="0"/>
+          <w:i w:val="0"/>
+          <w:iCs w:val="0"/>
+          <w:color w:val="000000"/>
+          <w:sz w:val="22"/>
+          <w:szCs w:val="22"/>
+          <w:rtl w:val="0"/>
+        </w:rPr>
+        <w:t xml:space="preserve">, sustainable planning and management approaches </w:t>
       </w:r>
       <w:r>
         <w:rPr>
@@ -22229,7 +22589,35 @@
           <w:szCs w:val="22"/>
           <w:rtl w:val="0"/>
         </w:rPr>
-        <w:t xml:space="preserve"> be considered. This study used Boullon’s Carrying Capacity Mathematical Model adopted from the Ecosystems Research and Development Bureau for computing the Tourism Carrying Capacity (TCC) of Sasmuan Pampanga Coastal Wetlands. Data on the parameters needed in TCC were collected through Key Informant Interviews, direct observation of the site, and a questionnaire-based survey for the tourism-related preferences and residents’ perceived impact of tourism activities. The Real Carrying Capacity per day was found to be a total of 13 boats and 156 visitors for fishing activity on the river stretch of [REDACTED], 14 visitors in the [REDACTED], while 420 visitors for aquaculture farm fishing I and 317 visitors in aquaculture farm fishing II, while 8 visitors for bangus feeding I and a total of 9 visitors for bangus feeding II. Only 5 visitors were allowed for birdwatching and 65 visitors for swimming activity. The results revealed that present visitations in these activities are still below the carrying capacity. For descriptive statistics, three-hundred fifty (350) respondents from five coastal barangays of SPCW were purposively selected. Results showed that respondents perceived tourism activities have a positive impact and equal perceptions in ecological (62.00%), economic (59.71%), social (59.71%), and visitor experiences aspects (50.86%). However, tourism activities in the area are perceived to have a negative impact on SPCW’s local facilities (54.00%). Thus (DO), local government </w:t>
+        <w:t xml:space="preserve"> be considered. This study used Boullon’s Carrying Capacity Mathematical Model adopted from the Ecosystems Research and Development Bureau for computing the Tourism Carrying Capacity (TCC) of Sasmuan Pampanga Coastal Wetlands. Data on the parameters needed in TCC were collected through Key Informant Interviews, direct observation of the site, and a questionnaire-based survey for the tourism-related preferences and residents’ perceived impact of tourism activities. The Real Carrying Capacity per day was found to be a total of 13 boats and 156 visitors for fishing activity on the river stretch of [REDACTED], 14 visitors in the [REDACTED], while 420 visitors for aquaculture farm fishing I and 317 visitors in aquaculture farm fishing II, while 8 visitors for bangus feeding I and a total of 9 visitors for bangus feeding II. Only 5 visitors were allowed for birdwatching and 65 visitors for swimming activity. The results revealed that present visitations in these activities are still below the carrying capacity. For descriptive statistics, three-hundred fifty (350) respondents from five coastal barangays of SPCW were purposively selected. Results showed that respondents perceived tourism activities have a positive impact and equal perceptions in ecological (62.00%), economic (59.71%), social (59.71%), and visitor experiences aspects (50.86%). However, tourism activities in the area are perceived to have a negative impact on SPCW’s local facilities (54.00%). Thus </w:t>
+      </w:r>
+      <w:r>
+        <w:rPr>
+          <w:rFonts w:ascii="Georgia" w:cs="Georgia" w:eastAsia="Georgia" w:hAnsi="Georgia"/>
+          <w:b w:val="0"/>
+          <w:bCs w:val="0"/>
+          <w:i w:val="0"/>
+          <w:iCs w:val="0"/>
+          <w:sz w:val="22"/>
+          <w:szCs w:val="22"/>
+          <w:rtl w:val="0"/>
+          <w:color w:val="00B0F0"/>
+        </w:rPr>
+        <w:t xml:space="preserve">(DO)</w:t>
+      </w:r>
+      <w:r>
+        <w:rPr>
+          <w:rFonts w:ascii="Georgia" w:cs="Georgia" w:eastAsia="Georgia" w:hAnsi="Georgia"/>
+          <w:b w:val="0"/>
+          <w:bCs w:val="0"/>
+          <w:i w:val="0"/>
+          <w:iCs w:val="0"/>
+          <w:color w:val="000000"/>
+          <w:sz w:val="22"/>
+          <w:szCs w:val="22"/>
+          <w:rtl w:val="0"/>
+        </w:rPr>
+        <w:t xml:space="preserve">, local government </w:t>
       </w:r>
       <w:r>
         <w:rPr>
@@ -22365,7 +22753,35 @@
           <w:szCs w:val="22"/>
           <w:rtl w:val="0"/>
         </w:rPr>
-        <w:t xml:space="preserve">Many farmers have been facing many problems towards their crops. One of the common factors affecting the production of eggplant is the pathogenic diseases. The fungal disease commonly found in Eggplant (Solanum melongena) is Cercospora leaf spot, a plant-pathogenic fungus, Cercospora melongenae. Therefore (DO), this study aims to examine the </w:t>
+        <w:t xml:space="preserve">Many farmers have been facing many problems towards their crops. One of the common factors affecting the production of eggplant is the pathogenic diseases. The fungal disease commonly found in Eggplant (Solanum melongena) is Cercospora leaf spot, a plant-pathogenic fungus, Cercospora melongenae. Therefore </w:t>
+      </w:r>
+      <w:r>
+        <w:rPr>
+          <w:rFonts w:ascii="Georgia" w:cs="Georgia" w:eastAsia="Georgia" w:hAnsi="Georgia"/>
+          <w:b w:val="0"/>
+          <w:bCs w:val="0"/>
+          <w:i w:val="0"/>
+          <w:iCs w:val="0"/>
+          <w:sz w:val="22"/>
+          <w:szCs w:val="22"/>
+          <w:rtl w:val="0"/>
+          <w:color w:val="00B0F0"/>
+        </w:rPr>
+        <w:t xml:space="preserve">(DO)</w:t>
+      </w:r>
+      <w:r>
+        <w:rPr>
+          <w:rFonts w:ascii="Georgia" w:cs="Georgia" w:eastAsia="Georgia" w:hAnsi="Georgia"/>
+          <w:b w:val="0"/>
+          <w:bCs w:val="0"/>
+          <w:i w:val="0"/>
+          <w:iCs w:val="0"/>
+          <w:color w:val="000000"/>
+          <w:sz w:val="22"/>
+          <w:szCs w:val="22"/>
+          <w:rtl w:val="0"/>
+        </w:rPr>
+        <w:t xml:space="preserve">, this study aims to examine the </w:t>
       </w:r>
       <w:r>
         <w:rPr>
@@ -22406,7 +22822,35 @@
           <w:szCs w:val="22"/>
           <w:rtl w:val="0"/>
         </w:rPr>
-        <w:t xml:space="preserve"> of Trichoderma harzianum, an endophytic fungus, as a biocontrol agent for Cercospora leaf spot-on eggplants in the Philippines. Cercospora melongenae is a plant-pathogenic fungus that causes significant damage to eggplant crops, and the overuse of chemical pesticides has adverse effects on human health and the environment. As such, using alternative approaches, such as endophytic fungi, has gained attention from researchers. The study used thirty isolated leaf samples, twenty-one subcultures has been done and four different pathogenic fungi were identified. Moreover, there is an antagonistic effect of Trichoderma hazianum against the pathogenic fungi that cause disease in eggplant crops. Hence (DO), the study aimed to investigate the antagonistic </w:t>
+        <w:t xml:space="preserve"> of Trichoderma harzianum, an endophytic fungus, as a biocontrol agent for Cercospora leaf spot-on eggplants in the Philippines. Cercospora melongenae is a plant-pathogenic fungus that causes significant damage to eggplant crops, and the overuse of chemical pesticides has adverse effects on human health and the environment. As such, using alternative approaches, such as endophytic fungi, has gained attention from researchers. The study used thirty isolated leaf samples, twenty-one subcultures has been done and four different pathogenic fungi were identified. Moreover, there is an antagonistic effect of Trichoderma hazianum against the pathogenic fungi that cause disease in eggplant crops. Hence </w:t>
+      </w:r>
+      <w:r>
+        <w:rPr>
+          <w:rFonts w:ascii="Georgia" w:cs="Georgia" w:eastAsia="Georgia" w:hAnsi="Georgia"/>
+          <w:b w:val="0"/>
+          <w:bCs w:val="0"/>
+          <w:i w:val="0"/>
+          <w:iCs w:val="0"/>
+          <w:sz w:val="22"/>
+          <w:szCs w:val="22"/>
+          <w:rtl w:val="0"/>
+          <w:color w:val="00B0F0"/>
+        </w:rPr>
+        <w:t xml:space="preserve">(DO)</w:t>
+      </w:r>
+      <w:r>
+        <w:rPr>
+          <w:rFonts w:ascii="Georgia" w:cs="Georgia" w:eastAsia="Georgia" w:hAnsi="Georgia"/>
+          <w:b w:val="0"/>
+          <w:bCs w:val="0"/>
+          <w:i w:val="0"/>
+          <w:iCs w:val="0"/>
+          <w:color w:val="000000"/>
+          <w:sz w:val="22"/>
+          <w:szCs w:val="22"/>
+          <w:rtl w:val="0"/>
+        </w:rPr>
+        <w:t xml:space="preserve">, the study aimed to investigate the antagonistic </w:t>
       </w:r>
       <w:r>
         <w:rPr>
@@ -23427,7 +23871,35 @@
           <w:szCs w:val="22"/>
           <w:rtl w:val="0"/>
         </w:rPr>
-        <w:t xml:space="preserve">Canine heartworm (Dirofilaria immitis) infection is a significant health concern for dogs in many regions. This study investigated the association between clinical signs and microscopy/serological detection of heartworm at the [REDACTED]. Canines below six months of age and those receiving annual macrocyclic lactones were excluded. A questionnaire was utilized to collect data, and 100 single step rapid test kits canine heartworm Ag (AccuVet®) were employed along with direct blood smears. However, no positive results were observed in the diagnostic tests conducted. Thus (DO), no significant association between clinical signs and heartworm infection </w:t>
+        <w:t xml:space="preserve">Canine heartworm (Dirofilaria immitis) infection is a significant health concern for dogs in many regions. This study investigated the association between clinical signs and microscopy/serological detection of heartworm at the [REDACTED]. Canines below six months of age and those receiving annual macrocyclic lactones were excluded. A questionnaire was utilized to collect data, and 100 single step rapid test kits canine heartworm Ag (AccuVet®) were employed along with direct blood smears. However, no positive results were observed in the diagnostic tests conducted. Thus </w:t>
+      </w:r>
+      <w:r>
+        <w:rPr>
+          <w:rFonts w:ascii="Georgia" w:cs="Georgia" w:eastAsia="Georgia" w:hAnsi="Georgia"/>
+          <w:b w:val="0"/>
+          <w:bCs w:val="0"/>
+          <w:i w:val="0"/>
+          <w:iCs w:val="0"/>
+          <w:sz w:val="22"/>
+          <w:szCs w:val="22"/>
+          <w:rtl w:val="0"/>
+          <w:color w:val="00B0F0"/>
+        </w:rPr>
+        <w:t xml:space="preserve">(DO)</w:t>
+      </w:r>
+      <w:r>
+        <w:rPr>
+          <w:rFonts w:ascii="Georgia" w:cs="Georgia" w:eastAsia="Georgia" w:hAnsi="Georgia"/>
+          <w:b w:val="0"/>
+          <w:bCs w:val="0"/>
+          <w:i w:val="0"/>
+          <w:iCs w:val="0"/>
+          <w:color w:val="000000"/>
+          <w:sz w:val="22"/>
+          <w:szCs w:val="22"/>
+          <w:rtl w:val="0"/>
+        </w:rPr>
+        <w:t xml:space="preserve">, no significant association between clinical signs and heartworm infection </w:t>
       </w:r>
       <w:r>
         <w:rPr>
@@ -23699,7 +24171,35 @@
           <w:szCs w:val="22"/>
           <w:rtl w:val="0"/>
         </w:rPr>
-        <w:t xml:space="preserve">Plastic pollution has been a long-standing environmental concern due to improper waste management. Its persistence in marine environments, particularly in the form of microplastics, posed potential (EC) health risks to aquatic species and humans through seafood consumption. This study was conducted to detect microplastics in Whiteleg shrimp (Litopenaeus vannamei) sold at the [REDACTED]. A total of 10 shrimp samples per stall were collected, equating to 30 shrimps overall from the 3 stalls available. Composite sampling was applied in this study; hence (DO), all individual shrimps from each stall were counted as one sample. The samples were separated into two treatments: Treatment 1, which consisted of the hepatopancreas and gastrointestinal tract of the shrimp, and Treatment 2, which consisted of the shrimp muscle. The samples were subjected to light microscopy and were categorized as follows: Treatment 1 Stall 1 (T1S1), Treatment 1 Stall 2 (T1S2), Treatment 1 Stall 3 (T1S3), Treatment 2 Stall 1 (T2S1), Treatment 2 Stall 2 (T2S2), and Treatment 2 Stall 3 (T2S3). Each sample was added to a 10% KOH solution for the digestion of soft tissue. Afterwards, 60% sodium iodide was used for the density separation of microplastics and undigested organic matter. The supernatant was collected using a pipette and then transferred to a slide before subjecting to a light microscope. In each slide, 10 µl of sample was placed. This was repeated five times in separate slides. A total of 181 microplastics were detected across all samples, wherein the concentration of microplastics was higher in Treatment 1 [R] (74.03%). Fragments (39.02%) were the most dominant shape, followed by fibers (23.20%), lines (17.13%), and then pellets (3.31%). The most dominant color was gray (33.15%), followed by blue (24.31%), black (11.6%), red (9.39%), clear (7.73%), brown (6.63%), violet (3.31%), yellow (3.31%), and green (0.55%). Most of the particles ranged in size from 11–50 µm (58.01%), followed by &lt;10.9 µm (29.83%), 51–100 µm (6.08%), 101–200 µm (5.52%), and &gt;201 µm (1.10%). Through random sampling, one microplastic was selected from each shape for polymer analysis using Fourier Transform Infrared Spectroscopy (FTIR). The fragment had a 97% match with high-density polyethylene, the fiber had a 90% match with an olefin copolymer, and the line sample had a 96% match with polypropylene, while the pellet sample was rejected for analysis due to its small size. To reduce microplastic pollution, the findings recommend (FP-Rec) removing the shrimp’s GIT during preparation to avoid ingestion, use fishing gear made from durable or natural materials, regularly maintain and replace worn equipment, and properly dispose of plastics instead of discarding them into water bodies.</w:t>
+        <w:t xml:space="preserve">Plastic pollution has been a long-standing environmental concern due to improper waste management. Its persistence in marine environments, particularly in the form of microplastics, posed potential (EC) health risks to aquatic species and humans through seafood consumption. This study was conducted to detect microplastics in Whiteleg shrimp (Litopenaeus vannamei) sold at the [REDACTED]. A total of 10 shrimp samples per stall were collected, equating to 30 shrimps overall from the 3 stalls available. Composite sampling was applied in this study; hence </w:t>
+      </w:r>
+      <w:r>
+        <w:rPr>
+          <w:rFonts w:ascii="Georgia" w:cs="Georgia" w:eastAsia="Georgia" w:hAnsi="Georgia"/>
+          <w:b w:val="0"/>
+          <w:bCs w:val="0"/>
+          <w:i w:val="0"/>
+          <w:iCs w:val="0"/>
+          <w:sz w:val="22"/>
+          <w:szCs w:val="22"/>
+          <w:rtl w:val="0"/>
+          <w:color w:val="00B0F0"/>
+        </w:rPr>
+        <w:t xml:space="preserve">(DO)</w:t>
+      </w:r>
+      <w:r>
+        <w:rPr>
+          <w:rFonts w:ascii="Georgia" w:cs="Georgia" w:eastAsia="Georgia" w:hAnsi="Georgia"/>
+          <w:b w:val="0"/>
+          <w:bCs w:val="0"/>
+          <w:i w:val="0"/>
+          <w:iCs w:val="0"/>
+          <w:color w:val="000000"/>
+          <w:sz w:val="22"/>
+          <w:szCs w:val="22"/>
+          <w:rtl w:val="0"/>
+        </w:rPr>
+        <w:t xml:space="preserve">, all individual shrimps from each stall were counted as one sample. The samples were separated into two treatments: Treatment 1, which consisted of the hepatopancreas and gastrointestinal tract of the shrimp, and Treatment 2, which consisted of the shrimp muscle. The samples were subjected to light microscopy and were categorized as follows: Treatment 1 Stall 1 (T1S1), Treatment 1 Stall 2 (T1S2), Treatment 1 Stall 3 (T1S3), Treatment 2 Stall 1 (T2S1), Treatment 2 Stall 2 (T2S2), and Treatment 2 Stall 3 (T2S3). Each sample was added to a 10% KOH solution for the digestion of soft tissue. Afterwards, 60% sodium iodide was used for the density separation of microplastics and undigested organic matter. The supernatant was collected using a pipette and then transferred to a slide before subjecting to a light microscope. In each slide, 10 µl of sample was placed. This was repeated five times in separate slides. A total of 181 microplastics were detected across all samples, wherein the concentration of microplastics was higher in Treatment 1 [R] (74.03%). Fragments (39.02%) were the most dominant shape, followed by fibers (23.20%), lines (17.13%), and then pellets (3.31%). The most dominant color was gray (33.15%), followed by blue (24.31%), black (11.6%), red (9.39%), clear (7.73%), brown (6.63%), violet (3.31%), yellow (3.31%), and green (0.55%). Most of the particles ranged in size from 11–50 µm (58.01%), followed by &lt;10.9 µm (29.83%), 51–100 µm (6.08%), 101–200 µm (5.52%), and &gt;201 µm (1.10%). Through random sampling, one microplastic was selected from each shape for polymer analysis using Fourier Transform Infrared Spectroscopy (FTIR). The fragment had a 97% match with high-density polyethylene, the fiber had a 90% match with an olefin copolymer, and the line sample had a 96% match with polypropylene, while the pellet sample was rejected for analysis due to its small size. To reduce microplastic pollution, the findings recommend (FP-Rec) removing the shrimp’s GIT during preparation to avoid ingestion, use fishing gear made from durable or natural materials, regularly maintain and replace worn equipment, and properly dispose of plastics instead of discarding them into water bodies.</w:t>
       </w:r>
       <w:r>
         <w:rPr>
@@ -24107,7 +24607,35 @@
           <w:szCs w:val="22"/>
           <w:rtl w:val="0"/>
         </w:rPr>
-        <w:t xml:space="preserve">The African swine fever (ASF) is an ongoing global disease of swine presenting clinical signs similar to hog cholera and causing significant socioeconomic problems. Studies on the detection of ASF virus focus on using viremic blood and lymph tissues from infected pigs at the farm level. Hence (DO), this study aimed to detect ASF virus from suspected pork samples from [REDACTED] using a survey questionnaire and molecular diagnostic methods. Profiling of meat retail vendors revealed that commercial farms and public markets were their principal sources of meat. PCR assay showed that no sample tested positive for ASF. The result of collective community and government efforts </w:t>
+        <w:t xml:space="preserve">The African swine fever (ASF) is an ongoing global disease of swine presenting clinical signs similar to hog cholera and causing significant socioeconomic problems. Studies on the detection of ASF virus focus on using viremic blood and lymph tissues from infected pigs at the farm level. Hence </w:t>
+      </w:r>
+      <w:r>
+        <w:rPr>
+          <w:rFonts w:ascii="Georgia" w:cs="Georgia" w:eastAsia="Georgia" w:hAnsi="Georgia"/>
+          <w:b w:val="0"/>
+          <w:bCs w:val="0"/>
+          <w:i w:val="0"/>
+          <w:iCs w:val="0"/>
+          <w:sz w:val="22"/>
+          <w:szCs w:val="22"/>
+          <w:rtl w:val="0"/>
+          <w:color w:val="00B0F0"/>
+        </w:rPr>
+        <w:t xml:space="preserve">(DO)</w:t>
+      </w:r>
+      <w:r>
+        <w:rPr>
+          <w:rFonts w:ascii="Georgia" w:cs="Georgia" w:eastAsia="Georgia" w:hAnsi="Georgia"/>
+          <w:b w:val="0"/>
+          <w:bCs w:val="0"/>
+          <w:i w:val="0"/>
+          <w:iCs w:val="0"/>
+          <w:color w:val="000000"/>
+          <w:sz w:val="22"/>
+          <w:szCs w:val="22"/>
+          <w:rtl w:val="0"/>
+        </w:rPr>
+        <w:t xml:space="preserve">, this study aimed to detect ASF virus from suspected pork samples from [REDACTED] using a survey questionnaire and molecular diagnostic methods. Profiling of meat retail vendors revealed that commercial farms and public markets were their principal sources of meat. PCR assay showed that no sample tested positive for ASF. The result of collective community and government efforts </w:t>
       </w:r>
       <w:r>
         <w:rPr>
@@ -25800,7 +26328,35 @@
           <w:szCs w:val="22"/>
           <w:rtl w:val="0"/>
         </w:rPr>
-        <w:t xml:space="preserve">The study was conducted at [REDACTED], from November 2022 to February 2023 to determine the effect of rooting hormones on monstera cuttings. The study used Complete Randomized Design (CRD) with four replications. The pot experiment comprised of main treatments: T1- Control (Water), T2- Aloe Vera gel, T3- Coconut water, T4- Moringa leaves extract, and T5- ANAA. Data were evaluated using Analysis of Variance (ANOVA). Based on the results of the study, different rooting hormones did not significantly influence the days to shoot emergence, number of shoots, number of leaves, number of adventitious roots, root diameter, length of the longest roots, number of rooted cuttings, and percentage of survival cuttings. Additionally, alternative rooting hormones and synthetic hormone applications had varying survival rates. The highest survival was found in ANAA, followed by control water (distilled or filtered water), coconut water, and aloe vera gel, and the lowest survival was found in moringa leaf extract. In conclusion (DO), the number of rooted cuttings obtained by application of aloe vera gel and moringa leaf extract was comparable in percentage survival with that obtained by application of water (distilled or filtered water) on monstera cuttings. Most </w:t>
+        <w:t xml:space="preserve">The study was conducted at [REDACTED], from November 2022 to February 2023 to determine the effect of rooting hormones on monstera cuttings. The study used Complete Randomized Design (CRD) with four replications. The pot experiment comprised of main treatments: T1- Control (Water), T2- Aloe Vera gel, T3- Coconut water, T4- Moringa leaves extract, and T5- ANAA. Data were evaluated using Analysis of Variance (ANOVA). Based on the results of the study, different rooting hormones did not significantly influence the days to shoot emergence, number of shoots, number of leaves, number of adventitious roots, root diameter, length of the longest roots, number of rooted cuttings, and percentage of survival cuttings. Additionally, alternative rooting hormones and synthetic hormone applications had varying survival rates. The highest survival was found in ANAA, followed by control water (distilled or filtered water), coconut water, and aloe vera gel, and the lowest survival was found in moringa leaf extract. In conclusion </w:t>
+      </w:r>
+      <w:r>
+        <w:rPr>
+          <w:rFonts w:ascii="Georgia" w:cs="Georgia" w:eastAsia="Georgia" w:hAnsi="Georgia"/>
+          <w:b w:val="0"/>
+          <w:bCs w:val="0"/>
+          <w:i w:val="0"/>
+          <w:iCs w:val="0"/>
+          <w:sz w:val="22"/>
+          <w:szCs w:val="22"/>
+          <w:rtl w:val="0"/>
+          <w:color w:val="00B0F0"/>
+        </w:rPr>
+        <w:t xml:space="preserve">(DO)</w:t>
+      </w:r>
+      <w:r>
+        <w:rPr>
+          <w:rFonts w:ascii="Georgia" w:cs="Georgia" w:eastAsia="Georgia" w:hAnsi="Georgia"/>
+          <w:b w:val="0"/>
+          <w:bCs w:val="0"/>
+          <w:i w:val="0"/>
+          <w:iCs w:val="0"/>
+          <w:color w:val="000000"/>
+          <w:sz w:val="22"/>
+          <w:szCs w:val="22"/>
+          <w:rtl w:val="0"/>
+        </w:rPr>
+        <w:t xml:space="preserve">, the number of rooted cuttings obtained by application of aloe vera gel and moringa leaf extract was comparable in percentage survival with that obtained by application of water (distilled or filtered water) on monstera cuttings. Most </w:t>
       </w:r>
       <w:r>
         <w:rPr>
@@ -25978,7 +26534,35 @@
           <w:szCs w:val="22"/>
           <w:rtl w:val="0"/>
         </w:rPr>
-        <w:t xml:space="preserve">The study was conducted to determine the growth and yield performance of sweet potatoes treated with seaweed extract foliar spray from December 2023 to February 2024 in [REDACTED]. The experiment utilized a Randomized Complete Block Design (RCBD) with five treatments replicated four times. Based on the results of the study, there are significant differences in the length of vines at 60 days after planting (DAP), while other parameters showed no significant differences. These include length of vines at 30 DAP and 70 DAP, number of marketable tubers per plant, number of non-marketable tubers per plant, length of tubers per plant, weight of tubers per plant, diameter of tubers per plant, computed yield per hectare, and cost and return analysis among the seaweed extract treatments. The study found that sweet potatoes treated with different seaweed extract foliar sprays showed varying levels of growth and yield. According to the Super Bureau's VSP6, all treatments had the highest mean values across all parameters. However, the positive control had the highest mean values for vine length, weight of tubers per plant, and marketable yield per sample area. Therefore (DO), the application of seaweed extract as a bio stimulant did not significantly enhance the growth and yield of sweet potato. However, the negative control </w:t>
+        <w:t xml:space="preserve">The study was conducted to determine the growth and yield performance of sweet potatoes treated with seaweed extract foliar spray from December 2023 to February 2024 in [REDACTED]. The experiment utilized a Randomized Complete Block Design (RCBD) with five treatments replicated four times. Based on the results of the study, there are significant differences in the length of vines at 60 days after planting (DAP), while other parameters showed no significant differences. These include length of vines at 30 DAP and 70 DAP, number of marketable tubers per plant, number of non-marketable tubers per plant, length of tubers per plant, weight of tubers per plant, diameter of tubers per plant, computed yield per hectare, and cost and return analysis among the seaweed extract treatments. The study found that sweet potatoes treated with different seaweed extract foliar sprays showed varying levels of growth and yield. According to the Super Bureau's VSP6, all treatments had the highest mean values across all parameters. However, the positive control had the highest mean values for vine length, weight of tubers per plant, and marketable yield per sample area. Therefore </w:t>
+      </w:r>
+      <w:r>
+        <w:rPr>
+          <w:rFonts w:ascii="Georgia" w:cs="Georgia" w:eastAsia="Georgia" w:hAnsi="Georgia"/>
+          <w:b w:val="0"/>
+          <w:bCs w:val="0"/>
+          <w:i w:val="0"/>
+          <w:iCs w:val="0"/>
+          <w:sz w:val="22"/>
+          <w:szCs w:val="22"/>
+          <w:rtl w:val="0"/>
+          <w:color w:val="00B0F0"/>
+        </w:rPr>
+        <w:t xml:space="preserve">(DO)</w:t>
+      </w:r>
+      <w:r>
+        <w:rPr>
+          <w:rFonts w:ascii="Georgia" w:cs="Georgia" w:eastAsia="Georgia" w:hAnsi="Georgia"/>
+          <w:b w:val="0"/>
+          <w:bCs w:val="0"/>
+          <w:i w:val="0"/>
+          <w:iCs w:val="0"/>
+          <w:color w:val="000000"/>
+          <w:sz w:val="22"/>
+          <w:szCs w:val="22"/>
+          <w:rtl w:val="0"/>
+        </w:rPr>
+        <w:t xml:space="preserve">, the application of seaweed extract as a bio stimulant did not significantly enhance the growth and yield of sweet potato. However, the negative control </w:t>
       </w:r>
       <w:r>
         <w:rPr>
@@ -26250,7 +26834,35 @@
           <w:szCs w:val="22"/>
           <w:rtl w:val="0"/>
         </w:rPr>
-        <w:t xml:space="preserve"> limited benefits. Throughout the study, plants in Treatments 2 and 4 exhibited more vigorous and healthier growth, with well-developed roots, expanded foliage, and stable shoot formation. The positive effects of rice hull and vermicompost were attributed to better nutrient availability, improved soil aeration, enhanced microbial activity, and more efficient moisture retention. In conclusion (DO), the use of rice hull and vermicompost significantly enhanced the growth and survival of Adansonii. These findings highlight their </w:t>
+        <w:t xml:space="preserve"> limited benefits. Throughout the study, plants in Treatments 2 and 4 exhibited more vigorous and healthier growth, with well-developed roots, expanded foliage, and stable shoot formation. The positive effects of rice hull and vermicompost were attributed to better nutrient availability, improved soil aeration, enhanced microbial activity, and more efficient moisture retention. In conclusion </w:t>
+      </w:r>
+      <w:r>
+        <w:rPr>
+          <w:rFonts w:ascii="Georgia" w:cs="Georgia" w:eastAsia="Georgia" w:hAnsi="Georgia"/>
+          <w:b w:val="0"/>
+          <w:bCs w:val="0"/>
+          <w:i w:val="0"/>
+          <w:iCs w:val="0"/>
+          <w:sz w:val="22"/>
+          <w:szCs w:val="22"/>
+          <w:rtl w:val="0"/>
+          <w:color w:val="00B0F0"/>
+        </w:rPr>
+        <w:t xml:space="preserve">(DO)</w:t>
+      </w:r>
+      <w:r>
+        <w:rPr>
+          <w:rFonts w:ascii="Georgia" w:cs="Georgia" w:eastAsia="Georgia" w:hAnsi="Georgia"/>
+          <w:b w:val="0"/>
+          <w:bCs w:val="0"/>
+          <w:i w:val="0"/>
+          <w:iCs w:val="0"/>
+          <w:color w:val="000000"/>
+          <w:sz w:val="22"/>
+          <w:szCs w:val="22"/>
+          <w:rtl w:val="0"/>
+        </w:rPr>
+        <w:t xml:space="preserve">, the use of rice hull and vermicompost significantly enhanced the growth and survival of Adansonii. These findings highlight their </w:t>
       </w:r>
       <w:r>
         <w:rPr>
@@ -26797,7 +27409,35 @@
           <w:szCs w:val="22"/>
           <w:rtl w:val="0"/>
         </w:rPr>
-        <w:t xml:space="preserve">. No significant differences were observed in terms of the number of days from transplanting to flowering, plant height, number of unproductive tillers, length of panicle, number of filled grains, number of unfilled grains, and weight of 1,000 seeds. In conclusion (DO), </w:t>
+        <w:t xml:space="preserve">. No significant differences were observed in terms of the number of days from transplanting to flowering, plant height, number of unproductive tillers, length of panicle, number of filled grains, number of unfilled grains, and weight of 1,000 seeds. In conclusion </w:t>
+      </w:r>
+      <w:r>
+        <w:rPr>
+          <w:rFonts w:ascii="Georgia" w:cs="Georgia" w:eastAsia="Georgia" w:hAnsi="Georgia"/>
+          <w:b w:val="0"/>
+          <w:bCs w:val="0"/>
+          <w:i w:val="0"/>
+          <w:iCs w:val="0"/>
+          <w:sz w:val="22"/>
+          <w:szCs w:val="22"/>
+          <w:rtl w:val="0"/>
+          <w:color w:val="00B0F0"/>
+        </w:rPr>
+        <w:t xml:space="preserve">(DO)</w:t>
+      </w:r>
+      <w:r>
+        <w:rPr>
+          <w:rFonts w:ascii="Georgia" w:cs="Georgia" w:eastAsia="Georgia" w:hAnsi="Georgia"/>
+          <w:b w:val="0"/>
+          <w:bCs w:val="0"/>
+          <w:i w:val="0"/>
+          <w:iCs w:val="0"/>
+          <w:color w:val="000000"/>
+          <w:sz w:val="22"/>
+          <w:szCs w:val="22"/>
+          <w:rtl w:val="0"/>
+        </w:rPr>
+        <w:t xml:space="preserve">, </w:t>
       </w:r>
       <w:r>
         <w:rPr>
@@ -27233,7 +27873,35 @@
           <w:szCs w:val="22"/>
           <w:rtl w:val="0"/>
         </w:rPr>
-        <w:t xml:space="preserve"> that treatments were comparable on parameters. However, final weight, gain in weight, average daily gain in weight and feed conversion ratio had highly significance differences at (P&lt;0.01). This indicates that ducks fed with 100% commercial feeds rice bran mixed with golden apple snail performed better in final weight, gain in weight, average daily gain in weight and feed conversion ratio. In conclusion (DO), proved the treatment 1(100% CF) are the most efficient compared to treatment 2 where 50% commercial feeds and 50% rice bran mixed with water spinach and treatment 3 where 50% commercial feeds and 50% rice bran mixed with golden apple snail. It </w:t>
+        <w:t xml:space="preserve"> that treatments were comparable on parameters. However, final weight, gain in weight, average daily gain in weight and feed conversion ratio had highly significance differences at (P&lt;0.01). This indicates that ducks fed with 100% commercial feeds rice bran mixed with golden apple snail performed better in final weight, gain in weight, average daily gain in weight and feed conversion ratio. In conclusion </w:t>
+      </w:r>
+      <w:r>
+        <w:rPr>
+          <w:rFonts w:ascii="Georgia" w:cs="Georgia" w:eastAsia="Georgia" w:hAnsi="Georgia"/>
+          <w:b w:val="0"/>
+          <w:bCs w:val="0"/>
+          <w:i w:val="0"/>
+          <w:iCs w:val="0"/>
+          <w:sz w:val="22"/>
+          <w:szCs w:val="22"/>
+          <w:rtl w:val="0"/>
+          <w:color w:val="00B0F0"/>
+        </w:rPr>
+        <w:t xml:space="preserve">(DO)</w:t>
+      </w:r>
+      <w:r>
+        <w:rPr>
+          <w:rFonts w:ascii="Georgia" w:cs="Georgia" w:eastAsia="Georgia" w:hAnsi="Georgia"/>
+          <w:b w:val="0"/>
+          <w:bCs w:val="0"/>
+          <w:i w:val="0"/>
+          <w:iCs w:val="0"/>
+          <w:color w:val="000000"/>
+          <w:sz w:val="22"/>
+          <w:szCs w:val="22"/>
+          <w:rtl w:val="0"/>
+        </w:rPr>
+        <w:t xml:space="preserve">, proved the treatment 1(100% CF) are the most efficient compared to treatment 2 where 50% commercial feeds and 50% rice bran mixed with water spinach and treatment 3 where 50% commercial feeds and 50% rice bran mixed with golden apple snail. It </w:t>
       </w:r>
       <w:r>
         <w:rPr>
@@ -27778,7 +28446,35 @@
           <w:szCs w:val="22"/>
           <w:rtl w:val="0"/>
         </w:rPr>
-        <w:t xml:space="preserve">This study was conducted over a 35-day period from May 10, 2023, to June 14, 2023, at [REDACTED]. The present study aimed to determine the growth response of crossbred New Zealand rabbits as influenced by varying levels of fermented Madre De Agua leaves. Eighteen (18), 2 months of crossbreed New Zealand rabbits were used in the study which were divided into three (3) treatments: T1 = 70% concentrate + 30% paragrass, T2 = 70% concentrate + 20% paragrass + 10% fermented Madre De Agua, T3 = 60% concentrate + 20% paragrass + 20% fermented Madre De Agua. A Completely Randomized Design was employed, and data was analyzed through ANOVA by Statistical Tool for Agricultural Research (STAR). Statistical analysis showed that there was no significant difference but showed numerical trends among the treatments in relation to initial weight, final weight, gain in weight, average daily gain, dry matter intake, and feed conversion ratio of the experimental rabbits In conclusion (DO), all treatments are comparable in terms of growth, </w:t>
+        <w:t xml:space="preserve">This study was conducted over a 35-day period from May 10, 2023, to June 14, 2023, at [REDACTED]. The present study aimed to determine the growth response of crossbred New Zealand rabbits as influenced by varying levels of fermented Madre De Agua leaves. Eighteen (18), 2 months of crossbreed New Zealand rabbits were used in the study which were divided into three (3) treatments: T1 = 70% concentrate + 30% paragrass, T2 = 70% concentrate + 20% paragrass + 10% fermented Madre De Agua, T3 = 60% concentrate + 20% paragrass + 20% fermented Madre De Agua. A Completely Randomized Design was employed, and data was analyzed through ANOVA by Statistical Tool for Agricultural Research (STAR). Statistical analysis showed that there was no significant difference but showed numerical trends among the treatments in relation to initial weight, final weight, gain in weight, average daily gain, dry matter intake, and feed conversion ratio of the experimental rabbits In conclusion </w:t>
+      </w:r>
+      <w:r>
+        <w:rPr>
+          <w:rFonts w:ascii="Georgia" w:cs="Georgia" w:eastAsia="Georgia" w:hAnsi="Georgia"/>
+          <w:b w:val="0"/>
+          <w:bCs w:val="0"/>
+          <w:i w:val="0"/>
+          <w:iCs w:val="0"/>
+          <w:sz w:val="22"/>
+          <w:szCs w:val="22"/>
+          <w:rtl w:val="0"/>
+          <w:color w:val="00B0F0"/>
+        </w:rPr>
+        <w:t xml:space="preserve">(DO)</w:t>
+      </w:r>
+      <w:r>
+        <w:rPr>
+          <w:rFonts w:ascii="Georgia" w:cs="Georgia" w:eastAsia="Georgia" w:hAnsi="Georgia"/>
+          <w:b w:val="0"/>
+          <w:bCs w:val="0"/>
+          <w:i w:val="0"/>
+          <w:iCs w:val="0"/>
+          <w:color w:val="000000"/>
+          <w:sz w:val="22"/>
+          <w:szCs w:val="22"/>
+          <w:rtl w:val="0"/>
+        </w:rPr>
+        <w:t xml:space="preserve">, all treatments are comparable in terms of growth, </w:t>
       </w:r>
       <w:r>
         <w:rPr>
@@ -28217,7 +28913,35 @@
           <w:szCs w:val="22"/>
           <w:rtl w:val="0"/>
         </w:rPr>
-        <w:t xml:space="preserve">. Therefore (DO), it is </w:t>
+        <w:t xml:space="preserve">. Therefore </w:t>
+      </w:r>
+      <w:r>
+        <w:rPr>
+          <w:rFonts w:ascii="Georgia" w:cs="Georgia" w:eastAsia="Georgia" w:hAnsi="Georgia"/>
+          <w:b w:val="0"/>
+          <w:bCs w:val="0"/>
+          <w:i w:val="0"/>
+          <w:iCs w:val="0"/>
+          <w:sz w:val="22"/>
+          <w:szCs w:val="22"/>
+          <w:rtl w:val="0"/>
+          <w:color w:val="00B0F0"/>
+        </w:rPr>
+        <w:t xml:space="preserve">(DO)</w:t>
+      </w:r>
+      <w:r>
+        <w:rPr>
+          <w:rFonts w:ascii="Georgia" w:cs="Georgia" w:eastAsia="Georgia" w:hAnsi="Georgia"/>
+          <w:b w:val="0"/>
+          <w:bCs w:val="0"/>
+          <w:i w:val="0"/>
+          <w:iCs w:val="0"/>
+          <w:color w:val="000000"/>
+          <w:sz w:val="22"/>
+          <w:szCs w:val="22"/>
+          <w:rtl w:val="0"/>
+        </w:rPr>
+        <w:t xml:space="preserve">, it is </w:t>
       </w:r>
       <w:r>
         <w:rPr>
@@ -28311,7 +29035,35 @@
           <w:szCs w:val="22"/>
           <w:rtl w:val="0"/>
         </w:rPr>
-        <w:t xml:space="preserve">The study was conducted at [REDACTED], for 35 days, from April 16 to May 20, 2023. The study was carried out to search for alternatives to protein sources. The objective of the study was to determine the growth response of F1 New Zealand white rabbits as influenced by the roughage-to-concentrate ratio. A total of eighteen (18) heads of six (6)-week-old female New Zealand White Rabbits were selected and distributed into three (3) groups, each treatment replicated thrice with 2 rabbits per replication. Results showed no significant difference (P&lt;0.05) in final weight, gain in weight, and average daily gain in all the treatment groups. The control group (T1) was fed 70% guinea grass and 30% concentrates. For T2 and T3, the guinea grass was replaced with fresh azolla on an equi-weight basis at levels of 10 and 20 percent, respectively. In conclusion (DO), based on the results, it </w:t>
+        <w:t xml:space="preserve">The study was conducted at [REDACTED], for 35 days, from April 16 to May 20, 2023. The study was carried out to search for alternatives to protein sources. The objective of the study was to determine the growth response of F1 New Zealand white rabbits as influenced by the roughage-to-concentrate ratio. A total of eighteen (18) heads of six (6)-week-old female New Zealand White Rabbits were selected and distributed into three (3) groups, each treatment replicated thrice with 2 rabbits per replication. Results showed no significant difference (P&lt;0.05) in final weight, gain in weight, and average daily gain in all the treatment groups. The control group (T1) was fed 70% guinea grass and 30% concentrates. For T2 and T3, the guinea grass was replaced with fresh azolla on an equi-weight basis at levels of 10 and 20 percent, respectively. In conclusion </w:t>
+      </w:r>
+      <w:r>
+        <w:rPr>
+          <w:rFonts w:ascii="Georgia" w:cs="Georgia" w:eastAsia="Georgia" w:hAnsi="Georgia"/>
+          <w:b w:val="0"/>
+          <w:bCs w:val="0"/>
+          <w:i w:val="0"/>
+          <w:iCs w:val="0"/>
+          <w:sz w:val="22"/>
+          <w:szCs w:val="22"/>
+          <w:rtl w:val="0"/>
+          <w:color w:val="00B0F0"/>
+        </w:rPr>
+        <w:t xml:space="preserve">(DO)</w:t>
+      </w:r>
+      <w:r>
+        <w:rPr>
+          <w:rFonts w:ascii="Georgia" w:cs="Georgia" w:eastAsia="Georgia" w:hAnsi="Georgia"/>
+          <w:b w:val="0"/>
+          <w:bCs w:val="0"/>
+          <w:i w:val="0"/>
+          <w:iCs w:val="0"/>
+          <w:color w:val="000000"/>
+          <w:sz w:val="22"/>
+          <w:szCs w:val="22"/>
+          <w:rtl w:val="0"/>
+        </w:rPr>
+        <w:t xml:space="preserve">, based on the results, it </w:t>
       </w:r>
       <w:r>
         <w:rPr>

</xml_diff>

<commit_message>
Part III/Recs: distinguish DO among hedges vs DO connectors in corpus
</commit_message>
<xml_diff>
--- a/thesis/003_ThesisProposal_Draft_017.docx
+++ b/thesis/003_ThesisProposal_Draft_017.docx
@@ -7839,7 +7839,7 @@
           <w:szCs w:val="22"/>
           <w:rtl w:val="0"/>
         </w:rPr>
-        <w:t xml:space="preserve"> were identified. Table 5 presents the function distribution.</w:t>
+        <w:t xml:space="preserve"> were identified among coded hedges. Discourse connectors such as Hence, Thus, Therefore, and In conclusion appear in the corpus and are tagged (DO) in Appendix C; they organize research moves but do not qualify claims, so they are not counted as hedges. No politeness/deference devices were found. Table 5 presents the function distribution among tokens coded as hedges.</w:t>
       </w:r>
       <w:r>
         <w:rPr>
@@ -7875,7 +7875,7 @@
           <w:rFonts w:ascii="Georgia" w:hAnsi="Georgia"/>
           <w:sz w:val="24"/>
         </w:rPr>
-        <w:t>Hedge Function Distribution</w:t>
+        <w:t>Hedge Function Distribution (Among Coded Hedges)</w:t>
       </w:r>
     </w:p>
     <w:tbl>
@@ -8883,7 +8883,7 @@
           <w:szCs w:val="22"/>
           <w:rtl w:val="0"/>
         </w:rPr>
-        <w:t xml:space="preserve">Rather than prescribing a target number of hedges per abstract, advisers can focus feedback on whether implication and conclusion sentences claim more than the data support. Binary or measured results often need no hedge; uncertainty belongs on inferences that go beyond the finding. Instruction should also distinguish topic-naming potential in aim statements from epistemic potential in conclusions, without treating hedging as a quota to fill.</w:t>
+        <w:t xml:space="preserve">Rather than prescribing a target number of hedges per abstract, advisers can focus feedback on whether implication and conclusion sentences claim more than the data support. Binary or measured results often need no hedge; uncertainty belongs on inferences that go beyond the finding. Instruction should also distinguish topic-naming potential in aim statements from epistemic potential in conclusions, without treating hedging as a quota to fill. Advisers can also separate discourse connectors (Hence, Thus, In conclusion) from epistemic hedges so students do not treat move-organizing language as hedging.</w:t>
       </w:r>
       <w:r>
         <w:rPr>

</xml_diff>

<commit_message>
Framework/Defs: soften RQ4 cross-tab claim; Hyland functions as adaptation
</commit_message>
<xml_diff>
--- a/thesis/003_ThesisProposal_Draft_017.docx
+++ b/thesis/003_ThesisProposal_Draft_017.docx
@@ -1134,7 +1134,7 @@
           <w:szCs w:val="22"/>
           <w:rtl w:val="0"/>
         </w:rPr>
-        <w:t xml:space="preserve">In practice, the coding scheme was adapted from Hyland (1998) and operationalized through the decision rules presented in Appendix A. The coding was applied in three sequential stages. First, each abstract was read holistically before any marking occurred to ensure that coding decisions were grounded in discourse context rather than keyword recognition. Second, each potential hedge was classified by type based on the decision rules in Appendix A. These types included modal verb, lexical hedge, adverbial hedge, and clause-level hedge. Third, each confirmed hedge was assigned a functional category: epistemic caution, politeness, or discourse organization. This three-stage sequence ensured that type and function were coded independently, allowing for the cross-tabulation of type-function pairings that RQ4 required.</w:t>
+        <w:t xml:space="preserve">In practice, the coding scheme was adapted from Hyland (1998) and operationalized through the decision rules presented in Appendix A. The coding was applied in three sequential stages. First, each abstract was read holistically before any marking occurred to ensure that coding decisions were grounded in discourse context rather than keyword recognition. Second, each potential hedge was classified by type based on the decision rules in Appendix A. These types included modal verb, lexical hedge, adverbial hedge, and clause-level hedge. Third, each confirmed hedge was assigned a functional category: epistemic caution, politeness, or discourse organization. This three-stage sequence ensured that type and function were coded independently, allowing type-function pairings to be inspected. In this corpus all coded hedges were Epistemic Caution, so the cross-tab does not differentiate functions; RQ4 is answered from frequency and functional patterns as a whole, not from type-by-function variation.</w:t>
       </w:r>
       <w:r>
         <w:rPr>
@@ -1984,7 +1984,7 @@
           <w:szCs w:val="22"/>
           <w:rtl w:val="0"/>
         </w:rPr>
-        <w:t xml:space="preserve">conceptually, hedge function refers to the rhetorical purpose a hedging device serves in its discourse context. Operationally, this refers to three categories coded in this study based on Hyland’s (1998) framework. These are epistemic caution, which expresses uncertainty about a claim’s truth or accuracy, politeness, which shows deference to readers or prior research, and discourse organization, which structures text or manages reader expectations.</w:t>
+        <w:t xml:space="preserve">conceptually, hedge function refers to the rhetorical purpose a hedging device serves in its discourse context. Operationally, this refers to three categories adapted for this study from Hyland’s (1998) discussion of hedging functions (not a fixed published taxonomy). These are epistemic caution, which expresses uncertainty about a claim’s truth or accuracy, politeness, which shows deference to readers or prior research, and discourse organization, which structures text or manages reader expectations.</w:t>
       </w:r>
       <w:r>
         <w:rPr>

</xml_diff>